<commit_message>
docs: add organization carbon verification template
</commit_message>
<xml_diff>
--- a/docs/评价方案/templates/工业企业温室气体排放盘查报告与核查材料包通用模板.docx
+++ b/docs/评价方案/templates/工业企业温室气体排放盘查报告与核查材料包通用模板.docx
@@ -398,7 +398,11 @@
     </w:tbl>
     <w:p/>
     <w:p>
-      <w:r/>
+      <w:r>
+        <w:rPr>
+          <w:rFonts w:ascii="Calibri" w:hAnsi="Calibri" w:eastAsia="宋体"/>
+        </w:rPr>
+      </w:r>
     </w:p>
     <w:p>
       <w:pPr>
@@ -414,9 +418,9 @@
     <w:p>
       <w:r>
         <w:rPr>
-          <w:rFonts w:ascii="Calibri" w:hAnsi="Calibri" w:eastAsia="Microsoft YaHei"/>
+          <w:rFonts w:ascii="Calibri" w:hAnsi="Calibri" w:eastAsia="宋体"/>
         </w:rPr>
-        <w:t>本模板面向平台“完成一次组织碳盘查”的闭环：确定报告边界，汇集活动数据，匹配因子，计算排放，形成企业自报报告，并导出核查支撑材料包。</w:t>
+        <w:t>本模板面向平台“完成一次组织碳盘查”的闭环：锁定报告主体、报告期和组织边界，识别排放源，汇集活动数据与凭证，匹配因子和参数，生成组织排放清单，完成质量问题整改，形成企业自报报告和核查支撑材料包。</w:t>
       </w:r>
     </w:p>
     <w:p>
@@ -438,9 +442,9 @@
     <w:p>
       <w:r>
         <w:rPr>
-          <w:rFonts w:ascii="Calibri" w:hAnsi="Calibri" w:eastAsia="Microsoft YaHei"/>
+          <w:rFonts w:ascii="Calibri" w:hAnsi="Calibri" w:eastAsia="宋体"/>
         </w:rPr>
-        <w:t>本模板将核查材料包作为报告附件目录管理，第三方核查报告仍应由核查机构出具；平台负责提供证据链、工作底稿和导出包。</w:t>
+        <w:t>本模板将核查材料包作为报告附件目录管理；第三方核查报告仍由核查机构基于核查准则出具。平台负责输出企业自报报告、证据链、工作底稿、整改记录和可复核的导出包。</w:t>
       </w:r>
     </w:p>
     <w:p>
@@ -794,7 +798,11 @@
       </w:pPr>
     </w:p>
     <w:p>
-      <w:r/>
+      <w:r>
+        <w:rPr>
+          <w:rFonts w:ascii="Calibri" w:hAnsi="Calibri" w:eastAsia="宋体"/>
+        </w:rPr>
+      </w:r>
     </w:p>
     <w:p>
       <w:pPr>
@@ -12955,17 +12963,8 @@
             <w:tcW w:type="dxa" w:w="2560"/>
           </w:tcPr>
           <w:p>
-            <w:pPr>
-              <w:spacing w:after="40" w:line="276" w:lineRule="auto"/>
-              <w:jc w:val="left"/>
-            </w:pPr>
-            <w:r>
-              <w:rPr>
-                <w:rFonts w:ascii="Calibri" w:hAnsi="Calibri" w:eastAsia="Microsoft YaHei"/>
-                <w:b w:val="0"/>
-                <w:sz w:val="17"/>
-              </w:rPr>
-              <w:t>/carbon-mgmt/factors：因子选择</w:t>
+            <w:r>
+              <w:t>/carbon-mgmt/factors：排放因子库；/carbon-mgmt/calculation-factors：计算因子</w:t>
             </w:r>
           </w:p>
         </w:tc>
@@ -12995,17 +12994,8 @@
             <w:tcW w:type="dxa" w:w="2300"/>
           </w:tcPr>
           <w:p>
-            <w:pPr>
-              <w:spacing w:after="40" w:line="276" w:lineRule="auto"/>
-              <w:jc w:val="left"/>
-            </w:pPr>
-            <w:r>
-              <w:rPr>
-                <w:rFonts w:ascii="Calibri" w:hAnsi="Calibri" w:eastAsia="Microsoft YaHei"/>
-                <w:b w:val="0"/>
-                <w:sz w:val="17"/>
-              </w:rPr>
-              <w:t>carbon_accounting.queries.inventory</w:t>
+            <w:r>
+              <w:t>carbon_accounting.queries.inventory + carbon_verification.queries.report_context</w:t>
             </w:r>
           </w:p>
         </w:tc>
@@ -13014,17 +13004,8 @@
             <w:tcW w:type="dxa" w:w="2900"/>
           </w:tcPr>
           <w:p>
-            <w:pPr>
-              <w:spacing w:after="40" w:line="276" w:lineRule="auto"/>
-              <w:jc w:val="left"/>
-            </w:pPr>
-            <w:r>
-              <w:rPr>
-                <w:rFonts w:ascii="Calibri" w:hAnsi="Calibri" w:eastAsia="Microsoft YaHei"/>
-                <w:b w:val="0"/>
-                <w:sz w:val="17"/>
-              </w:rPr>
-              <w:t>inventory_id, total_co2e, by_scope, by_source</w:t>
+            <w:r>
+              <w:t>batch_id, inventory_item_id, total_co2e, scope_summary, source_summary, quality_status</w:t>
             </w:r>
           </w:p>
         </w:tc>
@@ -13092,17 +13073,8 @@
             <w:tcW w:type="dxa" w:w="2900"/>
           </w:tcPr>
           <w:p>
-            <w:pPr>
-              <w:spacing w:after="40" w:line="276" w:lineRule="auto"/>
-              <w:jc w:val="left"/>
-            </w:pPr>
-            <w:r>
-              <w:rPr>
-                <w:rFonts w:ascii="Calibri" w:hAnsi="Calibri" w:eastAsia="Microsoft YaHei"/>
-                <w:b w:val="0"/>
-                <w:sz w:val="17"/>
-              </w:rPr>
-              <w:t>evidence_manifest, review_sheet, issue_list, export_job</w:t>
+            <w:r>
+              <w:t>evidence_manifest, material_package, quality_issues, audit_trail, report_context, export_job</w:t>
             </w:r>
           </w:p>
         </w:tc>
@@ -13111,17 +13083,8 @@
             <w:tcW w:type="dxa" w:w="2560"/>
           </w:tcPr>
           <w:p>
-            <w:pPr>
-              <w:spacing w:after="40" w:line="276" w:lineRule="auto"/>
-              <w:jc w:val="left"/>
-            </w:pPr>
-            <w:r>
-              <w:rPr>
-                <w:rFonts w:ascii="Calibri" w:hAnsi="Calibri" w:eastAsia="Microsoft YaHei"/>
-                <w:b w:val="0"/>
-                <w:sz w:val="17"/>
-              </w:rPr>
-              <w:t>/carbon/verification：材料包导出</w:t>
+            <w:r>
+              <w:t>/carbon/verification：凭证清单、质量问题、材料包、报告导出</w:t>
             </w:r>
           </w:p>
         </w:tc>
@@ -13170,17 +13133,8 @@
             <w:tcW w:type="dxa" w:w="2900"/>
           </w:tcPr>
           <w:p>
-            <w:pPr>
-              <w:spacing w:after="40" w:line="276" w:lineRule="auto"/>
-              <w:jc w:val="left"/>
-            </w:pPr>
-            <w:r>
-              <w:rPr>
-                <w:rFonts w:ascii="Calibri" w:hAnsi="Calibri" w:eastAsia="Microsoft YaHei"/>
-                <w:b w:val="0"/>
-                <w:sz w:val="17"/>
-              </w:rPr>
-              <w:t>file_review, onsite_check, nonconformity, conclusion</w:t>
+            <w:r>
+              <w:t>file_review, onsite_check, nonconformity, correction, conclusion, verifier_note</w:t>
             </w:r>
           </w:p>
         </w:tc>
@@ -13299,6 +13253,2600 @@
         <w:t>6. 导出盘查报告 DOCX/PDF 与核查材料包 ZIP，并写入导出任务和材料清单。</w:t>
       </w:r>
     </w:p>
+    <w:p>
+      <w:r>
+        <w:rPr>
+          <w:rFonts w:ascii="Calibri" w:hAnsi="Calibri" w:eastAsia="宋体"/>
+        </w:rPr>
+        <w:br w:type="page"/>
+      </w:r>
+    </w:p>
+    <w:p>
+      <w:pPr>
+        <w:pStyle w:val="Heading2"/>
+        <w:keepNext/>
+      </w:pPr>
+      <w:r>
+        <w:rPr>
+          <w:rFonts w:ascii="Calibri" w:hAnsi="Calibri" w:eastAsia="宋体"/>
+        </w:rPr>
+        <w:t>附表 L：导出上下文与模板变量映射</w:t>
+      </w:r>
+    </w:p>
+    <w:p>
+      <w:pPr>
+        <w:spacing w:after="120"/>
+      </w:pPr>
+      <w:r>
+        <w:rPr>
+          <w:rFonts w:ascii="Calibri" w:hAnsi="Calibri" w:eastAsia="宋体"/>
+        </w:rPr>
+        <w:t>本附表用于指导后端 ReportDocumentRenderer 将 /api/carbon/verification/report 的读模型填入 DOCX。缺失必需字段时，系统应返回业务状态并进入质量问题清单，不应生成看似完整的正式报告。</w:t>
+      </w:r>
+    </w:p>
+    <w:tbl>
+      <w:tblPr>
+        <w:tblStyle w:val="TableGrid"/>
+        <w:tblW w:type="auto" w:w="0"/>
+        <w:jc w:val="center"/>
+        <w:tblLayout w:type="fixed"/>
+        <w:tblLook w:firstColumn="1" w:firstRow="1" w:lastColumn="0" w:lastRow="0" w:noHBand="0" w:noVBand="1" w:val="04A0"/>
+        <w:tblCellMar>
+          <w:top w:w="80" w:type="dxa"/>
+          <w:start w:w="120" w:type="dxa"/>
+          <w:bottom w:w="80" w:type="dxa"/>
+          <w:end w:w="120" w:type="dxa"/>
+        </w:tblCellMar>
+      </w:tblPr>
+      <w:tblGrid>
+        <w:gridCol w:w="1872"/>
+        <w:gridCol w:w="1872"/>
+        <w:gridCol w:w="1872"/>
+        <w:gridCol w:w="1872"/>
+        <w:gridCol w:w="1872"/>
+      </w:tblGrid>
+      <w:tr>
+        <w:trPr>
+          <w:tblHeader w:val="true"/>
+          <w:cantSplit/>
+        </w:trPr>
+        <w:tc>
+          <w:tcPr>
+            <w:tcW w:type="dxa" w:w="2088"/>
+            <w:shd w:fill="F2F4F7"/>
+            <w:vAlign w:val="center"/>
+          </w:tcPr>
+          <w:p>
+            <w:pPr>
+              <w:spacing w:before="0" w:after="20"/>
+              <w:jc w:val="center"/>
+            </w:pPr>
+            <w:r>
+              <w:rPr>
+                <w:b/>
+                <w:sz w:val="17"/>
+              </w:rPr>
+              <w:t>模板变量</w:t>
+            </w:r>
+          </w:p>
+        </w:tc>
+        <w:tc>
+          <w:tcPr>
+            <w:tcW w:type="dxa" w:w="2232"/>
+            <w:shd w:fill="F2F4F7"/>
+            <w:vAlign w:val="center"/>
+          </w:tcPr>
+          <w:p>
+            <w:pPr>
+              <w:spacing w:before="0" w:after="20"/>
+              <w:jc w:val="center"/>
+            </w:pPr>
+            <w:r>
+              <w:rPr>
+                <w:b/>
+                <w:sz w:val="17"/>
+              </w:rPr>
+              <w:t>上下文字段</w:t>
+            </w:r>
+          </w:p>
+        </w:tc>
+        <w:tc>
+          <w:tcPr>
+            <w:tcW w:type="dxa" w:w="2520"/>
+            <w:shd w:fill="F2F4F7"/>
+            <w:vAlign w:val="center"/>
+          </w:tcPr>
+          <w:p>
+            <w:pPr>
+              <w:spacing w:before="0" w:after="20"/>
+              <w:jc w:val="center"/>
+            </w:pPr>
+            <w:r>
+              <w:rPr>
+                <w:b/>
+                <w:sz w:val="17"/>
+              </w:rPr>
+              <w:t>当前来源</w:t>
+            </w:r>
+          </w:p>
+        </w:tc>
+        <w:tc>
+          <w:tcPr>
+            <w:tcW w:type="dxa" w:w="1008"/>
+            <w:shd w:fill="F2F4F7"/>
+            <w:vAlign w:val="center"/>
+          </w:tcPr>
+          <w:p>
+            <w:pPr>
+              <w:spacing w:before="0" w:after="20"/>
+              <w:jc w:val="center"/>
+            </w:pPr>
+            <w:r>
+              <w:rPr>
+                <w:b/>
+                <w:sz w:val="17"/>
+              </w:rPr>
+              <w:t>必需性</w:t>
+            </w:r>
+          </w:p>
+        </w:tc>
+        <w:tc>
+          <w:tcPr>
+            <w:tcW w:type="dxa" w:w="1512"/>
+            <w:shd w:fill="F2F4F7"/>
+            <w:vAlign w:val="center"/>
+          </w:tcPr>
+          <w:p>
+            <w:pPr>
+              <w:spacing w:before="0" w:after="20"/>
+              <w:jc w:val="center"/>
+            </w:pPr>
+            <w:r>
+              <w:rPr>
+                <w:b/>
+                <w:sz w:val="17"/>
+              </w:rPr>
+              <w:t>缺失处理</w:t>
+            </w:r>
+          </w:p>
+        </w:tc>
+      </w:tr>
+      <w:tr>
+        <w:trPr>
+          <w:cantSplit/>
+        </w:trPr>
+        <w:tc>
+          <w:tcPr>
+            <w:tcW w:type="dxa" w:w="2088"/>
+            <w:vAlign w:val="center"/>
+          </w:tcPr>
+          <w:p>
+            <w:pPr>
+              <w:spacing w:before="0" w:after="20"/>
+            </w:pPr>
+            <w:r>
+              <w:rPr>
+                <w:sz w:val="17"/>
+              </w:rPr>
+              <w:t>{{ enterprise_name }}</w:t>
+            </w:r>
+          </w:p>
+        </w:tc>
+        <w:tc>
+          <w:tcPr>
+            <w:tcW w:type="dxa" w:w="2232"/>
+            <w:vAlign w:val="center"/>
+          </w:tcPr>
+          <w:p>
+            <w:pPr>
+              <w:spacing w:before="0" w:after="20"/>
+            </w:pPr>
+            <w:r>
+              <w:rPr>
+                <w:sz w:val="17"/>
+              </w:rPr>
+              <w:t>enterprise.name</w:t>
+            </w:r>
+          </w:p>
+        </w:tc>
+        <w:tc>
+          <w:tcPr>
+            <w:tcW w:type="dxa" w:w="2520"/>
+            <w:vAlign w:val="center"/>
+          </w:tcPr>
+          <w:p>
+            <w:pPr>
+              <w:spacing w:before="0" w:after="20"/>
+            </w:pPr>
+            <w:r>
+              <w:rPr>
+                <w:sz w:val="17"/>
+              </w:rPr>
+              <w:t>master_data.EnterpriseInfo / report_context.enterprise</w:t>
+            </w:r>
+          </w:p>
+        </w:tc>
+        <w:tc>
+          <w:tcPr>
+            <w:tcW w:type="dxa" w:w="1008"/>
+            <w:vAlign w:val="center"/>
+          </w:tcPr>
+          <w:p>
+            <w:pPr>
+              <w:spacing w:before="0" w:after="20"/>
+            </w:pPr>
+            <w:r>
+              <w:rPr>
+                <w:sz w:val="17"/>
+              </w:rPr>
+              <w:t>必需</w:t>
+            </w:r>
+          </w:p>
+        </w:tc>
+        <w:tc>
+          <w:tcPr>
+            <w:tcW w:type="dxa" w:w="1512"/>
+            <w:vAlign w:val="center"/>
+          </w:tcPr>
+          <w:p>
+            <w:pPr>
+              <w:spacing w:before="0" w:after="20"/>
+            </w:pPr>
+            <w:r>
+              <w:rPr>
+                <w:sz w:val="17"/>
+              </w:rPr>
+              <w:t>阻塞正式导出，提示补报告主体</w:t>
+            </w:r>
+          </w:p>
+        </w:tc>
+      </w:tr>
+      <w:tr>
+        <w:trPr>
+          <w:cantSplit/>
+        </w:trPr>
+        <w:tc>
+          <w:tcPr>
+            <w:tcW w:type="dxa" w:w="2088"/>
+            <w:vAlign w:val="center"/>
+          </w:tcPr>
+          <w:p>
+            <w:pPr>
+              <w:spacing w:before="0" w:after="20"/>
+            </w:pPr>
+            <w:r>
+              <w:rPr>
+                <w:sz w:val="17"/>
+              </w:rPr>
+              <w:t>{{ org_code }}</w:t>
+            </w:r>
+          </w:p>
+        </w:tc>
+        <w:tc>
+          <w:tcPr>
+            <w:tcW w:type="dxa" w:w="2232"/>
+            <w:vAlign w:val="center"/>
+          </w:tcPr>
+          <w:p>
+            <w:pPr>
+              <w:spacing w:before="0" w:after="20"/>
+            </w:pPr>
+            <w:r>
+              <w:rPr>
+                <w:sz w:val="17"/>
+              </w:rPr>
+              <w:t>enterprise.unify_code</w:t>
+            </w:r>
+          </w:p>
+        </w:tc>
+        <w:tc>
+          <w:tcPr>
+            <w:tcW w:type="dxa" w:w="2520"/>
+            <w:vAlign w:val="center"/>
+          </w:tcPr>
+          <w:p>
+            <w:pPr>
+              <w:spacing w:before="0" w:after="20"/>
+            </w:pPr>
+            <w:r>
+              <w:rPr>
+                <w:sz w:val="17"/>
+              </w:rPr>
+              <w:t>master_data.EnterpriseInfo</w:t>
+            </w:r>
+          </w:p>
+        </w:tc>
+        <w:tc>
+          <w:tcPr>
+            <w:tcW w:type="dxa" w:w="1008"/>
+            <w:vAlign w:val="center"/>
+          </w:tcPr>
+          <w:p>
+            <w:pPr>
+              <w:spacing w:before="0" w:after="20"/>
+            </w:pPr>
+            <w:r>
+              <w:rPr>
+                <w:sz w:val="17"/>
+              </w:rPr>
+              <w:t>必需</w:t>
+            </w:r>
+          </w:p>
+        </w:tc>
+        <w:tc>
+          <w:tcPr>
+            <w:tcW w:type="dxa" w:w="1512"/>
+            <w:vAlign w:val="center"/>
+          </w:tcPr>
+          <w:p>
+            <w:pPr>
+              <w:spacing w:before="0" w:after="20"/>
+            </w:pPr>
+            <w:r>
+              <w:rPr>
+                <w:sz w:val="17"/>
+              </w:rPr>
+              <w:t>进入主体信息问题清单</w:t>
+            </w:r>
+          </w:p>
+        </w:tc>
+      </w:tr>
+      <w:tr>
+        <w:trPr>
+          <w:cantSplit/>
+        </w:trPr>
+        <w:tc>
+          <w:tcPr>
+            <w:tcW w:type="dxa" w:w="2088"/>
+            <w:vAlign w:val="center"/>
+          </w:tcPr>
+          <w:p>
+            <w:pPr>
+              <w:spacing w:before="0" w:after="20"/>
+            </w:pPr>
+            <w:r>
+              <w:rPr>
+                <w:sz w:val="17"/>
+              </w:rPr>
+              <w:t>{{ report_year }}</w:t>
+            </w:r>
+          </w:p>
+        </w:tc>
+        <w:tc>
+          <w:tcPr>
+            <w:tcW w:type="dxa" w:w="2232"/>
+            <w:vAlign w:val="center"/>
+          </w:tcPr>
+          <w:p>
+            <w:pPr>
+              <w:spacing w:before="0" w:after="20"/>
+            </w:pPr>
+            <w:r>
+              <w:rPr>
+                <w:sz w:val="17"/>
+              </w:rPr>
+              <w:t>reporting_period.year</w:t>
+            </w:r>
+          </w:p>
+        </w:tc>
+        <w:tc>
+          <w:tcPr>
+            <w:tcW w:type="dxa" w:w="2520"/>
+            <w:vAlign w:val="center"/>
+          </w:tcPr>
+          <w:p>
+            <w:pPr>
+              <w:spacing w:before="0" w:after="20"/>
+            </w:pPr>
+            <w:r>
+              <w:rPr>
+                <w:sz w:val="17"/>
+              </w:rPr>
+              <w:t>VerificationQuery.year 或活动记录期间</w:t>
+            </w:r>
+          </w:p>
+        </w:tc>
+        <w:tc>
+          <w:tcPr>
+            <w:tcW w:type="dxa" w:w="1008"/>
+            <w:vAlign w:val="center"/>
+          </w:tcPr>
+          <w:p>
+            <w:pPr>
+              <w:spacing w:before="0" w:after="20"/>
+            </w:pPr>
+            <w:r>
+              <w:rPr>
+                <w:sz w:val="17"/>
+              </w:rPr>
+              <w:t>必需</w:t>
+            </w:r>
+          </w:p>
+        </w:tc>
+        <w:tc>
+          <w:tcPr>
+            <w:tcW w:type="dxa" w:w="1512"/>
+            <w:vAlign w:val="center"/>
+          </w:tcPr>
+          <w:p>
+            <w:pPr>
+              <w:spacing w:before="0" w:after="20"/>
+            </w:pPr>
+            <w:r>
+              <w:rPr>
+                <w:sz w:val="17"/>
+              </w:rPr>
+              <w:t>无期间时只能导出草稿</w:t>
+            </w:r>
+          </w:p>
+        </w:tc>
+      </w:tr>
+      <w:tr>
+        <w:trPr>
+          <w:cantSplit/>
+        </w:trPr>
+        <w:tc>
+          <w:tcPr>
+            <w:tcW w:type="dxa" w:w="2088"/>
+            <w:vAlign w:val="center"/>
+          </w:tcPr>
+          <w:p>
+            <w:pPr>
+              <w:spacing w:before="0" w:after="20"/>
+            </w:pPr>
+            <w:r>
+              <w:rPr>
+                <w:sz w:val="17"/>
+              </w:rPr>
+              <w:t>{{ boundary_version }}</w:t>
+            </w:r>
+          </w:p>
+        </w:tc>
+        <w:tc>
+          <w:tcPr>
+            <w:tcW w:type="dxa" w:w="2232"/>
+            <w:vAlign w:val="center"/>
+          </w:tcPr>
+          <w:p>
+            <w:pPr>
+              <w:spacing w:before="0" w:after="20"/>
+            </w:pPr>
+            <w:r>
+              <w:rPr>
+                <w:sz w:val="17"/>
+              </w:rPr>
+              <w:t>organization_boundary.boundary.version_no</w:t>
+            </w:r>
+          </w:p>
+        </w:tc>
+        <w:tc>
+          <w:tcPr>
+            <w:tcW w:type="dxa" w:w="2520"/>
+            <w:vAlign w:val="center"/>
+          </w:tcPr>
+          <w:p>
+            <w:pPr>
+              <w:spacing w:before="0" w:after="20"/>
+            </w:pPr>
+            <w:r>
+              <w:rPr>
+                <w:sz w:val="17"/>
+              </w:rPr>
+              <w:t>已发布组织边界版本</w:t>
+            </w:r>
+          </w:p>
+        </w:tc>
+        <w:tc>
+          <w:tcPr>
+            <w:tcW w:type="dxa" w:w="1008"/>
+            <w:vAlign w:val="center"/>
+          </w:tcPr>
+          <w:p>
+            <w:pPr>
+              <w:spacing w:before="0" w:after="20"/>
+            </w:pPr>
+            <w:r>
+              <w:rPr>
+                <w:sz w:val="17"/>
+              </w:rPr>
+              <w:t>必需</w:t>
+            </w:r>
+          </w:p>
+        </w:tc>
+        <w:tc>
+          <w:tcPr>
+            <w:tcW w:type="dxa" w:w="1512"/>
+            <w:vAlign w:val="center"/>
+          </w:tcPr>
+          <w:p>
+            <w:pPr>
+              <w:spacing w:before="0" w:after="20"/>
+            </w:pPr>
+            <w:r>
+              <w:rPr>
+                <w:sz w:val="17"/>
+              </w:rPr>
+              <w:t>无发布边界时阻塞正式导出</w:t>
+            </w:r>
+          </w:p>
+        </w:tc>
+      </w:tr>
+      <w:tr>
+        <w:trPr>
+          <w:cantSplit/>
+        </w:trPr>
+        <w:tc>
+          <w:tcPr>
+            <w:tcW w:type="dxa" w:w="2088"/>
+            <w:vAlign w:val="center"/>
+          </w:tcPr>
+          <w:p>
+            <w:pPr>
+              <w:spacing w:before="0" w:after="20"/>
+            </w:pPr>
+            <w:r>
+              <w:rPr>
+                <w:sz w:val="17"/>
+              </w:rPr>
+              <w:t>{{ scope_summary }}</w:t>
+            </w:r>
+          </w:p>
+        </w:tc>
+        <w:tc>
+          <w:tcPr>
+            <w:tcW w:type="dxa" w:w="2232"/>
+            <w:vAlign w:val="center"/>
+          </w:tcPr>
+          <w:p>
+            <w:pPr>
+              <w:spacing w:before="0" w:after="20"/>
+            </w:pPr>
+            <w:r>
+              <w:rPr>
+                <w:sz w:val="17"/>
+              </w:rPr>
+              <w:t>inventory.scope_summary[]</w:t>
+            </w:r>
+          </w:p>
+        </w:tc>
+        <w:tc>
+          <w:tcPr>
+            <w:tcW w:type="dxa" w:w="2520"/>
+            <w:vAlign w:val="center"/>
+          </w:tcPr>
+          <w:p>
+            <w:pPr>
+              <w:spacing w:before="0" w:after="20"/>
+            </w:pPr>
+            <w:r>
+              <w:rPr>
+                <w:sz w:val="17"/>
+              </w:rPr>
+              <w:t>carbon_verification.report_context</w:t>
+            </w:r>
+          </w:p>
+        </w:tc>
+        <w:tc>
+          <w:tcPr>
+            <w:tcW w:type="dxa" w:w="1008"/>
+            <w:vAlign w:val="center"/>
+          </w:tcPr>
+          <w:p>
+            <w:pPr>
+              <w:spacing w:before="0" w:after="20"/>
+            </w:pPr>
+            <w:r>
+              <w:rPr>
+                <w:sz w:val="17"/>
+              </w:rPr>
+              <w:t>必需</w:t>
+            </w:r>
+          </w:p>
+        </w:tc>
+        <w:tc>
+          <w:tcPr>
+            <w:tcW w:type="dxa" w:w="1512"/>
+            <w:vAlign w:val="center"/>
+          </w:tcPr>
+          <w:p>
+            <w:pPr>
+              <w:spacing w:before="0" w:after="20"/>
+            </w:pPr>
+            <w:r>
+              <w:rPr>
+                <w:sz w:val="17"/>
+              </w:rPr>
+              <w:t>清单为空时返回 empty_inventory</w:t>
+            </w:r>
+          </w:p>
+        </w:tc>
+      </w:tr>
+      <w:tr>
+        <w:trPr>
+          <w:cantSplit/>
+        </w:trPr>
+        <w:tc>
+          <w:tcPr>
+            <w:tcW w:type="dxa" w:w="2088"/>
+            <w:vAlign w:val="center"/>
+          </w:tcPr>
+          <w:p>
+            <w:pPr>
+              <w:spacing w:before="0" w:after="20"/>
+            </w:pPr>
+            <w:r>
+              <w:rPr>
+                <w:sz w:val="17"/>
+              </w:rPr>
+              <w:t>{{ activity_data }}</w:t>
+            </w:r>
+          </w:p>
+        </w:tc>
+        <w:tc>
+          <w:tcPr>
+            <w:tcW w:type="dxa" w:w="2232"/>
+            <w:vAlign w:val="center"/>
+          </w:tcPr>
+          <w:p>
+            <w:pPr>
+              <w:spacing w:before="0" w:after="20"/>
+            </w:pPr>
+            <w:r>
+              <w:rPr>
+                <w:sz w:val="17"/>
+              </w:rPr>
+              <w:t>activity_data[]</w:t>
+            </w:r>
+          </w:p>
+        </w:tc>
+        <w:tc>
+          <w:tcPr>
+            <w:tcW w:type="dxa" w:w="2520"/>
+            <w:vAlign w:val="center"/>
+          </w:tcPr>
+          <w:p>
+            <w:pPr>
+              <w:spacing w:before="0" w:after="20"/>
+            </w:pPr>
+            <w:r>
+              <w:rPr>
+                <w:sz w:val="17"/>
+              </w:rPr>
+              <w:t>Scope 活动记录或锁定清单明细</w:t>
+            </w:r>
+          </w:p>
+        </w:tc>
+        <w:tc>
+          <w:tcPr>
+            <w:tcW w:type="dxa" w:w="1008"/>
+            <w:vAlign w:val="center"/>
+          </w:tcPr>
+          <w:p>
+            <w:pPr>
+              <w:spacing w:before="0" w:after="20"/>
+            </w:pPr>
+            <w:r>
+              <w:rPr>
+                <w:sz w:val="17"/>
+              </w:rPr>
+              <w:t>必需</w:t>
+            </w:r>
+          </w:p>
+        </w:tc>
+        <w:tc>
+          <w:tcPr>
+            <w:tcW w:type="dxa" w:w="1512"/>
+            <w:vAlign w:val="center"/>
+          </w:tcPr>
+          <w:p>
+            <w:pPr>
+              <w:spacing w:before="0" w:after="20"/>
+            </w:pPr>
+            <w:r>
+              <w:rPr>
+                <w:sz w:val="17"/>
+              </w:rPr>
+              <w:t>缺活动数据时进入 blocked</w:t>
+            </w:r>
+          </w:p>
+        </w:tc>
+      </w:tr>
+      <w:tr>
+        <w:trPr>
+          <w:cantSplit/>
+        </w:trPr>
+        <w:tc>
+          <w:tcPr>
+            <w:tcW w:type="dxa" w:w="2088"/>
+            <w:vAlign w:val="center"/>
+          </w:tcPr>
+          <w:p>
+            <w:pPr>
+              <w:spacing w:before="0" w:after="20"/>
+            </w:pPr>
+            <w:r>
+              <w:rPr>
+                <w:sz w:val="17"/>
+              </w:rPr>
+              <w:t>{{ factor_parameters }}</w:t>
+            </w:r>
+          </w:p>
+        </w:tc>
+        <w:tc>
+          <w:tcPr>
+            <w:tcW w:type="dxa" w:w="2232"/>
+            <w:vAlign w:val="center"/>
+          </w:tcPr>
+          <w:p>
+            <w:pPr>
+              <w:spacing w:before="0" w:after="20"/>
+            </w:pPr>
+            <w:r>
+              <w:rPr>
+                <w:sz w:val="17"/>
+              </w:rPr>
+              <w:t>factor_parameters[]</w:t>
+            </w:r>
+          </w:p>
+        </w:tc>
+        <w:tc>
+          <w:tcPr>
+            <w:tcW w:type="dxa" w:w="2520"/>
+            <w:vAlign w:val="center"/>
+          </w:tcPr>
+          <w:p>
+            <w:pPr>
+              <w:spacing w:before="0" w:after="20"/>
+            </w:pPr>
+            <w:r>
+              <w:rPr>
+                <w:sz w:val="17"/>
+              </w:rPr>
+              <w:t>factor_library / 计算结果快照</w:t>
+            </w:r>
+          </w:p>
+        </w:tc>
+        <w:tc>
+          <w:tcPr>
+            <w:tcW w:type="dxa" w:w="1008"/>
+            <w:vAlign w:val="center"/>
+          </w:tcPr>
+          <w:p>
+            <w:pPr>
+              <w:spacing w:before="0" w:after="20"/>
+            </w:pPr>
+            <w:r>
+              <w:rPr>
+                <w:sz w:val="17"/>
+              </w:rPr>
+              <w:t>必需</w:t>
+            </w:r>
+          </w:p>
+        </w:tc>
+        <w:tc>
+          <w:tcPr>
+            <w:tcW w:type="dxa" w:w="1512"/>
+            <w:vAlign w:val="center"/>
+          </w:tcPr>
+          <w:p>
+            <w:pPr>
+              <w:spacing w:before="0" w:after="20"/>
+            </w:pPr>
+            <w:r>
+              <w:rPr>
+                <w:sz w:val="17"/>
+              </w:rPr>
+              <w:t>缺因子进入 missing_factor</w:t>
+            </w:r>
+          </w:p>
+        </w:tc>
+      </w:tr>
+      <w:tr>
+        <w:trPr>
+          <w:cantSplit/>
+        </w:trPr>
+        <w:tc>
+          <w:tcPr>
+            <w:tcW w:type="dxa" w:w="2088"/>
+            <w:vAlign w:val="center"/>
+          </w:tcPr>
+          <w:p>
+            <w:pPr>
+              <w:spacing w:before="0" w:after="20"/>
+            </w:pPr>
+            <w:r>
+              <w:rPr>
+                <w:sz w:val="17"/>
+              </w:rPr>
+              <w:t>{{ evidence_manifest }}</w:t>
+            </w:r>
+          </w:p>
+        </w:tc>
+        <w:tc>
+          <w:tcPr>
+            <w:tcW w:type="dxa" w:w="2232"/>
+            <w:vAlign w:val="center"/>
+          </w:tcPr>
+          <w:p>
+            <w:pPr>
+              <w:spacing w:before="0" w:after="20"/>
+            </w:pPr>
+            <w:r>
+              <w:rPr>
+                <w:sz w:val="17"/>
+              </w:rPr>
+              <w:t>evidence.items[]</w:t>
+            </w:r>
+          </w:p>
+        </w:tc>
+        <w:tc>
+          <w:tcPr>
+            <w:tcW w:type="dxa" w:w="2520"/>
+            <w:vAlign w:val="center"/>
+          </w:tcPr>
+          <w:p>
+            <w:pPr>
+              <w:spacing w:before="0" w:after="20"/>
+            </w:pPr>
+            <w:r>
+              <w:rPr>
+                <w:sz w:val="17"/>
+              </w:rPr>
+              <w:t>record attachments / 后续 VerificationAttachment</w:t>
+            </w:r>
+          </w:p>
+        </w:tc>
+        <w:tc>
+          <w:tcPr>
+            <w:tcW w:type="dxa" w:w="1008"/>
+            <w:vAlign w:val="center"/>
+          </w:tcPr>
+          <w:p>
+            <w:pPr>
+              <w:spacing w:before="0" w:after="20"/>
+            </w:pPr>
+            <w:r>
+              <w:rPr>
+                <w:sz w:val="17"/>
+              </w:rPr>
+              <w:t>必需</w:t>
+            </w:r>
+          </w:p>
+        </w:tc>
+        <w:tc>
+          <w:tcPr>
+            <w:tcW w:type="dxa" w:w="1512"/>
+            <w:vAlign w:val="center"/>
+          </w:tcPr>
+          <w:p>
+            <w:pPr>
+              <w:spacing w:before="0" w:after="20"/>
+            </w:pPr>
+            <w:r>
+              <w:rPr>
+                <w:sz w:val="17"/>
+              </w:rPr>
+              <w:t>缺凭证进入 missing_evidence</w:t>
+            </w:r>
+          </w:p>
+        </w:tc>
+      </w:tr>
+      <w:tr>
+        <w:trPr>
+          <w:cantSplit/>
+        </w:trPr>
+        <w:tc>
+          <w:tcPr>
+            <w:tcW w:type="dxa" w:w="2088"/>
+            <w:vAlign w:val="center"/>
+          </w:tcPr>
+          <w:p>
+            <w:pPr>
+              <w:spacing w:before="0" w:after="20"/>
+            </w:pPr>
+            <w:r>
+              <w:rPr>
+                <w:sz w:val="17"/>
+              </w:rPr>
+              <w:t>{{ quality_issues }}</w:t>
+            </w:r>
+          </w:p>
+        </w:tc>
+        <w:tc>
+          <w:tcPr>
+            <w:tcW w:type="dxa" w:w="2232"/>
+            <w:vAlign w:val="center"/>
+          </w:tcPr>
+          <w:p>
+            <w:pPr>
+              <w:spacing w:before="0" w:after="20"/>
+            </w:pPr>
+            <w:r>
+              <w:rPr>
+                <w:sz w:val="17"/>
+              </w:rPr>
+              <w:t>quality_issues[]</w:t>
+            </w:r>
+          </w:p>
+        </w:tc>
+        <w:tc>
+          <w:tcPr>
+            <w:tcW w:type="dxa" w:w="2520"/>
+            <w:vAlign w:val="center"/>
+          </w:tcPr>
+          <w:p>
+            <w:pPr>
+              <w:spacing w:before="0" w:after="20"/>
+            </w:pPr>
+            <w:r>
+              <w:rPr>
+                <w:sz w:val="17"/>
+              </w:rPr>
+              <w:t>carbon_verification.issues</w:t>
+            </w:r>
+          </w:p>
+        </w:tc>
+        <w:tc>
+          <w:tcPr>
+            <w:tcW w:type="dxa" w:w="1008"/>
+            <w:vAlign w:val="center"/>
+          </w:tcPr>
+          <w:p>
+            <w:pPr>
+              <w:spacing w:before="0" w:after="20"/>
+            </w:pPr>
+            <w:r>
+              <w:rPr>
+                <w:sz w:val="17"/>
+              </w:rPr>
+              <w:t>按需</w:t>
+            </w:r>
+          </w:p>
+        </w:tc>
+        <w:tc>
+          <w:tcPr>
+            <w:tcW w:type="dxa" w:w="1512"/>
+            <w:vAlign w:val="center"/>
+          </w:tcPr>
+          <w:p>
+            <w:pPr>
+              <w:spacing w:before="0" w:after="20"/>
+            </w:pPr>
+            <w:r>
+              <w:rPr>
+                <w:sz w:val="17"/>
+              </w:rPr>
+              <w:t>无问题时写“无”</w:t>
+            </w:r>
+          </w:p>
+        </w:tc>
+      </w:tr>
+      <w:tr>
+        <w:trPr>
+          <w:cantSplit/>
+        </w:trPr>
+        <w:tc>
+          <w:tcPr>
+            <w:tcW w:type="dxa" w:w="2088"/>
+            <w:vAlign w:val="center"/>
+          </w:tcPr>
+          <w:p>
+            <w:pPr>
+              <w:spacing w:before="0" w:after="20"/>
+            </w:pPr>
+            <w:r>
+              <w:rPr>
+                <w:sz w:val="17"/>
+              </w:rPr>
+              <w:t>{{ audit_trail }}</w:t>
+            </w:r>
+          </w:p>
+        </w:tc>
+        <w:tc>
+          <w:tcPr>
+            <w:tcW w:type="dxa" w:w="2232"/>
+            <w:vAlign w:val="center"/>
+          </w:tcPr>
+          <w:p>
+            <w:pPr>
+              <w:spacing w:before="0" w:after="20"/>
+            </w:pPr>
+            <w:r>
+              <w:rPr>
+                <w:sz w:val="17"/>
+              </w:rPr>
+              <w:t>audit_trail.items[]</w:t>
+            </w:r>
+          </w:p>
+        </w:tc>
+        <w:tc>
+          <w:tcPr>
+            <w:tcW w:type="dxa" w:w="2520"/>
+            <w:vAlign w:val="center"/>
+          </w:tcPr>
+          <w:p>
+            <w:pPr>
+              <w:spacing w:before="0" w:after="20"/>
+            </w:pPr>
+            <w:r>
+              <w:rPr>
+                <w:sz w:val="17"/>
+              </w:rPr>
+              <w:t>CarbonAuditLog / 后续核查复核日志</w:t>
+            </w:r>
+          </w:p>
+        </w:tc>
+        <w:tc>
+          <w:tcPr>
+            <w:tcW w:type="dxa" w:w="1008"/>
+            <w:vAlign w:val="center"/>
+          </w:tcPr>
+          <w:p>
+            <w:pPr>
+              <w:spacing w:before="0" w:after="20"/>
+            </w:pPr>
+            <w:r>
+              <w:rPr>
+                <w:sz w:val="17"/>
+              </w:rPr>
+              <w:t>按需</w:t>
+            </w:r>
+          </w:p>
+        </w:tc>
+        <w:tc>
+          <w:tcPr>
+            <w:tcW w:type="dxa" w:w="1512"/>
+            <w:vAlign w:val="center"/>
+          </w:tcPr>
+          <w:p>
+            <w:pPr>
+              <w:spacing w:before="0" w:after="20"/>
+            </w:pPr>
+            <w:r>
+              <w:rPr>
+                <w:sz w:val="17"/>
+              </w:rPr>
+              <w:t>无记录时写“未形成独立复核记录”</w:t>
+            </w:r>
+          </w:p>
+        </w:tc>
+      </w:tr>
+    </w:tbl>
+    <w:p/>
+    <w:p>
+      <w:pPr>
+        <w:pStyle w:val="Heading2"/>
+        <w:keepNext/>
+      </w:pPr>
+      <w:r>
+        <w:rPr>
+          <w:rFonts w:ascii="Calibri" w:hAnsi="Calibri" w:eastAsia="宋体"/>
+        </w:rPr>
+        <w:t>附表 M：核查材料包 ZIP 文件树</w:t>
+      </w:r>
+    </w:p>
+    <w:p>
+      <w:pPr>
+        <w:spacing w:after="120"/>
+      </w:pPr>
+      <w:r>
+        <w:rPr>
+          <w:rFonts w:ascii="Calibri" w:hAnsi="Calibri" w:eastAsia="宋体"/>
+        </w:rPr>
+        <w:t>本文件树是平台导出任务的目标形态。当前系统已生成 manifest、报告上下文、活动数据、因子参数、问题清单和审核轨迹；下一步应把 DOCX/PDF 渲染结果和附件原件加入同一导出任务。</w:t>
+      </w:r>
+    </w:p>
+    <w:tbl>
+      <w:tblPr>
+        <w:tblStyle w:val="TableGrid"/>
+        <w:tblW w:type="auto" w:w="0"/>
+        <w:jc w:val="center"/>
+        <w:tblLayout w:type="fixed"/>
+        <w:tblLook w:firstColumn="1" w:firstRow="1" w:lastColumn="0" w:lastRow="0" w:noHBand="0" w:noVBand="1" w:val="04A0"/>
+        <w:tblCellMar>
+          <w:top w:w="80" w:type="dxa"/>
+          <w:start w:w="120" w:type="dxa"/>
+          <w:bottom w:w="80" w:type="dxa"/>
+          <w:end w:w="120" w:type="dxa"/>
+        </w:tblCellMar>
+      </w:tblPr>
+      <w:tblGrid>
+        <w:gridCol w:w="1872"/>
+        <w:gridCol w:w="1872"/>
+        <w:gridCol w:w="1872"/>
+        <w:gridCol w:w="1872"/>
+        <w:gridCol w:w="1872"/>
+      </w:tblGrid>
+      <w:tr>
+        <w:trPr>
+          <w:tblHeader w:val="true"/>
+          <w:cantSplit/>
+        </w:trPr>
+        <w:tc>
+          <w:tcPr>
+            <w:tcW w:type="dxa" w:w="2592"/>
+            <w:shd w:fill="F2F4F7"/>
+            <w:vAlign w:val="center"/>
+          </w:tcPr>
+          <w:p>
+            <w:pPr>
+              <w:spacing w:before="0" w:after="20"/>
+              <w:jc w:val="center"/>
+            </w:pPr>
+            <w:r>
+              <w:rPr>
+                <w:b/>
+                <w:sz w:val="17"/>
+              </w:rPr>
+              <w:t>路径</w:t>
+            </w:r>
+          </w:p>
+        </w:tc>
+        <w:tc>
+          <w:tcPr>
+            <w:tcW w:type="dxa" w:w="2232"/>
+            <w:shd w:fill="F2F4F7"/>
+            <w:vAlign w:val="center"/>
+          </w:tcPr>
+          <w:p>
+            <w:pPr>
+              <w:spacing w:before="0" w:after="20"/>
+              <w:jc w:val="center"/>
+            </w:pPr>
+            <w:r>
+              <w:rPr>
+                <w:b/>
+                <w:sz w:val="17"/>
+              </w:rPr>
+              <w:t>内容</w:t>
+            </w:r>
+          </w:p>
+        </w:tc>
+        <w:tc>
+          <w:tcPr>
+            <w:tcW w:type="dxa" w:w="1944"/>
+            <w:shd w:fill="F2F4F7"/>
+            <w:vAlign w:val="center"/>
+          </w:tcPr>
+          <w:p>
+            <w:pPr>
+              <w:spacing w:before="0" w:after="20"/>
+              <w:jc w:val="center"/>
+            </w:pPr>
+            <w:r>
+              <w:rPr>
+                <w:b/>
+                <w:sz w:val="17"/>
+              </w:rPr>
+              <w:t>来源领域</w:t>
+            </w:r>
+          </w:p>
+        </w:tc>
+        <w:tc>
+          <w:tcPr>
+            <w:tcW w:type="dxa" w:w="1080"/>
+            <w:shd w:fill="F2F4F7"/>
+            <w:vAlign w:val="center"/>
+          </w:tcPr>
+          <w:p>
+            <w:pPr>
+              <w:spacing w:before="0" w:after="20"/>
+              <w:jc w:val="center"/>
+            </w:pPr>
+            <w:r>
+              <w:rPr>
+                <w:b/>
+                <w:sz w:val="17"/>
+              </w:rPr>
+              <w:t>格式</w:t>
+            </w:r>
+          </w:p>
+        </w:tc>
+        <w:tc>
+          <w:tcPr>
+            <w:tcW w:type="dxa" w:w="1512"/>
+            <w:shd w:fill="F2F4F7"/>
+            <w:vAlign w:val="center"/>
+          </w:tcPr>
+          <w:p>
+            <w:pPr>
+              <w:spacing w:before="0" w:after="20"/>
+              <w:jc w:val="center"/>
+            </w:pPr>
+            <w:r>
+              <w:rPr>
+                <w:b/>
+                <w:sz w:val="17"/>
+              </w:rPr>
+              <w:t>当前状态</w:t>
+            </w:r>
+          </w:p>
+        </w:tc>
+      </w:tr>
+      <w:tr>
+        <w:trPr>
+          <w:cantSplit/>
+        </w:trPr>
+        <w:tc>
+          <w:tcPr>
+            <w:tcW w:type="dxa" w:w="2592"/>
+            <w:vAlign w:val="center"/>
+          </w:tcPr>
+          <w:p>
+            <w:pPr>
+              <w:spacing w:before="0" w:after="20"/>
+            </w:pPr>
+            <w:r>
+              <w:rPr>
+                <w:sz w:val="17"/>
+              </w:rPr>
+              <w:t>manifest.json</w:t>
+            </w:r>
+          </w:p>
+        </w:tc>
+        <w:tc>
+          <w:tcPr>
+            <w:tcW w:type="dxa" w:w="2232"/>
+            <w:vAlign w:val="center"/>
+          </w:tcPr>
+          <w:p>
+            <w:pPr>
+              <w:spacing w:before="0" w:after="20"/>
+            </w:pPr>
+            <w:r>
+              <w:rPr>
+                <w:sz w:val="17"/>
+              </w:rPr>
+              <w:t>材料包目录、模板版本、文件哈希、生成时间</w:t>
+            </w:r>
+          </w:p>
+        </w:tc>
+        <w:tc>
+          <w:tcPr>
+            <w:tcW w:type="dxa" w:w="1944"/>
+            <w:vAlign w:val="center"/>
+          </w:tcPr>
+          <w:p>
+            <w:pPr>
+              <w:spacing w:before="0" w:after="20"/>
+            </w:pPr>
+            <w:r>
+              <w:rPr>
+                <w:sz w:val="17"/>
+              </w:rPr>
+              <w:t>carbon_verification</w:t>
+            </w:r>
+          </w:p>
+        </w:tc>
+        <w:tc>
+          <w:tcPr>
+            <w:tcW w:type="dxa" w:w="1080"/>
+            <w:vAlign w:val="center"/>
+          </w:tcPr>
+          <w:p>
+            <w:pPr>
+              <w:spacing w:before="0" w:after="20"/>
+            </w:pPr>
+            <w:r>
+              <w:rPr>
+                <w:sz w:val="17"/>
+              </w:rPr>
+              <w:t>JSON</w:t>
+            </w:r>
+          </w:p>
+        </w:tc>
+        <w:tc>
+          <w:tcPr>
+            <w:tcW w:type="dxa" w:w="1512"/>
+            <w:vAlign w:val="center"/>
+          </w:tcPr>
+          <w:p>
+            <w:pPr>
+              <w:spacing w:before="0" w:after="20"/>
+            </w:pPr>
+            <w:r>
+              <w:rPr>
+                <w:sz w:val="17"/>
+              </w:rPr>
+              <w:t>已实现</w:t>
+            </w:r>
+          </w:p>
+        </w:tc>
+      </w:tr>
+      <w:tr>
+        <w:trPr>
+          <w:cantSplit/>
+        </w:trPr>
+        <w:tc>
+          <w:tcPr>
+            <w:tcW w:type="dxa" w:w="2592"/>
+            <w:vAlign w:val="center"/>
+          </w:tcPr>
+          <w:p>
+            <w:pPr>
+              <w:spacing w:before="0" w:after="20"/>
+            </w:pPr>
+            <w:r>
+              <w:rPr>
+                <w:sz w:val="17"/>
+              </w:rPr>
+              <w:t>report/{year}-organization-ghg-report.docx</w:t>
+            </w:r>
+          </w:p>
+        </w:tc>
+        <w:tc>
+          <w:tcPr>
+            <w:tcW w:type="dxa" w:w="2232"/>
+            <w:vAlign w:val="center"/>
+          </w:tcPr>
+          <w:p>
+            <w:pPr>
+              <w:spacing w:before="0" w:after="20"/>
+            </w:pPr>
+            <w:r>
+              <w:rPr>
+                <w:sz w:val="17"/>
+              </w:rPr>
+              <w:t>企业自报温室气体排放盘查报告</w:t>
+            </w:r>
+          </w:p>
+        </w:tc>
+        <w:tc>
+          <w:tcPr>
+            <w:tcW w:type="dxa" w:w="1944"/>
+            <w:vAlign w:val="center"/>
+          </w:tcPr>
+          <w:p>
+            <w:pPr>
+              <w:spacing w:before="0" w:after="20"/>
+            </w:pPr>
+            <w:r>
+              <w:rPr>
+                <w:sz w:val="17"/>
+              </w:rPr>
+              <w:t>carbon_verification.renderer</w:t>
+            </w:r>
+          </w:p>
+        </w:tc>
+        <w:tc>
+          <w:tcPr>
+            <w:tcW w:type="dxa" w:w="1080"/>
+            <w:vAlign w:val="center"/>
+          </w:tcPr>
+          <w:p>
+            <w:pPr>
+              <w:spacing w:before="0" w:after="20"/>
+            </w:pPr>
+            <w:r>
+              <w:rPr>
+                <w:sz w:val="17"/>
+              </w:rPr>
+              <w:t>DOCX</w:t>
+            </w:r>
+          </w:p>
+        </w:tc>
+        <w:tc>
+          <w:tcPr>
+            <w:tcW w:type="dxa" w:w="1512"/>
+            <w:vAlign w:val="center"/>
+          </w:tcPr>
+          <w:p>
+            <w:pPr>
+              <w:spacing w:before="0" w:after="20"/>
+            </w:pPr>
+            <w:r>
+              <w:rPr>
+                <w:sz w:val="17"/>
+              </w:rPr>
+              <w:t>待渲染</w:t>
+            </w:r>
+          </w:p>
+        </w:tc>
+      </w:tr>
+      <w:tr>
+        <w:trPr>
+          <w:cantSplit/>
+        </w:trPr>
+        <w:tc>
+          <w:tcPr>
+            <w:tcW w:type="dxa" w:w="2592"/>
+            <w:vAlign w:val="center"/>
+          </w:tcPr>
+          <w:p>
+            <w:pPr>
+              <w:spacing w:before="0" w:after="20"/>
+            </w:pPr>
+            <w:r>
+              <w:rPr>
+                <w:sz w:val="17"/>
+              </w:rPr>
+              <w:t>report/{year}-organization-ghg-report.pdf</w:t>
+            </w:r>
+          </w:p>
+        </w:tc>
+        <w:tc>
+          <w:tcPr>
+            <w:tcW w:type="dxa" w:w="2232"/>
+            <w:vAlign w:val="center"/>
+          </w:tcPr>
+          <w:p>
+            <w:pPr>
+              <w:spacing w:before="0" w:after="20"/>
+            </w:pPr>
+            <w:r>
+              <w:rPr>
+                <w:sz w:val="17"/>
+              </w:rPr>
+              <w:t>由 DOCX 转换的只读报告</w:t>
+            </w:r>
+          </w:p>
+        </w:tc>
+        <w:tc>
+          <w:tcPr>
+            <w:tcW w:type="dxa" w:w="1944"/>
+            <w:vAlign w:val="center"/>
+          </w:tcPr>
+          <w:p>
+            <w:pPr>
+              <w:spacing w:before="0" w:after="20"/>
+            </w:pPr>
+            <w:r>
+              <w:rPr>
+                <w:sz w:val="17"/>
+              </w:rPr>
+              <w:t>carbon_verification.renderer</w:t>
+            </w:r>
+          </w:p>
+        </w:tc>
+        <w:tc>
+          <w:tcPr>
+            <w:tcW w:type="dxa" w:w="1080"/>
+            <w:vAlign w:val="center"/>
+          </w:tcPr>
+          <w:p>
+            <w:pPr>
+              <w:spacing w:before="0" w:after="20"/>
+            </w:pPr>
+            <w:r>
+              <w:rPr>
+                <w:sz w:val="17"/>
+              </w:rPr>
+              <w:t>PDF</w:t>
+            </w:r>
+          </w:p>
+        </w:tc>
+        <w:tc>
+          <w:tcPr>
+            <w:tcW w:type="dxa" w:w="1512"/>
+            <w:vAlign w:val="center"/>
+          </w:tcPr>
+          <w:p>
+            <w:pPr>
+              <w:spacing w:before="0" w:after="20"/>
+            </w:pPr>
+            <w:r>
+              <w:rPr>
+                <w:sz w:val="17"/>
+              </w:rPr>
+              <w:t>待渲染</w:t>
+            </w:r>
+          </w:p>
+        </w:tc>
+      </w:tr>
+      <w:tr>
+        <w:trPr>
+          <w:cantSplit/>
+        </w:trPr>
+        <w:tc>
+          <w:tcPr>
+            <w:tcW w:type="dxa" w:w="2592"/>
+            <w:vAlign w:val="center"/>
+          </w:tcPr>
+          <w:p>
+            <w:pPr>
+              <w:spacing w:before="0" w:after="20"/>
+            </w:pPr>
+            <w:r>
+              <w:rPr>
+                <w:sz w:val="17"/>
+              </w:rPr>
+              <w:t>report/report-context.json</w:t>
+            </w:r>
+          </w:p>
+        </w:tc>
+        <w:tc>
+          <w:tcPr>
+            <w:tcW w:type="dxa" w:w="2232"/>
+            <w:vAlign w:val="center"/>
+          </w:tcPr>
+          <w:p>
+            <w:pPr>
+              <w:spacing w:before="0" w:after="20"/>
+            </w:pPr>
+            <w:r>
+              <w:rPr>
+                <w:sz w:val="17"/>
+              </w:rPr>
+              <w:t>报告上下文快照</w:t>
+            </w:r>
+          </w:p>
+        </w:tc>
+        <w:tc>
+          <w:tcPr>
+            <w:tcW w:type="dxa" w:w="1944"/>
+            <w:vAlign w:val="center"/>
+          </w:tcPr>
+          <w:p>
+            <w:pPr>
+              <w:spacing w:before="0" w:after="20"/>
+            </w:pPr>
+            <w:r>
+              <w:rPr>
+                <w:sz w:val="17"/>
+              </w:rPr>
+              <w:t>carbon_verification.queries</w:t>
+            </w:r>
+          </w:p>
+        </w:tc>
+        <w:tc>
+          <w:tcPr>
+            <w:tcW w:type="dxa" w:w="1080"/>
+            <w:vAlign w:val="center"/>
+          </w:tcPr>
+          <w:p>
+            <w:pPr>
+              <w:spacing w:before="0" w:after="20"/>
+            </w:pPr>
+            <w:r>
+              <w:rPr>
+                <w:sz w:val="17"/>
+              </w:rPr>
+              <w:t>JSON</w:t>
+            </w:r>
+          </w:p>
+        </w:tc>
+        <w:tc>
+          <w:tcPr>
+            <w:tcW w:type="dxa" w:w="1512"/>
+            <w:vAlign w:val="center"/>
+          </w:tcPr>
+          <w:p>
+            <w:pPr>
+              <w:spacing w:before="0" w:after="20"/>
+            </w:pPr>
+            <w:r>
+              <w:rPr>
+                <w:sz w:val="17"/>
+              </w:rPr>
+              <w:t>已实现</w:t>
+            </w:r>
+          </w:p>
+        </w:tc>
+      </w:tr>
+      <w:tr>
+        <w:trPr>
+          <w:cantSplit/>
+        </w:trPr>
+        <w:tc>
+          <w:tcPr>
+            <w:tcW w:type="dxa" w:w="2592"/>
+            <w:vAlign w:val="center"/>
+          </w:tcPr>
+          <w:p>
+            <w:pPr>
+              <w:spacing w:before="0" w:after="20"/>
+            </w:pPr>
+            <w:r>
+              <w:rPr>
+                <w:sz w:val="17"/>
+              </w:rPr>
+              <w:t>data/activity-data.csv 或 .xlsx</w:t>
+            </w:r>
+          </w:p>
+        </w:tc>
+        <w:tc>
+          <w:tcPr>
+            <w:tcW w:type="dxa" w:w="2232"/>
+            <w:vAlign w:val="center"/>
+          </w:tcPr>
+          <w:p>
+            <w:pPr>
+              <w:spacing w:before="0" w:after="20"/>
+            </w:pPr>
+            <w:r>
+              <w:rPr>
+                <w:sz w:val="17"/>
+              </w:rPr>
+              <w:t>活动水平数据台账</w:t>
+            </w:r>
+          </w:p>
+        </w:tc>
+        <w:tc>
+          <w:tcPr>
+            <w:tcW w:type="dxa" w:w="1944"/>
+            <w:vAlign w:val="center"/>
+          </w:tcPr>
+          <w:p>
+            <w:pPr>
+              <w:spacing w:before="0" w:after="20"/>
+            </w:pPr>
+            <w:r>
+              <w:rPr>
+                <w:sz w:val="17"/>
+              </w:rPr>
+              <w:t>carbon_accounting / energy</w:t>
+            </w:r>
+          </w:p>
+        </w:tc>
+        <w:tc>
+          <w:tcPr>
+            <w:tcW w:type="dxa" w:w="1080"/>
+            <w:vAlign w:val="center"/>
+          </w:tcPr>
+          <w:p>
+            <w:pPr>
+              <w:spacing w:before="0" w:after="20"/>
+            </w:pPr>
+            <w:r>
+              <w:rPr>
+                <w:sz w:val="17"/>
+              </w:rPr>
+              <w:t>CSV/XLSX</w:t>
+            </w:r>
+          </w:p>
+        </w:tc>
+        <w:tc>
+          <w:tcPr>
+            <w:tcW w:type="dxa" w:w="1512"/>
+            <w:vAlign w:val="center"/>
+          </w:tcPr>
+          <w:p>
+            <w:pPr>
+              <w:spacing w:before="0" w:after="20"/>
+            </w:pPr>
+            <w:r>
+              <w:rPr>
+                <w:sz w:val="17"/>
+              </w:rPr>
+              <w:t>CSV 已实现</w:t>
+            </w:r>
+          </w:p>
+        </w:tc>
+      </w:tr>
+      <w:tr>
+        <w:trPr>
+          <w:cantSplit/>
+        </w:trPr>
+        <w:tc>
+          <w:tcPr>
+            <w:tcW w:type="dxa" w:w="2592"/>
+            <w:vAlign w:val="center"/>
+          </w:tcPr>
+          <w:p>
+            <w:pPr>
+              <w:spacing w:before="0" w:after="20"/>
+            </w:pPr>
+            <w:r>
+              <w:rPr>
+                <w:sz w:val="17"/>
+              </w:rPr>
+              <w:t>data/factor-parameters.csv 或 .xlsx</w:t>
+            </w:r>
+          </w:p>
+        </w:tc>
+        <w:tc>
+          <w:tcPr>
+            <w:tcW w:type="dxa" w:w="2232"/>
+            <w:vAlign w:val="center"/>
+          </w:tcPr>
+          <w:p>
+            <w:pPr>
+              <w:spacing w:before="0" w:after="20"/>
+            </w:pPr>
+            <w:r>
+              <w:rPr>
+                <w:sz w:val="17"/>
+              </w:rPr>
+              <w:t>因子和计算参数来源</w:t>
+            </w:r>
+          </w:p>
+        </w:tc>
+        <w:tc>
+          <w:tcPr>
+            <w:tcW w:type="dxa" w:w="1944"/>
+            <w:vAlign w:val="center"/>
+          </w:tcPr>
+          <w:p>
+            <w:pPr>
+              <w:spacing w:before="0" w:after="20"/>
+            </w:pPr>
+            <w:r>
+              <w:rPr>
+                <w:sz w:val="17"/>
+              </w:rPr>
+              <w:t>factor_library</w:t>
+            </w:r>
+          </w:p>
+        </w:tc>
+        <w:tc>
+          <w:tcPr>
+            <w:tcW w:type="dxa" w:w="1080"/>
+            <w:vAlign w:val="center"/>
+          </w:tcPr>
+          <w:p>
+            <w:pPr>
+              <w:spacing w:before="0" w:after="20"/>
+            </w:pPr>
+            <w:r>
+              <w:rPr>
+                <w:sz w:val="17"/>
+              </w:rPr>
+              <w:t>CSV/XLSX</w:t>
+            </w:r>
+          </w:p>
+        </w:tc>
+        <w:tc>
+          <w:tcPr>
+            <w:tcW w:type="dxa" w:w="1512"/>
+            <w:vAlign w:val="center"/>
+          </w:tcPr>
+          <w:p>
+            <w:pPr>
+              <w:spacing w:before="0" w:after="20"/>
+            </w:pPr>
+            <w:r>
+              <w:rPr>
+                <w:sz w:val="17"/>
+              </w:rPr>
+              <w:t>CSV 已实现</w:t>
+            </w:r>
+          </w:p>
+        </w:tc>
+      </w:tr>
+      <w:tr>
+        <w:trPr>
+          <w:cantSplit/>
+        </w:trPr>
+        <w:tc>
+          <w:tcPr>
+            <w:tcW w:type="dxa" w:w="2592"/>
+            <w:vAlign w:val="center"/>
+          </w:tcPr>
+          <w:p>
+            <w:pPr>
+              <w:spacing w:before="0" w:after="20"/>
+            </w:pPr>
+            <w:r>
+              <w:rPr>
+                <w:sz w:val="17"/>
+              </w:rPr>
+              <w:t>evidence/{year}/...</w:t>
+            </w:r>
+          </w:p>
+        </w:tc>
+        <w:tc>
+          <w:tcPr>
+            <w:tcW w:type="dxa" w:w="2232"/>
+            <w:vAlign w:val="center"/>
+          </w:tcPr>
+          <w:p>
+            <w:pPr>
+              <w:spacing w:before="0" w:after="20"/>
+            </w:pPr>
+            <w:r>
+              <w:rPr>
+                <w:sz w:val="17"/>
+              </w:rPr>
+              <w:t>账单、台账、计量、检测、校准等原始凭证</w:t>
+            </w:r>
+          </w:p>
+        </w:tc>
+        <w:tc>
+          <w:tcPr>
+            <w:tcW w:type="dxa" w:w="1944"/>
+            <w:vAlign w:val="center"/>
+          </w:tcPr>
+          <w:p>
+            <w:pPr>
+              <w:spacing w:before="0" w:after="20"/>
+            </w:pPr>
+            <w:r>
+              <w:rPr>
+                <w:sz w:val="17"/>
+              </w:rPr>
+              <w:t>VerificationAttachment</w:t>
+            </w:r>
+          </w:p>
+        </w:tc>
+        <w:tc>
+          <w:tcPr>
+            <w:tcW w:type="dxa" w:w="1080"/>
+            <w:vAlign w:val="center"/>
+          </w:tcPr>
+          <w:p>
+            <w:pPr>
+              <w:spacing w:before="0" w:after="20"/>
+            </w:pPr>
+            <w:r>
+              <w:rPr>
+                <w:sz w:val="17"/>
+              </w:rPr>
+              <w:t>原件</w:t>
+            </w:r>
+          </w:p>
+        </w:tc>
+        <w:tc>
+          <w:tcPr>
+            <w:tcW w:type="dxa" w:w="1512"/>
+            <w:vAlign w:val="center"/>
+          </w:tcPr>
+          <w:p>
+            <w:pPr>
+              <w:spacing w:before="0" w:after="20"/>
+            </w:pPr>
+            <w:r>
+              <w:rPr>
+                <w:sz w:val="17"/>
+              </w:rPr>
+              <w:t>待独立附件实体</w:t>
+            </w:r>
+          </w:p>
+        </w:tc>
+      </w:tr>
+      <w:tr>
+        <w:trPr>
+          <w:cantSplit/>
+        </w:trPr>
+        <w:tc>
+          <w:tcPr>
+            <w:tcW w:type="dxa" w:w="2592"/>
+            <w:vAlign w:val="center"/>
+          </w:tcPr>
+          <w:p>
+            <w:pPr>
+              <w:spacing w:before="0" w:after="20"/>
+            </w:pPr>
+            <w:r>
+              <w:rPr>
+                <w:sz w:val="17"/>
+              </w:rPr>
+              <w:t>quality/issues.csv</w:t>
+            </w:r>
+          </w:p>
+        </w:tc>
+        <w:tc>
+          <w:tcPr>
+            <w:tcW w:type="dxa" w:w="2232"/>
+            <w:vAlign w:val="center"/>
+          </w:tcPr>
+          <w:p>
+            <w:pPr>
+              <w:spacing w:before="0" w:after="20"/>
+            </w:pPr>
+            <w:r>
+              <w:rPr>
+                <w:sz w:val="17"/>
+              </w:rPr>
+              <w:t>质量问题、不符合项和整改记录</w:t>
+            </w:r>
+          </w:p>
+        </w:tc>
+        <w:tc>
+          <w:tcPr>
+            <w:tcW w:type="dxa" w:w="1944"/>
+            <w:vAlign w:val="center"/>
+          </w:tcPr>
+          <w:p>
+            <w:pPr>
+              <w:spacing w:before="0" w:after="20"/>
+            </w:pPr>
+            <w:r>
+              <w:rPr>
+                <w:sz w:val="17"/>
+              </w:rPr>
+              <w:t>carbon_verification</w:t>
+            </w:r>
+          </w:p>
+        </w:tc>
+        <w:tc>
+          <w:tcPr>
+            <w:tcW w:type="dxa" w:w="1080"/>
+            <w:vAlign w:val="center"/>
+          </w:tcPr>
+          <w:p>
+            <w:pPr>
+              <w:spacing w:before="0" w:after="20"/>
+            </w:pPr>
+            <w:r>
+              <w:rPr>
+                <w:sz w:val="17"/>
+              </w:rPr>
+              <w:t>CSV/XLSX</w:t>
+            </w:r>
+          </w:p>
+        </w:tc>
+        <w:tc>
+          <w:tcPr>
+            <w:tcW w:type="dxa" w:w="1512"/>
+            <w:vAlign w:val="center"/>
+          </w:tcPr>
+          <w:p>
+            <w:pPr>
+              <w:spacing w:before="0" w:after="20"/>
+            </w:pPr>
+            <w:r>
+              <w:rPr>
+                <w:sz w:val="17"/>
+              </w:rPr>
+              <w:t>已实现问题清单</w:t>
+            </w:r>
+          </w:p>
+        </w:tc>
+      </w:tr>
+      <w:tr>
+        <w:trPr>
+          <w:cantSplit/>
+        </w:trPr>
+        <w:tc>
+          <w:tcPr>
+            <w:tcW w:type="dxa" w:w="2592"/>
+            <w:vAlign w:val="center"/>
+          </w:tcPr>
+          <w:p>
+            <w:pPr>
+              <w:spacing w:before="0" w:after="20"/>
+            </w:pPr>
+            <w:r>
+              <w:rPr>
+                <w:sz w:val="17"/>
+              </w:rPr>
+              <w:t>audit/audit-trail.csv</w:t>
+            </w:r>
+          </w:p>
+        </w:tc>
+        <w:tc>
+          <w:tcPr>
+            <w:tcW w:type="dxa" w:w="2232"/>
+            <w:vAlign w:val="center"/>
+          </w:tcPr>
+          <w:p>
+            <w:pPr>
+              <w:spacing w:before="0" w:after="20"/>
+            </w:pPr>
+            <w:r>
+              <w:rPr>
+                <w:sz w:val="17"/>
+              </w:rPr>
+              <w:t>内部审核、重算和导出轨迹</w:t>
+            </w:r>
+          </w:p>
+        </w:tc>
+        <w:tc>
+          <w:tcPr>
+            <w:tcW w:type="dxa" w:w="1944"/>
+            <w:vAlign w:val="center"/>
+          </w:tcPr>
+          <w:p>
+            <w:pPr>
+              <w:spacing w:before="0" w:after="20"/>
+            </w:pPr>
+            <w:r>
+              <w:rPr>
+                <w:sz w:val="17"/>
+              </w:rPr>
+              <w:t>carbon_accounting / carbon_verification</w:t>
+            </w:r>
+          </w:p>
+        </w:tc>
+        <w:tc>
+          <w:tcPr>
+            <w:tcW w:type="dxa" w:w="1080"/>
+            <w:vAlign w:val="center"/>
+          </w:tcPr>
+          <w:p>
+            <w:pPr>
+              <w:spacing w:before="0" w:after="20"/>
+            </w:pPr>
+            <w:r>
+              <w:rPr>
+                <w:sz w:val="17"/>
+              </w:rPr>
+              <w:t>CSV/XLSX</w:t>
+            </w:r>
+          </w:p>
+        </w:tc>
+        <w:tc>
+          <w:tcPr>
+            <w:tcW w:type="dxa" w:w="1512"/>
+            <w:vAlign w:val="center"/>
+          </w:tcPr>
+          <w:p>
+            <w:pPr>
+              <w:spacing w:before="0" w:after="20"/>
+            </w:pPr>
+            <w:r>
+              <w:rPr>
+                <w:sz w:val="17"/>
+              </w:rPr>
+              <w:t>已实现基础日志</w:t>
+            </w:r>
+          </w:p>
+        </w:tc>
+      </w:tr>
+    </w:tbl>
+    <w:p/>
+    <w:p>
+      <w:pPr>
+        <w:pStyle w:val="Heading2"/>
+        <w:keepNext/>
+      </w:pPr>
+      <w:r>
+        <w:rPr>
+          <w:rFonts w:ascii="Calibri" w:hAnsi="Calibri" w:eastAsia="宋体"/>
+        </w:rPr>
+        <w:t>附表 N：后续实现拆分任务</w:t>
+      </w:r>
+    </w:p>
+    <w:p>
+      <w:pPr>
+        <w:spacing w:after="120"/>
+      </w:pPr>
+      <w:r>
+        <w:rPr>
+          <w:rFonts w:ascii="Calibri" w:hAnsi="Calibri" w:eastAsia="宋体"/>
+        </w:rPr>
+        <w:t>为避免把模板渲染、附件管理和核查发现继续堆进 Controller，后续实现应按下表拆分到清晰的领域对象和应用服务。</w:t>
+      </w:r>
+    </w:p>
+    <w:tbl>
+      <w:tblPr>
+        <w:tblStyle w:val="TableGrid"/>
+        <w:tblW w:type="auto" w:w="0"/>
+        <w:jc w:val="center"/>
+        <w:tblLayout w:type="fixed"/>
+        <w:tblLook w:firstColumn="1" w:firstRow="1" w:lastColumn="0" w:lastRow="0" w:noHBand="0" w:noVBand="1" w:val="04A0"/>
+        <w:tblCellMar>
+          <w:top w:w="80" w:type="dxa"/>
+          <w:start w:w="120" w:type="dxa"/>
+          <w:bottom w:w="80" w:type="dxa"/>
+          <w:end w:w="120" w:type="dxa"/>
+        </w:tblCellMar>
+      </w:tblPr>
+      <w:tblGrid>
+        <w:gridCol w:w="2340"/>
+        <w:gridCol w:w="2340"/>
+        <w:gridCol w:w="2340"/>
+        <w:gridCol w:w="2340"/>
+      </w:tblGrid>
+      <w:tr>
+        <w:trPr>
+          <w:tblHeader w:val="true"/>
+          <w:cantSplit/>
+        </w:trPr>
+        <w:tc>
+          <w:tcPr>
+            <w:tcW w:type="dxa" w:w="2088"/>
+            <w:shd w:fill="F2F4F7"/>
+            <w:vAlign w:val="center"/>
+          </w:tcPr>
+          <w:p>
+            <w:pPr>
+              <w:spacing w:before="0" w:after="20"/>
+              <w:jc w:val="center"/>
+            </w:pPr>
+            <w:r>
+              <w:rPr>
+                <w:b/>
+                <w:sz w:val="17"/>
+              </w:rPr>
+              <w:t>对象/服务</w:t>
+            </w:r>
+          </w:p>
+        </w:tc>
+        <w:tc>
+          <w:tcPr>
+            <w:tcW w:type="dxa" w:w="1800"/>
+            <w:shd w:fill="F2F4F7"/>
+            <w:vAlign w:val="center"/>
+          </w:tcPr>
+          <w:p>
+            <w:pPr>
+              <w:spacing w:before="0" w:after="20"/>
+              <w:jc w:val="center"/>
+            </w:pPr>
+            <w:r>
+              <w:rPr>
+                <w:b/>
+                <w:sz w:val="17"/>
+              </w:rPr>
+              <w:t>所属上下文</w:t>
+            </w:r>
+          </w:p>
+        </w:tc>
+        <w:tc>
+          <w:tcPr>
+            <w:tcW w:type="dxa" w:w="2952"/>
+            <w:shd w:fill="F2F4F7"/>
+            <w:vAlign w:val="center"/>
+          </w:tcPr>
+          <w:p>
+            <w:pPr>
+              <w:spacing w:before="0" w:after="20"/>
+              <w:jc w:val="center"/>
+            </w:pPr>
+            <w:r>
+              <w:rPr>
+                <w:b/>
+                <w:sz w:val="17"/>
+              </w:rPr>
+              <w:t>职责</w:t>
+            </w:r>
+          </w:p>
+        </w:tc>
+        <w:tc>
+          <w:tcPr>
+            <w:tcW w:type="dxa" w:w="2520"/>
+            <w:shd w:fill="F2F4F7"/>
+            <w:vAlign w:val="center"/>
+          </w:tcPr>
+          <w:p>
+            <w:pPr>
+              <w:spacing w:before="0" w:after="20"/>
+              <w:jc w:val="center"/>
+            </w:pPr>
+            <w:r>
+              <w:rPr>
+                <w:b/>
+                <w:sz w:val="17"/>
+              </w:rPr>
+              <w:t>验收口径</w:t>
+            </w:r>
+          </w:p>
+        </w:tc>
+      </w:tr>
+      <w:tr>
+        <w:trPr>
+          <w:cantSplit/>
+        </w:trPr>
+        <w:tc>
+          <w:tcPr>
+            <w:tcW w:type="dxa" w:w="2088"/>
+            <w:vAlign w:val="center"/>
+          </w:tcPr>
+          <w:p>
+            <w:pPr>
+              <w:spacing w:before="0" w:after="20"/>
+            </w:pPr>
+            <w:r>
+              <w:rPr>
+                <w:sz w:val="17"/>
+              </w:rPr>
+              <w:t>ReportTemplateVersion</w:t>
+            </w:r>
+          </w:p>
+        </w:tc>
+        <w:tc>
+          <w:tcPr>
+            <w:tcW w:type="dxa" w:w="1800"/>
+            <w:vAlign w:val="center"/>
+          </w:tcPr>
+          <w:p>
+            <w:pPr>
+              <w:spacing w:before="0" w:after="20"/>
+            </w:pPr>
+            <w:r>
+              <w:rPr>
+                <w:sz w:val="17"/>
+              </w:rPr>
+              <w:t>carbon_verification</w:t>
+            </w:r>
+          </w:p>
+        </w:tc>
+        <w:tc>
+          <w:tcPr>
+            <w:tcW w:type="dxa" w:w="2952"/>
+            <w:vAlign w:val="center"/>
+          </w:tcPr>
+          <w:p>
+            <w:pPr>
+              <w:spacing w:before="0" w:after="20"/>
+            </w:pPr>
+            <w:r>
+              <w:rPr>
+                <w:sz w:val="17"/>
+              </w:rPr>
+              <w:t>管理模板名称、版本、标准来源、适用行业、文件路径和启停状态</w:t>
+            </w:r>
+          </w:p>
+        </w:tc>
+        <w:tc>
+          <w:tcPr>
+            <w:tcW w:type="dxa" w:w="2520"/>
+            <w:vAlign w:val="center"/>
+          </w:tcPr>
+          <w:p>
+            <w:pPr>
+              <w:spacing w:before="0" w:after="20"/>
+            </w:pPr>
+            <w:r>
+              <w:rPr>
+                <w:sz w:val="17"/>
+              </w:rPr>
+              <w:t>导出任务记录模板版本，历史报告可复现</w:t>
+            </w:r>
+          </w:p>
+        </w:tc>
+      </w:tr>
+      <w:tr>
+        <w:trPr>
+          <w:cantSplit/>
+        </w:trPr>
+        <w:tc>
+          <w:tcPr>
+            <w:tcW w:type="dxa" w:w="2088"/>
+            <w:vAlign w:val="center"/>
+          </w:tcPr>
+          <w:p>
+            <w:pPr>
+              <w:spacing w:before="0" w:after="20"/>
+            </w:pPr>
+            <w:r>
+              <w:rPr>
+                <w:sz w:val="17"/>
+              </w:rPr>
+              <w:t>ReportDocumentRenderer</w:t>
+            </w:r>
+          </w:p>
+        </w:tc>
+        <w:tc>
+          <w:tcPr>
+            <w:tcW w:type="dxa" w:w="1800"/>
+            <w:vAlign w:val="center"/>
+          </w:tcPr>
+          <w:p>
+            <w:pPr>
+              <w:spacing w:before="0" w:after="20"/>
+            </w:pPr>
+            <w:r>
+              <w:rPr>
+                <w:sz w:val="17"/>
+              </w:rPr>
+              <w:t>carbon_verification.usecases</w:t>
+            </w:r>
+          </w:p>
+        </w:tc>
+        <w:tc>
+          <w:tcPr>
+            <w:tcW w:type="dxa" w:w="2952"/>
+            <w:vAlign w:val="center"/>
+          </w:tcPr>
+          <w:p>
+            <w:pPr>
+              <w:spacing w:before="0" w:after="20"/>
+            </w:pPr>
+            <w:r>
+              <w:rPr>
+                <w:sz w:val="17"/>
+              </w:rPr>
+              <w:t>读取 report_context，填充 DOCX，输出 DOCX/PDF，并计算文件哈希</w:t>
+            </w:r>
+          </w:p>
+        </w:tc>
+        <w:tc>
+          <w:tcPr>
+            <w:tcW w:type="dxa" w:w="2520"/>
+            <w:vAlign w:val="center"/>
+          </w:tcPr>
+          <w:p>
+            <w:pPr>
+              <w:spacing w:before="0" w:after="20"/>
+            </w:pPr>
+            <w:r>
+              <w:rPr>
+                <w:sz w:val="17"/>
+              </w:rPr>
+              <w:t>ZIP 中真实包含 DOCX/PDF，字段缺失有业务状态</w:t>
+            </w:r>
+          </w:p>
+        </w:tc>
+      </w:tr>
+      <w:tr>
+        <w:trPr>
+          <w:cantSplit/>
+        </w:trPr>
+        <w:tc>
+          <w:tcPr>
+            <w:tcW w:type="dxa" w:w="2088"/>
+            <w:vAlign w:val="center"/>
+          </w:tcPr>
+          <w:p>
+            <w:pPr>
+              <w:spacing w:before="0" w:after="20"/>
+            </w:pPr>
+            <w:r>
+              <w:rPr>
+                <w:sz w:val="17"/>
+              </w:rPr>
+              <w:t>VerificationAttachment</w:t>
+            </w:r>
+          </w:p>
+        </w:tc>
+        <w:tc>
+          <w:tcPr>
+            <w:tcW w:type="dxa" w:w="1800"/>
+            <w:vAlign w:val="center"/>
+          </w:tcPr>
+          <w:p>
+            <w:pPr>
+              <w:spacing w:before="0" w:after="20"/>
+            </w:pPr>
+            <w:r>
+              <w:rPr>
+                <w:sz w:val="17"/>
+              </w:rPr>
+              <w:t>carbon_verification</w:t>
+            </w:r>
+          </w:p>
+        </w:tc>
+        <w:tc>
+          <w:tcPr>
+            <w:tcW w:type="dxa" w:w="2952"/>
+            <w:vAlign w:val="center"/>
+          </w:tcPr>
+          <w:p>
+            <w:pPr>
+              <w:spacing w:before="0" w:after="20"/>
+            </w:pPr>
+            <w:r>
+              <w:rPr>
+                <w:sz w:val="17"/>
+              </w:rPr>
+              <w:t>管理凭证原件、来源对象、文件类型、哈希、OCR/备注和版本</w:t>
+            </w:r>
+          </w:p>
+        </w:tc>
+        <w:tc>
+          <w:tcPr>
+            <w:tcW w:type="dxa" w:w="2520"/>
+            <w:vAlign w:val="center"/>
+          </w:tcPr>
+          <w:p>
+            <w:pPr>
+              <w:spacing w:before="0" w:after="20"/>
+            </w:pPr>
+            <w:r>
+              <w:rPr>
+                <w:sz w:val="17"/>
+              </w:rPr>
+              <w:t>材料包能打包原件，缺失凭证可追踪到记录</w:t>
+            </w:r>
+          </w:p>
+        </w:tc>
+      </w:tr>
+      <w:tr>
+        <w:trPr>
+          <w:cantSplit/>
+        </w:trPr>
+        <w:tc>
+          <w:tcPr>
+            <w:tcW w:type="dxa" w:w="2088"/>
+            <w:vAlign w:val="center"/>
+          </w:tcPr>
+          <w:p>
+            <w:pPr>
+              <w:spacing w:before="0" w:after="20"/>
+            </w:pPr>
+            <w:r>
+              <w:rPr>
+                <w:sz w:val="17"/>
+              </w:rPr>
+              <w:t>VerificationFinding</w:t>
+            </w:r>
+          </w:p>
+        </w:tc>
+        <w:tc>
+          <w:tcPr>
+            <w:tcW w:type="dxa" w:w="1800"/>
+            <w:vAlign w:val="center"/>
+          </w:tcPr>
+          <w:p>
+            <w:pPr>
+              <w:spacing w:before="0" w:after="20"/>
+            </w:pPr>
+            <w:r>
+              <w:rPr>
+                <w:sz w:val="17"/>
+              </w:rPr>
+              <w:t>carbon_verification</w:t>
+            </w:r>
+          </w:p>
+        </w:tc>
+        <w:tc>
+          <w:tcPr>
+            <w:tcW w:type="dxa" w:w="2952"/>
+            <w:vAlign w:val="center"/>
+          </w:tcPr>
+          <w:p>
+            <w:pPr>
+              <w:spacing w:before="0" w:after="20"/>
+            </w:pPr>
+            <w:r>
+              <w:rPr>
+                <w:sz w:val="17"/>
+              </w:rPr>
+              <w:t>承载文件评审、现场核查、不符合项、整改和关闭状态</w:t>
+            </w:r>
+          </w:p>
+        </w:tc>
+        <w:tc>
+          <w:tcPr>
+            <w:tcW w:type="dxa" w:w="2520"/>
+            <w:vAlign w:val="center"/>
+          </w:tcPr>
+          <w:p>
+            <w:pPr>
+              <w:spacing w:before="0" w:after="20"/>
+            </w:pPr>
+            <w:r>
+              <w:rPr>
+                <w:sz w:val="17"/>
+              </w:rPr>
+              <w:t>问题从自动规则升级为可关闭的核查发现</w:t>
+            </w:r>
+          </w:p>
+        </w:tc>
+      </w:tr>
+      <w:tr>
+        <w:trPr>
+          <w:cantSplit/>
+        </w:trPr>
+        <w:tc>
+          <w:tcPr>
+            <w:tcW w:type="dxa" w:w="2088"/>
+            <w:vAlign w:val="center"/>
+          </w:tcPr>
+          <w:p>
+            <w:pPr>
+              <w:spacing w:before="0" w:after="20"/>
+            </w:pPr>
+            <w:r>
+              <w:rPr>
+                <w:sz w:val="17"/>
+              </w:rPr>
+              <w:t>MaterialPackageAssembler</w:t>
+            </w:r>
+          </w:p>
+        </w:tc>
+        <w:tc>
+          <w:tcPr>
+            <w:tcW w:type="dxa" w:w="1800"/>
+            <w:vAlign w:val="center"/>
+          </w:tcPr>
+          <w:p>
+            <w:pPr>
+              <w:spacing w:before="0" w:after="20"/>
+            </w:pPr>
+            <w:r>
+              <w:rPr>
+                <w:sz w:val="17"/>
+              </w:rPr>
+              <w:t>carbon_verification.usecases</w:t>
+            </w:r>
+          </w:p>
+        </w:tc>
+        <w:tc>
+          <w:tcPr>
+            <w:tcW w:type="dxa" w:w="2952"/>
+            <w:vAlign w:val="center"/>
+          </w:tcPr>
+          <w:p>
+            <w:pPr>
+              <w:spacing w:before="0" w:after="20"/>
+            </w:pPr>
+            <w:r>
+              <w:rPr>
+                <w:sz w:val="17"/>
+              </w:rPr>
+              <w:t>汇集报告、数据表、附件、问题、审核轨迹并写入导出清单</w:t>
+            </w:r>
+          </w:p>
+        </w:tc>
+        <w:tc>
+          <w:tcPr>
+            <w:tcW w:type="dxa" w:w="2520"/>
+            <w:vAlign w:val="center"/>
+          </w:tcPr>
+          <w:p>
+            <w:pPr>
+              <w:spacing w:before="0" w:after="20"/>
+            </w:pPr>
+            <w:r>
+              <w:rPr>
+                <w:sz w:val="17"/>
+              </w:rPr>
+              <w:t>导出任务可重试、可下载、可校验</w:t>
+            </w:r>
+          </w:p>
+        </w:tc>
+      </w:tr>
+      <w:tr>
+        <w:trPr>
+          <w:cantSplit/>
+        </w:trPr>
+        <w:tc>
+          <w:tcPr>
+            <w:tcW w:type="dxa" w:w="2088"/>
+            <w:vAlign w:val="center"/>
+          </w:tcPr>
+          <w:p>
+            <w:pPr>
+              <w:spacing w:before="0" w:after="20"/>
+            </w:pPr>
+            <w:r>
+              <w:rPr>
+                <w:sz w:val="17"/>
+              </w:rPr>
+              <w:t>InventorySnapshotReader</w:t>
+            </w:r>
+          </w:p>
+        </w:tc>
+        <w:tc>
+          <w:tcPr>
+            <w:tcW w:type="dxa" w:w="1800"/>
+            <w:vAlign w:val="center"/>
+          </w:tcPr>
+          <w:p>
+            <w:pPr>
+              <w:spacing w:before="0" w:after="20"/>
+            </w:pPr>
+            <w:r>
+              <w:rPr>
+                <w:sz w:val="17"/>
+              </w:rPr>
+              <w:t>carbon_verification.queries</w:t>
+            </w:r>
+          </w:p>
+        </w:tc>
+        <w:tc>
+          <w:tcPr>
+            <w:tcW w:type="dxa" w:w="2952"/>
+            <w:vAlign w:val="center"/>
+          </w:tcPr>
+          <w:p>
+            <w:pPr>
+              <w:spacing w:before="0" w:after="20"/>
+            </w:pPr>
+            <w:r>
+              <w:rPr>
+                <w:sz w:val="17"/>
+              </w:rPr>
+              <w:t>优先读取已锁定组织排放清单，兼容旧 Scope 活动记录</w:t>
+            </w:r>
+          </w:p>
+        </w:tc>
+        <w:tc>
+          <w:tcPr>
+            <w:tcW w:type="dxa" w:w="2520"/>
+            <w:vAlign w:val="center"/>
+          </w:tcPr>
+          <w:p>
+            <w:pPr>
+              <w:spacing w:before="0" w:after="20"/>
+            </w:pPr>
+            <w:r>
+              <w:rPr>
+                <w:sz w:val="17"/>
+              </w:rPr>
+              <w:t>正式导出不再绕过边界版本和清单锁定</w:t>
+            </w:r>
+          </w:p>
+        </w:tc>
+      </w:tr>
+    </w:tbl>
+    <w:p/>
+    <w:sectPr>
+      <w:footerReference w:type="default" r:id="rId11"/>
+    </w:sectPr>
   </w:body>
 </w:document>
 </file>
@@ -13317,6 +15865,19 @@
         <w:sz w:val="18"/>
       </w:rPr>
       <w:t>模板用途：组织碳盘查、报告生成、核查支撑材料导出</w:t>
+    </w:r>
+  </w:p>
+</w:ftr>
+</file>
+
+<file path=word/footer2.xml><?xml version="1.0" encoding="utf-8"?>
+<w:ftr xmlns:m="http://schemas.openxmlformats.org/officeDocument/2006/math" xmlns:mc="http://schemas.openxmlformats.org/markup-compatibility/2006" xmlns:mo="http://schemas.microsoft.com/office/mac/office/2008/main" xmlns:mv="urn:schemas-microsoft-com:mac:vml" xmlns:o="urn:schemas-microsoft-com:office:office" xmlns:r="http://schemas.openxmlformats.org/officeDocument/2006/relationships" xmlns:v="urn:schemas-microsoft-com:vml" xmlns:w10="urn:schemas-microsoft-com:office:word" xmlns:w14="http://schemas.microsoft.com/office/word/2010/wordml" xmlns:w="http://schemas.openxmlformats.org/wordprocessingml/2006/main" xmlns:wne="http://schemas.microsoft.com/office/word/2006/wordml" xmlns:wp14="http://schemas.microsoft.com/office/word/2010/wordprocessingDrawing" xmlns:wp="http://schemas.openxmlformats.org/drawingml/2006/wordprocessingDrawing" xmlns:wpc="http://schemas.microsoft.com/office/word/2010/wordprocessingCanvas" xmlns:wpg="http://schemas.microsoft.com/office/word/2010/wordprocessingGroup" xmlns:wpi="http://schemas.microsoft.com/office/word/2010/wordprocessingInk" xmlns:wps="http://schemas.microsoft.com/office/word/2010/wordprocessingShape" mc:Ignorable="w14 wp14">
+  <w:p>
+    <w:pPr>
+      <w:pStyle w:val="Footer"/>
+    </w:pPr>
+    <w:r>
+      <w:t>工业企业温室气体排放盘查报告与核查材料包通用模板 | v2026.06.13 | 组织碳盘查导出设计</w:t>
     </w:r>
   </w:p>
 </w:ftr>

</xml_diff>

<commit_message>
docs: polish organization carbon report template
</commit_message>
<xml_diff>
--- a/docs/评价方案/templates/工业企业温室气体排放盘查报告与核查材料包通用模板.docx
+++ b/docs/评价方案/templates/工业企业温室气体排放盘查报告与核查材料包通用模板.docx
@@ -47,6 +47,9 @@
         <w:gridCol w:w="6960"/>
       </w:tblGrid>
       <w:tr>
+        <w:trPr>
+          <w:cantSplit/>
+        </w:trPr>
         <w:tc>
           <w:tcPr>
             <w:tcW w:type="dxa" w:w="2400"/>
@@ -103,6 +106,9 @@
         </w:tc>
       </w:tr>
       <w:tr>
+        <w:trPr>
+          <w:cantSplit/>
+        </w:trPr>
         <w:tc>
           <w:tcPr>
             <w:tcW w:type="dxa" w:w="2400"/>
@@ -143,6 +149,9 @@
         </w:tc>
       </w:tr>
       <w:tr>
+        <w:trPr>
+          <w:cantSplit/>
+        </w:trPr>
         <w:tc>
           <w:tcPr>
             <w:tcW w:type="dxa" w:w="2400"/>
@@ -183,6 +192,9 @@
         </w:tc>
       </w:tr>
       <w:tr>
+        <w:trPr>
+          <w:cantSplit/>
+        </w:trPr>
         <w:tc>
           <w:tcPr>
             <w:tcW w:type="dxa" w:w="2400"/>
@@ -223,6 +235,9 @@
         </w:tc>
       </w:tr>
       <w:tr>
+        <w:trPr>
+          <w:cantSplit/>
+        </w:trPr>
         <w:tc>
           <w:tcPr>
             <w:tcW w:type="dxa" w:w="2400"/>
@@ -263,6 +278,9 @@
         </w:tc>
       </w:tr>
       <w:tr>
+        <w:trPr>
+          <w:cantSplit/>
+        </w:trPr>
         <w:tc>
           <w:tcPr>
             <w:tcW w:type="dxa" w:w="2400"/>
@@ -303,6 +321,9 @@
         </w:tc>
       </w:tr>
       <w:tr>
+        <w:trPr>
+          <w:cantSplit/>
+        </w:trPr>
         <w:tc>
           <w:tcPr>
             <w:tcW w:type="dxa" w:w="2400"/>
@@ -361,6 +382,9 @@
         <w:gridCol w:w="9360"/>
       </w:tblGrid>
       <w:tr>
+        <w:trPr>
+          <w:cantSplit/>
+        </w:trPr>
         <w:tc>
           <w:tcPr>
             <w:tcW w:type="dxa" w:w="9360"/>
@@ -473,6 +497,9 @@
         <w:gridCol w:w="4160"/>
       </w:tblGrid>
       <w:tr>
+        <w:trPr>
+          <w:cantSplit/>
+        </w:trPr>
         <w:tc>
           <w:tcPr>
             <w:tcW w:type="dxa" w:w="2600"/>
@@ -556,6 +583,9 @@
         </w:tc>
       </w:tr>
       <w:tr>
+        <w:trPr>
+          <w:cantSplit/>
+        </w:trPr>
         <w:tc>
           <w:tcPr>
             <w:tcW w:type="dxa" w:w="2600"/>
@@ -615,6 +645,9 @@
         </w:tc>
       </w:tr>
       <w:tr>
+        <w:trPr>
+          <w:cantSplit/>
+        </w:trPr>
         <w:tc>
           <w:tcPr>
             <w:tcW w:type="dxa" w:w="2600"/>
@@ -674,6 +707,9 @@
         </w:tc>
       </w:tr>
       <w:tr>
+        <w:trPr>
+          <w:cantSplit/>
+        </w:trPr>
         <w:tc>
           <w:tcPr>
             <w:tcW w:type="dxa" w:w="2600"/>
@@ -733,6 +769,9 @@
         </w:tc>
       </w:tr>
       <w:tr>
+        <w:trPr>
+          <w:cantSplit/>
+        </w:trPr>
         <w:tc>
           <w:tcPr>
             <w:tcW w:type="dxa" w:w="2600"/>
@@ -845,6 +884,9 @@
         <w:gridCol w:w="6960"/>
       </w:tblGrid>
       <w:tr>
+        <w:trPr>
+          <w:cantSplit/>
+        </w:trPr>
         <w:tc>
           <w:tcPr>
             <w:tcW w:type="dxa" w:w="2400"/>
@@ -901,6 +943,9 @@
         </w:tc>
       </w:tr>
       <w:tr>
+        <w:trPr>
+          <w:cantSplit/>
+        </w:trPr>
         <w:tc>
           <w:tcPr>
             <w:tcW w:type="dxa" w:w="2400"/>
@@ -941,6 +986,9 @@
         </w:tc>
       </w:tr>
       <w:tr>
+        <w:trPr>
+          <w:cantSplit/>
+        </w:trPr>
         <w:tc>
           <w:tcPr>
             <w:tcW w:type="dxa" w:w="2400"/>
@@ -981,6 +1029,9 @@
         </w:tc>
       </w:tr>
       <w:tr>
+        <w:trPr>
+          <w:cantSplit/>
+        </w:trPr>
         <w:tc>
           <w:tcPr>
             <w:tcW w:type="dxa" w:w="2400"/>
@@ -1059,6 +1110,9 @@
         <w:gridCol w:w="6960"/>
       </w:tblGrid>
       <w:tr>
+        <w:trPr>
+          <w:cantSplit/>
+        </w:trPr>
         <w:tc>
           <w:tcPr>
             <w:tcW w:type="dxa" w:w="2400"/>
@@ -1115,6 +1169,9 @@
         </w:tc>
       </w:tr>
       <w:tr>
+        <w:trPr>
+          <w:cantSplit/>
+        </w:trPr>
         <w:tc>
           <w:tcPr>
             <w:tcW w:type="dxa" w:w="2400"/>
@@ -1155,6 +1212,9 @@
         </w:tc>
       </w:tr>
       <w:tr>
+        <w:trPr>
+          <w:cantSplit/>
+        </w:trPr>
         <w:tc>
           <w:tcPr>
             <w:tcW w:type="dxa" w:w="2400"/>
@@ -1195,6 +1255,9 @@
         </w:tc>
       </w:tr>
       <w:tr>
+        <w:trPr>
+          <w:cantSplit/>
+        </w:trPr>
         <w:tc>
           <w:tcPr>
             <w:tcW w:type="dxa" w:w="2400"/>
@@ -1235,6 +1298,9 @@
         </w:tc>
       </w:tr>
       <w:tr>
+        <w:trPr>
+          <w:cantSplit/>
+        </w:trPr>
         <w:tc>
           <w:tcPr>
             <w:tcW w:type="dxa" w:w="2400"/>
@@ -1275,6 +1341,9 @@
         </w:tc>
       </w:tr>
       <w:tr>
+        <w:trPr>
+          <w:cantSplit/>
+        </w:trPr>
         <w:tc>
           <w:tcPr>
             <w:tcW w:type="dxa" w:w="2400"/>
@@ -1315,6 +1384,9 @@
         </w:tc>
       </w:tr>
       <w:tr>
+        <w:trPr>
+          <w:cantSplit/>
+        </w:trPr>
         <w:tc>
           <w:tcPr>
             <w:tcW w:type="dxa" w:w="2400"/>
@@ -1355,6 +1427,9 @@
         </w:tc>
       </w:tr>
       <w:tr>
+        <w:trPr>
+          <w:cantSplit/>
+        </w:trPr>
         <w:tc>
           <w:tcPr>
             <w:tcW w:type="dxa" w:w="2400"/>
@@ -1395,6 +1470,9 @@
         </w:tc>
       </w:tr>
       <w:tr>
+        <w:trPr>
+          <w:cantSplit/>
+        </w:trPr>
         <w:tc>
           <w:tcPr>
             <w:tcW w:type="dxa" w:w="2400"/>
@@ -1435,6 +1513,9 @@
         </w:tc>
       </w:tr>
       <w:tr>
+        <w:trPr>
+          <w:cantSplit/>
+        </w:trPr>
         <w:tc>
           <w:tcPr>
             <w:tcW w:type="dxa" w:w="2400"/>
@@ -1475,6 +1556,9 @@
         </w:tc>
       </w:tr>
       <w:tr>
+        <w:trPr>
+          <w:cantSplit/>
+        </w:trPr>
         <w:tc>
           <w:tcPr>
             <w:tcW w:type="dxa" w:w="2400"/>
@@ -1553,6 +1637,9 @@
         <w:gridCol w:w="6960"/>
       </w:tblGrid>
       <w:tr>
+        <w:trPr>
+          <w:cantSplit/>
+        </w:trPr>
         <w:tc>
           <w:tcPr>
             <w:tcW w:type="dxa" w:w="2400"/>
@@ -1609,6 +1696,9 @@
         </w:tc>
       </w:tr>
       <w:tr>
+        <w:trPr>
+          <w:cantSplit/>
+        </w:trPr>
         <w:tc>
           <w:tcPr>
             <w:tcW w:type="dxa" w:w="2400"/>
@@ -1649,6 +1739,9 @@
         </w:tc>
       </w:tr>
       <w:tr>
+        <w:trPr>
+          <w:cantSplit/>
+        </w:trPr>
         <w:tc>
           <w:tcPr>
             <w:tcW w:type="dxa" w:w="2400"/>
@@ -1689,6 +1782,9 @@
         </w:tc>
       </w:tr>
       <w:tr>
+        <w:trPr>
+          <w:cantSplit/>
+        </w:trPr>
         <w:tc>
           <w:tcPr>
             <w:tcW w:type="dxa" w:w="2400"/>
@@ -1729,6 +1825,9 @@
         </w:tc>
       </w:tr>
       <w:tr>
+        <w:trPr>
+          <w:cantSplit/>
+        </w:trPr>
         <w:tc>
           <w:tcPr>
             <w:tcW w:type="dxa" w:w="2400"/>
@@ -1769,6 +1868,9 @@
         </w:tc>
       </w:tr>
       <w:tr>
+        <w:trPr>
+          <w:cantSplit/>
+        </w:trPr>
         <w:tc>
           <w:tcPr>
             <w:tcW w:type="dxa" w:w="2400"/>
@@ -1809,6 +1911,9 @@
         </w:tc>
       </w:tr>
       <w:tr>
+        <w:trPr>
+          <w:cantSplit/>
+        </w:trPr>
         <w:tc>
           <w:tcPr>
             <w:tcW w:type="dxa" w:w="2400"/>
@@ -1871,6 +1976,9 @@
         <w:gridCol w:w="2860"/>
       </w:tblGrid>
       <w:tr>
+        <w:trPr>
+          <w:cantSplit/>
+        </w:trPr>
         <w:tc>
           <w:tcPr>
             <w:tcW w:type="dxa" w:w="1800"/>
@@ -2008,6 +2116,9 @@
         </w:tc>
       </w:tr>
       <w:tr>
+        <w:trPr>
+          <w:cantSplit/>
+        </w:trPr>
         <w:tc>
           <w:tcPr>
             <w:tcW w:type="dxa" w:w="1800"/>
@@ -2105,6 +2216,9 @@
         </w:tc>
       </w:tr>
       <w:tr>
+        <w:trPr>
+          <w:cantSplit/>
+        </w:trPr>
         <w:tc>
           <w:tcPr>
             <w:tcW w:type="dxa" w:w="1800"/>
@@ -2202,6 +2316,9 @@
         </w:tc>
       </w:tr>
       <w:tr>
+        <w:trPr>
+          <w:cantSplit/>
+        </w:trPr>
         <w:tc>
           <w:tcPr>
             <w:tcW w:type="dxa" w:w="1800"/>
@@ -2299,6 +2416,9 @@
         </w:tc>
       </w:tr>
       <w:tr>
+        <w:trPr>
+          <w:cantSplit/>
+        </w:trPr>
         <w:tc>
           <w:tcPr>
             <w:tcW w:type="dxa" w:w="1800"/>
@@ -2396,6 +2516,9 @@
         </w:tc>
       </w:tr>
       <w:tr>
+        <w:trPr>
+          <w:cantSplit/>
+        </w:trPr>
         <w:tc>
           <w:tcPr>
             <w:tcW w:type="dxa" w:w="1800"/>
@@ -2493,6 +2616,9 @@
         </w:tc>
       </w:tr>
       <w:tr>
+        <w:trPr>
+          <w:cantSplit/>
+        </w:trPr>
         <w:tc>
           <w:tcPr>
             <w:tcW w:type="dxa" w:w="1800"/>
@@ -2590,6 +2716,9 @@
         </w:tc>
       </w:tr>
       <w:tr>
+        <w:trPr>
+          <w:cantSplit/>
+        </w:trPr>
         <w:tc>
           <w:tcPr>
             <w:tcW w:type="dxa" w:w="1800"/>
@@ -2728,6 +2857,9 @@
         <w:gridCol w:w="2760"/>
       </w:tblGrid>
       <w:tr>
+        <w:trPr>
+          <w:cantSplit/>
+        </w:trPr>
         <w:tc>
           <w:tcPr>
             <w:tcW w:type="dxa" w:w="2700"/>
@@ -2865,6 +2997,9 @@
         </w:tc>
       </w:tr>
       <w:tr>
+        <w:trPr>
+          <w:cantSplit/>
+        </w:trPr>
         <w:tc>
           <w:tcPr>
             <w:tcW w:type="dxa" w:w="2700"/>
@@ -2962,6 +3097,9 @@
         </w:tc>
       </w:tr>
       <w:tr>
+        <w:trPr>
+          <w:cantSplit/>
+        </w:trPr>
         <w:tc>
           <w:tcPr>
             <w:tcW w:type="dxa" w:w="2700"/>
@@ -3059,6 +3197,9 @@
         </w:tc>
       </w:tr>
       <w:tr>
+        <w:trPr>
+          <w:cantSplit/>
+        </w:trPr>
         <w:tc>
           <w:tcPr>
             <w:tcW w:type="dxa" w:w="2700"/>
@@ -3156,6 +3297,9 @@
         </w:tc>
       </w:tr>
       <w:tr>
+        <w:trPr>
+          <w:cantSplit/>
+        </w:trPr>
         <w:tc>
           <w:tcPr>
             <w:tcW w:type="dxa" w:w="2700"/>
@@ -3253,6 +3397,9 @@
         </w:tc>
       </w:tr>
       <w:tr>
+        <w:trPr>
+          <w:cantSplit/>
+        </w:trPr>
         <w:tc>
           <w:tcPr>
             <w:tcW w:type="dxa" w:w="2700"/>
@@ -3350,6 +3497,9 @@
         </w:tc>
       </w:tr>
       <w:tr>
+        <w:trPr>
+          <w:cantSplit/>
+        </w:trPr>
         <w:tc>
           <w:tcPr>
             <w:tcW w:type="dxa" w:w="2700"/>
@@ -3447,6 +3597,9 @@
         </w:tc>
       </w:tr>
       <w:tr>
+        <w:trPr>
+          <w:cantSplit/>
+        </w:trPr>
         <w:tc>
           <w:tcPr>
             <w:tcW w:type="dxa" w:w="2700"/>
@@ -3544,6 +3697,9 @@
         </w:tc>
       </w:tr>
       <w:tr>
+        <w:trPr>
+          <w:cantSplit/>
+        </w:trPr>
         <w:tc>
           <w:tcPr>
             <w:tcW w:type="dxa" w:w="2700"/>
@@ -3641,6 +3797,9 @@
         </w:tc>
       </w:tr>
       <w:tr>
+        <w:trPr>
+          <w:cantSplit/>
+        </w:trPr>
         <w:tc>
           <w:tcPr>
             <w:tcW w:type="dxa" w:w="2700"/>
@@ -3738,6 +3897,9 @@
         </w:tc>
       </w:tr>
       <w:tr>
+        <w:trPr>
+          <w:cantSplit/>
+        </w:trPr>
         <w:tc>
           <w:tcPr>
             <w:tcW w:type="dxa" w:w="2700"/>
@@ -3835,6 +3997,9 @@
         </w:tc>
       </w:tr>
       <w:tr>
+        <w:trPr>
+          <w:cantSplit/>
+        </w:trPr>
         <w:tc>
           <w:tcPr>
             <w:tcW w:type="dxa" w:w="2700"/>
@@ -3931,6 +4096,9 @@
         </w:tc>
       </w:tr>
       <w:tr>
+        <w:trPr>
+          <w:cantSplit/>
+        </w:trPr>
         <w:tc>
           <w:tcPr>
             <w:tcW w:type="dxa" w:w="2700"/>
@@ -4069,6 +4237,9 @@
         <w:gridCol w:w="1260"/>
       </w:tblGrid>
       <w:tr>
+        <w:trPr>
+          <w:cantSplit/>
+        </w:trPr>
         <w:tc>
           <w:tcPr>
             <w:tcW w:type="dxa" w:w="1600"/>
@@ -4233,6 +4404,9 @@
         </w:tc>
       </w:tr>
       <w:tr>
+        <w:trPr>
+          <w:cantSplit/>
+        </w:trPr>
         <w:tc>
           <w:tcPr>
             <w:tcW w:type="dxa" w:w="1600"/>
@@ -4349,6 +4523,9 @@
         </w:tc>
       </w:tr>
       <w:tr>
+        <w:trPr>
+          <w:cantSplit/>
+        </w:trPr>
         <w:tc>
           <w:tcPr>
             <w:tcW w:type="dxa" w:w="1600"/>
@@ -4465,6 +4642,9 @@
         </w:tc>
       </w:tr>
       <w:tr>
+        <w:trPr>
+          <w:cantSplit/>
+        </w:trPr>
         <w:tc>
           <w:tcPr>
             <w:tcW w:type="dxa" w:w="1600"/>
@@ -4623,6 +4803,9 @@
         <w:gridCol w:w="1510"/>
       </w:tblGrid>
       <w:tr>
+        <w:trPr>
+          <w:cantSplit/>
+        </w:trPr>
         <w:tc>
           <w:tcPr>
             <w:tcW w:type="dxa" w:w="1600"/>
@@ -4787,6 +4970,9 @@
         </w:tc>
       </w:tr>
       <w:tr>
+        <w:trPr>
+          <w:cantSplit/>
+        </w:trPr>
         <w:tc>
           <w:tcPr>
             <w:tcW w:type="dxa" w:w="1600"/>
@@ -4903,6 +5089,9 @@
         </w:tc>
       </w:tr>
       <w:tr>
+        <w:trPr>
+          <w:cantSplit/>
+        </w:trPr>
         <w:tc>
           <w:tcPr>
             <w:tcW w:type="dxa" w:w="1600"/>
@@ -5019,6 +5208,9 @@
         </w:tc>
       </w:tr>
       <w:tr>
+        <w:trPr>
+          <w:cantSplit/>
+        </w:trPr>
         <w:tc>
           <w:tcPr>
             <w:tcW w:type="dxa" w:w="1600"/>
@@ -5175,6 +5367,9 @@
         <w:gridCol w:w="1860"/>
       </w:tblGrid>
       <w:tr>
+        <w:trPr>
+          <w:cantSplit/>
+        </w:trPr>
         <w:tc>
           <w:tcPr>
             <w:tcW w:type="dxa" w:w="2300"/>
@@ -5285,6 +5480,9 @@
         </w:tc>
       </w:tr>
       <w:tr>
+        <w:trPr>
+          <w:cantSplit/>
+        </w:trPr>
         <w:tc>
           <w:tcPr>
             <w:tcW w:type="dxa" w:w="2300"/>
@@ -5363,6 +5561,9 @@
         </w:tc>
       </w:tr>
       <w:tr>
+        <w:trPr>
+          <w:cantSplit/>
+        </w:trPr>
         <w:tc>
           <w:tcPr>
             <w:tcW w:type="dxa" w:w="2300"/>
@@ -5441,6 +5642,9 @@
         </w:tc>
       </w:tr>
       <w:tr>
+        <w:trPr>
+          <w:cantSplit/>
+        </w:trPr>
         <w:tc>
           <w:tcPr>
             <w:tcW w:type="dxa" w:w="2300"/>
@@ -5519,6 +5723,9 @@
         </w:tc>
       </w:tr>
       <w:tr>
+        <w:trPr>
+          <w:cantSplit/>
+        </w:trPr>
         <w:tc>
           <w:tcPr>
             <w:tcW w:type="dxa" w:w="2300"/>
@@ -5597,6 +5804,9 @@
         </w:tc>
       </w:tr>
       <w:tr>
+        <w:trPr>
+          <w:cantSplit/>
+        </w:trPr>
         <w:tc>
           <w:tcPr>
             <w:tcW w:type="dxa" w:w="2300"/>
@@ -5702,6 +5912,7 @@
     <w:p>
       <w:pPr>
         <w:pStyle w:val="Heading1"/>
+        <w:keepNext/>
       </w:pPr>
       <w:r>
         <w:rPr>
@@ -5724,6 +5935,9 @@
         <w:gridCol w:w="6960"/>
       </w:tblGrid>
       <w:tr>
+        <w:trPr>
+          <w:cantSplit/>
+        </w:trPr>
         <w:tc>
           <w:tcPr>
             <w:tcW w:type="dxa" w:w="2400"/>
@@ -5780,6 +5994,9 @@
         </w:tc>
       </w:tr>
       <w:tr>
+        <w:trPr>
+          <w:cantSplit/>
+        </w:trPr>
         <w:tc>
           <w:tcPr>
             <w:tcW w:type="dxa" w:w="2400"/>
@@ -5820,6 +6037,9 @@
         </w:tc>
       </w:tr>
       <w:tr>
+        <w:trPr>
+          <w:cantSplit/>
+        </w:trPr>
         <w:tc>
           <w:tcPr>
             <w:tcW w:type="dxa" w:w="2400"/>
@@ -5860,6 +6080,9 @@
         </w:tc>
       </w:tr>
       <w:tr>
+        <w:trPr>
+          <w:cantSplit/>
+        </w:trPr>
         <w:tc>
           <w:tcPr>
             <w:tcW w:type="dxa" w:w="2400"/>
@@ -5900,6 +6123,9 @@
         </w:tc>
       </w:tr>
       <w:tr>
+        <w:trPr>
+          <w:cantSplit/>
+        </w:trPr>
         <w:tc>
           <w:tcPr>
             <w:tcW w:type="dxa" w:w="2400"/>
@@ -5940,6 +6166,9 @@
         </w:tc>
       </w:tr>
       <w:tr>
+        <w:trPr>
+          <w:cantSplit/>
+        </w:trPr>
         <w:tc>
           <w:tcPr>
             <w:tcW w:type="dxa" w:w="2400"/>
@@ -5980,6 +6209,9 @@
         </w:tc>
       </w:tr>
       <w:tr>
+        <w:trPr>
+          <w:cantSplit/>
+        </w:trPr>
         <w:tc>
           <w:tcPr>
             <w:tcW w:type="dxa" w:w="2400"/>
@@ -6020,6 +6252,9 @@
         </w:tc>
       </w:tr>
       <w:tr>
+        <w:trPr>
+          <w:cantSplit/>
+        </w:trPr>
         <w:tc>
           <w:tcPr>
             <w:tcW w:type="dxa" w:w="2400"/>
@@ -6060,6 +6295,9 @@
         </w:tc>
       </w:tr>
       <w:tr>
+        <w:trPr>
+          <w:cantSplit/>
+        </w:trPr>
         <w:tc>
           <w:tcPr>
             <w:tcW w:type="dxa" w:w="2400"/>
@@ -6100,6 +6338,9 @@
         </w:tc>
       </w:tr>
       <w:tr>
+        <w:trPr>
+          <w:cantSplit/>
+        </w:trPr>
         <w:tc>
           <w:tcPr>
             <w:tcW w:type="dxa" w:w="2400"/>
@@ -6140,6 +6381,9 @@
         </w:tc>
       </w:tr>
       <w:tr>
+        <w:trPr>
+          <w:cantSplit/>
+        </w:trPr>
         <w:tc>
           <w:tcPr>
             <w:tcW w:type="dxa" w:w="2400"/>
@@ -6180,6 +6424,9 @@
         </w:tc>
       </w:tr>
       <w:tr>
+        <w:trPr>
+          <w:cantSplit/>
+        </w:trPr>
         <w:tc>
           <w:tcPr>
             <w:tcW w:type="dxa" w:w="2400"/>
@@ -6220,6 +6467,9 @@
         </w:tc>
       </w:tr>
       <w:tr>
+        <w:trPr>
+          <w:cantSplit/>
+        </w:trPr>
         <w:tc>
           <w:tcPr>
             <w:tcW w:type="dxa" w:w="2400"/>
@@ -6260,6 +6510,9 @@
         </w:tc>
       </w:tr>
       <w:tr>
+        <w:trPr>
+          <w:cantSplit/>
+        </w:trPr>
         <w:tc>
           <w:tcPr>
             <w:tcW w:type="dxa" w:w="2400"/>
@@ -6300,6 +6553,9 @@
         </w:tc>
       </w:tr>
       <w:tr>
+        <w:trPr>
+          <w:cantSplit/>
+        </w:trPr>
         <w:tc>
           <w:tcPr>
             <w:tcW w:type="dxa" w:w="2400"/>
@@ -6348,6 +6604,8 @@
     <w:p>
       <w:pPr>
         <w:pStyle w:val="Heading1"/>
+        <w:keepNext/>
+        <w:pageBreakBefore/>
       </w:pPr>
       <w:r>
         <w:rPr>
@@ -6376,6 +6634,9 @@
         <w:gridCol w:w="610"/>
       </w:tblGrid>
       <w:tr>
+        <w:trPr>
+          <w:cantSplit/>
+        </w:trPr>
         <w:tc>
           <w:tcPr>
             <w:tcW w:type="dxa" w:w="1450"/>
@@ -6594,6 +6855,9 @@
         </w:tc>
       </w:tr>
       <w:tr>
+        <w:trPr>
+          <w:cantSplit/>
+        </w:trPr>
         <w:tc>
           <w:tcPr>
             <w:tcW w:type="dxa" w:w="1450"/>
@@ -6748,6 +7012,9 @@
         </w:tc>
       </w:tr>
       <w:tr>
+        <w:trPr>
+          <w:cantSplit/>
+        </w:trPr>
         <w:tc>
           <w:tcPr>
             <w:tcW w:type="dxa" w:w="1450"/>
@@ -6902,6 +7169,9 @@
         </w:tc>
       </w:tr>
       <w:tr>
+        <w:trPr>
+          <w:cantSplit/>
+        </w:trPr>
         <w:tc>
           <w:tcPr>
             <w:tcW w:type="dxa" w:w="1450"/>
@@ -7064,6 +7334,7 @@
     <w:p>
       <w:pPr>
         <w:pStyle w:val="Heading1"/>
+        <w:keepNext/>
       </w:pPr>
       <w:r>
         <w:rPr>
@@ -7091,6 +7362,9 @@
         <w:gridCol w:w="1910"/>
       </w:tblGrid>
       <w:tr>
+        <w:trPr>
+          <w:cantSplit/>
+        </w:trPr>
         <w:tc>
           <w:tcPr>
             <w:tcW w:type="dxa" w:w="1450"/>
@@ -7282,6 +7556,9 @@
         </w:tc>
       </w:tr>
       <w:tr>
+        <w:trPr>
+          <w:cantSplit/>
+        </w:trPr>
         <w:tc>
           <w:tcPr>
             <w:tcW w:type="dxa" w:w="1450"/>
@@ -7417,6 +7694,9 @@
         </w:tc>
       </w:tr>
       <w:tr>
+        <w:trPr>
+          <w:cantSplit/>
+        </w:trPr>
         <w:tc>
           <w:tcPr>
             <w:tcW w:type="dxa" w:w="1450"/>
@@ -7552,6 +7832,9 @@
         </w:tc>
       </w:tr>
       <w:tr>
+        <w:trPr>
+          <w:cantSplit/>
+        </w:trPr>
         <w:tc>
           <w:tcPr>
             <w:tcW w:type="dxa" w:w="1450"/>
@@ -7695,6 +7978,7 @@
     <w:p>
       <w:pPr>
         <w:pStyle w:val="Heading1"/>
+        <w:keepNext/>
       </w:pPr>
       <w:r>
         <w:rPr>
@@ -7721,6 +8005,9 @@
         <w:gridCol w:w="2510"/>
       </w:tblGrid>
       <w:tr>
+        <w:trPr>
+          <w:cantSplit/>
+        </w:trPr>
         <w:tc>
           <w:tcPr>
             <w:tcW w:type="dxa" w:w="1450"/>
@@ -7885,6 +8172,9 @@
         </w:tc>
       </w:tr>
       <w:tr>
+        <w:trPr>
+          <w:cantSplit/>
+        </w:trPr>
         <w:tc>
           <w:tcPr>
             <w:tcW w:type="dxa" w:w="1450"/>
@@ -8001,6 +8291,9 @@
         </w:tc>
       </w:tr>
       <w:tr>
+        <w:trPr>
+          <w:cantSplit/>
+        </w:trPr>
         <w:tc>
           <w:tcPr>
             <w:tcW w:type="dxa" w:w="1450"/>
@@ -8117,6 +8410,9 @@
         </w:tc>
       </w:tr>
       <w:tr>
+        <w:trPr>
+          <w:cantSplit/>
+        </w:trPr>
         <w:tc>
           <w:tcPr>
             <w:tcW w:type="dxa" w:w="1450"/>
@@ -8241,6 +8537,7 @@
     <w:p>
       <w:pPr>
         <w:pStyle w:val="Heading1"/>
+        <w:keepNext/>
       </w:pPr>
       <w:r>
         <w:rPr>
@@ -8269,6 +8566,9 @@
         <w:gridCol w:w="1510"/>
       </w:tblGrid>
       <w:tr>
+        <w:trPr>
+          <w:cantSplit/>
+        </w:trPr>
         <w:tc>
           <w:tcPr>
             <w:tcW w:type="dxa" w:w="950"/>
@@ -8487,6 +8787,9 @@
         </w:tc>
       </w:tr>
       <w:tr>
+        <w:trPr>
+          <w:cantSplit/>
+        </w:trPr>
         <w:tc>
           <w:tcPr>
             <w:tcW w:type="dxa" w:w="950"/>
@@ -8641,6 +8944,9 @@
         </w:tc>
       </w:tr>
       <w:tr>
+        <w:trPr>
+          <w:cantSplit/>
+        </w:trPr>
         <w:tc>
           <w:tcPr>
             <w:tcW w:type="dxa" w:w="950"/>
@@ -8795,6 +9101,9 @@
         </w:tc>
       </w:tr>
       <w:tr>
+        <w:trPr>
+          <w:cantSplit/>
+        </w:trPr>
         <w:tc>
           <w:tcPr>
             <w:tcW w:type="dxa" w:w="950"/>
@@ -8949,6 +9258,9 @@
         </w:tc>
       </w:tr>
       <w:tr>
+        <w:trPr>
+          <w:cantSplit/>
+        </w:trPr>
         <w:tc>
           <w:tcPr>
             <w:tcW w:type="dxa" w:w="950"/>
@@ -9111,6 +9423,7 @@
     <w:p>
       <w:pPr>
         <w:pStyle w:val="Heading1"/>
+        <w:keepNext/>
       </w:pPr>
       <w:r>
         <w:rPr>
@@ -9138,6 +9451,9 @@
         <w:gridCol w:w="960"/>
       </w:tblGrid>
       <w:tr>
+        <w:trPr>
+          <w:cantSplit/>
+        </w:trPr>
         <w:tc>
           <w:tcPr>
             <w:tcW w:type="dxa" w:w="1100"/>
@@ -9329,6 +9645,9 @@
         </w:tc>
       </w:tr>
       <w:tr>
+        <w:trPr>
+          <w:cantSplit/>
+        </w:trPr>
         <w:tc>
           <w:tcPr>
             <w:tcW w:type="dxa" w:w="1100"/>
@@ -9464,6 +9783,9 @@
         </w:tc>
       </w:tr>
       <w:tr>
+        <w:trPr>
+          <w:cantSplit/>
+        </w:trPr>
         <w:tc>
           <w:tcPr>
             <w:tcW w:type="dxa" w:w="1100"/>
@@ -9599,6 +9921,9 @@
         </w:tc>
       </w:tr>
       <w:tr>
+        <w:trPr>
+          <w:cantSplit/>
+        </w:trPr>
         <w:tc>
           <w:tcPr>
             <w:tcW w:type="dxa" w:w="1100"/>
@@ -9742,6 +10067,7 @@
     <w:p>
       <w:pPr>
         <w:pStyle w:val="Heading1"/>
+        <w:keepNext/>
       </w:pPr>
       <w:r>
         <w:rPr>
@@ -9775,6 +10101,9 @@
         <w:gridCol w:w="1160"/>
       </w:tblGrid>
       <w:tr>
+        <w:trPr>
+          <w:cantSplit/>
+        </w:trPr>
         <w:tc>
           <w:tcPr>
             <w:tcW w:type="dxa" w:w="1200"/>
@@ -9912,6 +10241,9 @@
         </w:tc>
       </w:tr>
       <w:tr>
+        <w:trPr>
+          <w:cantSplit/>
+        </w:trPr>
         <w:tc>
           <w:tcPr>
             <w:tcW w:type="dxa" w:w="1200"/>
@@ -10009,6 +10341,9 @@
         </w:tc>
       </w:tr>
       <w:tr>
+        <w:trPr>
+          <w:cantSplit/>
+        </w:trPr>
         <w:tc>
           <w:tcPr>
             <w:tcW w:type="dxa" w:w="1200"/>
@@ -10106,6 +10441,9 @@
         </w:tc>
       </w:tr>
       <w:tr>
+        <w:trPr>
+          <w:cantSplit/>
+        </w:trPr>
         <w:tc>
           <w:tcPr>
             <w:tcW w:type="dxa" w:w="1200"/>
@@ -10203,6 +10541,9 @@
         </w:tc>
       </w:tr>
       <w:tr>
+        <w:trPr>
+          <w:cantSplit/>
+        </w:trPr>
         <w:tc>
           <w:tcPr>
             <w:tcW w:type="dxa" w:w="1200"/>
@@ -10300,6 +10641,9 @@
         </w:tc>
       </w:tr>
       <w:tr>
+        <w:trPr>
+          <w:cantSplit/>
+        </w:trPr>
         <w:tc>
           <w:tcPr>
             <w:tcW w:type="dxa" w:w="1200"/>
@@ -10397,6 +10741,9 @@
         </w:tc>
       </w:tr>
       <w:tr>
+        <w:trPr>
+          <w:cantSplit/>
+        </w:trPr>
         <w:tc>
           <w:tcPr>
             <w:tcW w:type="dxa" w:w="1200"/>
@@ -10494,6 +10841,9 @@
         </w:tc>
       </w:tr>
       <w:tr>
+        <w:trPr>
+          <w:cantSplit/>
+        </w:trPr>
         <w:tc>
           <w:tcPr>
             <w:tcW w:type="dxa" w:w="1200"/>
@@ -10591,6 +10941,9 @@
         </w:tc>
       </w:tr>
       <w:tr>
+        <w:trPr>
+          <w:cantSplit/>
+        </w:trPr>
         <w:tc>
           <w:tcPr>
             <w:tcW w:type="dxa" w:w="1200"/>
@@ -10696,6 +11049,7 @@
     <w:p>
       <w:pPr>
         <w:pStyle w:val="Heading1"/>
+        <w:keepNext/>
       </w:pPr>
       <w:r>
         <w:rPr>
@@ -10721,6 +11075,9 @@
         <w:gridCol w:w="1460"/>
       </w:tblGrid>
       <w:tr>
+        <w:trPr>
+          <w:cantSplit/>
+        </w:trPr>
         <w:tc>
           <w:tcPr>
             <w:tcW w:type="dxa" w:w="1500"/>
@@ -10858,6 +11215,9 @@
         </w:tc>
       </w:tr>
       <w:tr>
+        <w:trPr>
+          <w:cantSplit/>
+        </w:trPr>
         <w:tc>
           <w:tcPr>
             <w:tcW w:type="dxa" w:w="1500"/>
@@ -10955,6 +11315,9 @@
         </w:tc>
       </w:tr>
       <w:tr>
+        <w:trPr>
+          <w:cantSplit/>
+        </w:trPr>
         <w:tc>
           <w:tcPr>
             <w:tcW w:type="dxa" w:w="1500"/>
@@ -11052,6 +11415,9 @@
         </w:tc>
       </w:tr>
       <w:tr>
+        <w:trPr>
+          <w:cantSplit/>
+        </w:trPr>
         <w:tc>
           <w:tcPr>
             <w:tcW w:type="dxa" w:w="1500"/>
@@ -11149,6 +11515,9 @@
         </w:tc>
       </w:tr>
       <w:tr>
+        <w:trPr>
+          <w:cantSplit/>
+        </w:trPr>
         <w:tc>
           <w:tcPr>
             <w:tcW w:type="dxa" w:w="1500"/>
@@ -11246,6 +11615,9 @@
         </w:tc>
       </w:tr>
       <w:tr>
+        <w:trPr>
+          <w:cantSplit/>
+        </w:trPr>
         <w:tc>
           <w:tcPr>
             <w:tcW w:type="dxa" w:w="1500"/>
@@ -11343,6 +11715,9 @@
         </w:tc>
       </w:tr>
       <w:tr>
+        <w:trPr>
+          <w:cantSplit/>
+        </w:trPr>
         <w:tc>
           <w:tcPr>
             <w:tcW w:type="dxa" w:w="1500"/>
@@ -11448,6 +11823,7 @@
     <w:p>
       <w:pPr>
         <w:pStyle w:val="Heading1"/>
+        <w:keepNext/>
       </w:pPr>
       <w:r>
         <w:rPr>
@@ -11473,6 +11849,9 @@
         <w:gridCol w:w="1460"/>
       </w:tblGrid>
       <w:tr>
+        <w:trPr>
+          <w:cantSplit/>
+        </w:trPr>
         <w:tc>
           <w:tcPr>
             <w:tcW w:type="dxa" w:w="1500"/>
@@ -11610,6 +11989,9 @@
         </w:tc>
       </w:tr>
       <w:tr>
+        <w:trPr>
+          <w:cantSplit/>
+        </w:trPr>
         <w:tc>
           <w:tcPr>
             <w:tcW w:type="dxa" w:w="1500"/>
@@ -11707,6 +12089,9 @@
         </w:tc>
       </w:tr>
       <w:tr>
+        <w:trPr>
+          <w:cantSplit/>
+        </w:trPr>
         <w:tc>
           <w:tcPr>
             <w:tcW w:type="dxa" w:w="1500"/>
@@ -11804,6 +12189,9 @@
         </w:tc>
       </w:tr>
       <w:tr>
+        <w:trPr>
+          <w:cantSplit/>
+        </w:trPr>
         <w:tc>
           <w:tcPr>
             <w:tcW w:type="dxa" w:w="1500"/>
@@ -11901,6 +12289,9 @@
         </w:tc>
       </w:tr>
       <w:tr>
+        <w:trPr>
+          <w:cantSplit/>
+        </w:trPr>
         <w:tc>
           <w:tcPr>
             <w:tcW w:type="dxa" w:w="1500"/>
@@ -11998,6 +12389,9 @@
         </w:tc>
       </w:tr>
       <w:tr>
+        <w:trPr>
+          <w:cantSplit/>
+        </w:trPr>
         <w:tc>
           <w:tcPr>
             <w:tcW w:type="dxa" w:w="1500"/>
@@ -12103,6 +12497,7 @@
     <w:p>
       <w:pPr>
         <w:pStyle w:val="Heading1"/>
+        <w:keepNext/>
       </w:pPr>
       <w:r>
         <w:rPr>
@@ -12129,6 +12524,9 @@
         <w:gridCol w:w="860"/>
       </w:tblGrid>
       <w:tr>
+        <w:trPr>
+          <w:cantSplit/>
+        </w:trPr>
         <w:tc>
           <w:tcPr>
             <w:tcW w:type="dxa" w:w="1000"/>
@@ -12293,6 +12691,9 @@
         </w:tc>
       </w:tr>
       <w:tr>
+        <w:trPr>
+          <w:cantSplit/>
+        </w:trPr>
         <w:tc>
           <w:tcPr>
             <w:tcW w:type="dxa" w:w="1000"/>
@@ -12409,6 +12810,9 @@
         </w:tc>
       </w:tr>
       <w:tr>
+        <w:trPr>
+          <w:cantSplit/>
+        </w:trPr>
         <w:tc>
           <w:tcPr>
             <w:tcW w:type="dxa" w:w="1000"/>
@@ -12533,6 +12937,7 @@
     <w:p>
       <w:pPr>
         <w:pStyle w:val="Heading1"/>
+        <w:keepNext/>
       </w:pPr>
       <w:r>
         <w:rPr>
@@ -12557,6 +12962,9 @@
         <w:gridCol w:w="2560"/>
       </w:tblGrid>
       <w:tr>
+        <w:trPr>
+          <w:cantSplit/>
+        </w:trPr>
         <w:tc>
           <w:tcPr>
             <w:tcW w:type="dxa" w:w="1600"/>
@@ -12667,6 +13075,9 @@
         </w:tc>
       </w:tr>
       <w:tr>
+        <w:trPr>
+          <w:cantSplit/>
+        </w:trPr>
         <w:tc>
           <w:tcPr>
             <w:tcW w:type="dxa" w:w="1600"/>
@@ -12745,6 +13156,9 @@
         </w:tc>
       </w:tr>
       <w:tr>
+        <w:trPr>
+          <w:cantSplit/>
+        </w:trPr>
         <w:tc>
           <w:tcPr>
             <w:tcW w:type="dxa" w:w="1600"/>
@@ -12823,6 +13237,9 @@
         </w:tc>
       </w:tr>
       <w:tr>
+        <w:trPr>
+          <w:cantSplit/>
+        </w:trPr>
         <w:tc>
           <w:tcPr>
             <w:tcW w:type="dxa" w:w="1600"/>
@@ -12901,6 +13318,9 @@
         </w:tc>
       </w:tr>
       <w:tr>
+        <w:trPr>
+          <w:cantSplit/>
+        </w:trPr>
         <w:tc>
           <w:tcPr>
             <w:tcW w:type="dxa" w:w="1600"/>
@@ -12970,6 +13390,9 @@
         </w:tc>
       </w:tr>
       <w:tr>
+        <w:trPr>
+          <w:cantSplit/>
+        </w:trPr>
         <w:tc>
           <w:tcPr>
             <w:tcW w:type="dxa" w:w="1600"/>
@@ -13030,6 +13453,9 @@
         </w:tc>
       </w:tr>
       <w:tr>
+        <w:trPr>
+          <w:cantSplit/>
+        </w:trPr>
         <w:tc>
           <w:tcPr>
             <w:tcW w:type="dxa" w:w="1600"/>
@@ -13090,6 +13516,9 @@
         </w:tc>
       </w:tr>
       <w:tr>
+        <w:trPr>
+          <w:cantSplit/>
+        </w:trPr>
         <w:tc>
           <w:tcPr>
             <w:tcW w:type="dxa" w:w="1600"/>

</xml_diff>

<commit_message>
docs: tighten carbon verification template fields
</commit_message>
<xml_diff>
--- a/docs/评价方案/templates/工业企业温室气体排放盘查报告与核查材料包通用模板.docx
+++ b/docs/评价方案/templates/工业企业温室气体排放盘查报告与核查材料包通用模板.docx
@@ -452,7 +452,7 @@
         <w:rPr>
           <w:rFonts w:ascii="Calibri" w:hAnsi="Calibri" w:eastAsia="Microsoft YaHei"/>
         </w:rPr>
-        <w:t>文档中的 {{变量名}} 为系统导出占位符；带“可选”的附表由企业实际排放源决定，未发生时应写明“不适用”及原因。</w:t>
+        <w:t>文档中的 双花括号字段名 为系统导出占位符；带“可选”的附表由企业实际排放源决定，未发生时应写明“不适用”及原因。</w:t>
       </w:r>
     </w:p>
     <w:p>
@@ -3934,7 +3934,7 @@
                 <w:b w:val="0"/>
                 <w:sz w:val="17"/>
               </w:rPr>
-              <w:t>{{ 结果 }}</w:t>
+              <w:t>{{ calculation_result }}</w:t>
             </w:r>
           </w:p>
         </w:tc>
@@ -3953,7 +3953,7 @@
                 <w:b w:val="0"/>
                 <w:sz w:val="17"/>
               </w:rPr>
-              <w:t>{{ 单位 }}</w:t>
+              <w:t>{{ unit }}</w:t>
             </w:r>
           </w:p>
         </w:tc>
@@ -4422,7 +4422,7 @@
                 <w:b w:val="0"/>
                 <w:sz w:val="17"/>
               </w:rPr>
-              <w:t>{{ 数据项 }}</w:t>
+              <w:t>{{ activity_name }}</w:t>
             </w:r>
           </w:p>
         </w:tc>
@@ -4517,7 +4517,7 @@
                 <w:b w:val="0"/>
                 <w:sz w:val="17"/>
               </w:rPr>
-              <w:t>{{ 证据 }}</w:t>
+              <w:t>{{ evidence_id }}</w:t>
             </w:r>
           </w:p>
         </w:tc>
@@ -4541,7 +4541,7 @@
                 <w:b w:val="0"/>
                 <w:sz w:val="17"/>
               </w:rPr>
-              <w:t>{{ 数据项 }}</w:t>
+              <w:t>{{ activity_name }}</w:t>
             </w:r>
           </w:p>
         </w:tc>
@@ -4636,7 +4636,7 @@
                 <w:b w:val="0"/>
                 <w:sz w:val="17"/>
               </w:rPr>
-              <w:t>{{ 证据 }}</w:t>
+              <w:t>{{ evidence_id }}</w:t>
             </w:r>
           </w:p>
         </w:tc>
@@ -4660,7 +4660,7 @@
                 <w:b w:val="0"/>
                 <w:sz w:val="17"/>
               </w:rPr>
-              <w:t>{{ 数据项 }}</w:t>
+              <w:t>{{ activity_name }}</w:t>
             </w:r>
           </w:p>
         </w:tc>
@@ -4755,7 +4755,7 @@
                 <w:b w:val="0"/>
                 <w:sz w:val="17"/>
               </w:rPr>
-              <w:t>{{ 证据 }}</w:t>
+              <w:t>{{ evidence_id }}</w:t>
             </w:r>
           </w:p>
         </w:tc>
@@ -5007,7 +5007,7 @@
                 <w:b w:val="0"/>
                 <w:sz w:val="17"/>
               </w:rPr>
-              <w:t>{{ 数据项 }}</w:t>
+              <w:t>{{ activity_name }}</w:t>
             </w:r>
           </w:p>
         </w:tc>
@@ -5126,7 +5126,7 @@
                 <w:b w:val="0"/>
                 <w:sz w:val="17"/>
               </w:rPr>
-              <w:t>{{ 数据项 }}</w:t>
+              <w:t>{{ activity_name }}</w:t>
             </w:r>
           </w:p>
         </w:tc>
@@ -5245,7 +5245,7 @@
                 <w:b w:val="0"/>
                 <w:sz w:val="17"/>
               </w:rPr>
-              <w:t>{{ 数据项 }}</w:t>
+              <w:t>{{ activity_name }}</w:t>
             </w:r>
           </w:p>
         </w:tc>
@@ -5555,7 +5555,7 @@
                 <w:b w:val="0"/>
                 <w:sz w:val="19"/>
               </w:rPr>
-              <w:t>{{ 证据 }}</w:t>
+              <w:t>{{ evidence_id }}</w:t>
             </w:r>
           </w:p>
         </w:tc>
@@ -5636,7 +5636,7 @@
                 <w:b w:val="0"/>
                 <w:sz w:val="19"/>
               </w:rPr>
-              <w:t>{{ 证据 }}</w:t>
+              <w:t>{{ evidence_id }}</w:t>
             </w:r>
           </w:p>
         </w:tc>
@@ -5717,7 +5717,7 @@
                 <w:b w:val="0"/>
                 <w:sz w:val="19"/>
               </w:rPr>
-              <w:t>{{ 证据 }}</w:t>
+              <w:t>{{ evidence_id }}</w:t>
             </w:r>
           </w:p>
         </w:tc>
@@ -5798,7 +5798,7 @@
                 <w:b w:val="0"/>
                 <w:sz w:val="19"/>
               </w:rPr>
-              <w:t>{{ 证据 }}</w:t>
+              <w:t>{{ evidence_id }}</w:t>
             </w:r>
           </w:p>
         </w:tc>
@@ -5879,7 +5879,7 @@
                 <w:b w:val="0"/>
                 <w:sz w:val="19"/>
               </w:rPr>
-              <w:t>{{ 证据 }}</w:t>
+              <w:t>{{ evidence_id }}</w:t>
             </w:r>
           </w:p>
         </w:tc>
@@ -6873,7 +6873,7 @@
                 <w:b w:val="0"/>
                 <w:sz w:val="17"/>
               </w:rPr>
-              <w:t>{{ 类别 }}</w:t>
+              <w:t>{{ source_category }}</w:t>
             </w:r>
           </w:p>
         </w:tc>
@@ -6892,7 +6892,7 @@
                 <w:b w:val="0"/>
                 <w:sz w:val="17"/>
               </w:rPr>
-              <w:t>{{ 数据项 }}</w:t>
+              <w:t>{{ activity_name }}</w:t>
             </w:r>
           </w:p>
         </w:tc>
@@ -6911,7 +6911,7 @@
                 <w:b w:val="0"/>
                 <w:sz w:val="17"/>
               </w:rPr>
-              <w:t>{{ 设施 }}</w:t>
+              <w:t>{{ facility_name }}</w:t>
             </w:r>
           </w:p>
         </w:tc>
@@ -6930,7 +6930,7 @@
                 <w:b w:val="0"/>
                 <w:sz w:val="17"/>
               </w:rPr>
-              <w:t>{{ 期间 }}</w:t>
+              <w:t>{{ activity_period }}</w:t>
             </w:r>
           </w:p>
         </w:tc>
@@ -6949,7 +6949,7 @@
                 <w:b w:val="0"/>
                 <w:sz w:val="17"/>
               </w:rPr>
-              <w:t>{{ 数值 }}</w:t>
+              <w:t>{{ activity_amount }}</w:t>
             </w:r>
           </w:p>
         </w:tc>
@@ -6968,7 +6968,7 @@
                 <w:b w:val="0"/>
                 <w:sz w:val="17"/>
               </w:rPr>
-              <w:t>{{ 单位 }}</w:t>
+              <w:t>{{ unit }}</w:t>
             </w:r>
           </w:p>
         </w:tc>
@@ -6987,7 +6987,7 @@
                 <w:b w:val="0"/>
                 <w:sz w:val="17"/>
               </w:rPr>
-              <w:t>{{ 来源 }}</w:t>
+              <w:t>{{ source_name }}</w:t>
             </w:r>
           </w:p>
         </w:tc>
@@ -7006,7 +7006,7 @@
                 <w:b w:val="0"/>
                 <w:sz w:val="17"/>
               </w:rPr>
-              <w:t>{{ 证据 }}</w:t>
+              <w:t>{{ evidence_id }}</w:t>
             </w:r>
           </w:p>
         </w:tc>
@@ -7030,7 +7030,7 @@
                 <w:b w:val="0"/>
                 <w:sz w:val="17"/>
               </w:rPr>
-              <w:t>{{ 类别 }}</w:t>
+              <w:t>{{ source_category }}</w:t>
             </w:r>
           </w:p>
         </w:tc>
@@ -7049,7 +7049,7 @@
                 <w:b w:val="0"/>
                 <w:sz w:val="17"/>
               </w:rPr>
-              <w:t>{{ 数据项 }}</w:t>
+              <w:t>{{ activity_name }}</w:t>
             </w:r>
           </w:p>
         </w:tc>
@@ -7068,7 +7068,7 @@
                 <w:b w:val="0"/>
                 <w:sz w:val="17"/>
               </w:rPr>
-              <w:t>{{ 设施 }}</w:t>
+              <w:t>{{ facility_name }}</w:t>
             </w:r>
           </w:p>
         </w:tc>
@@ -7087,7 +7087,7 @@
                 <w:b w:val="0"/>
                 <w:sz w:val="17"/>
               </w:rPr>
-              <w:t>{{ 期间 }}</w:t>
+              <w:t>{{ activity_period }}</w:t>
             </w:r>
           </w:p>
         </w:tc>
@@ -7106,7 +7106,7 @@
                 <w:b w:val="0"/>
                 <w:sz w:val="17"/>
               </w:rPr>
-              <w:t>{{ 数值 }}</w:t>
+              <w:t>{{ activity_amount }}</w:t>
             </w:r>
           </w:p>
         </w:tc>
@@ -7125,7 +7125,7 @@
                 <w:b w:val="0"/>
                 <w:sz w:val="17"/>
               </w:rPr>
-              <w:t>{{ 单位 }}</w:t>
+              <w:t>{{ unit }}</w:t>
             </w:r>
           </w:p>
         </w:tc>
@@ -7144,7 +7144,7 @@
                 <w:b w:val="0"/>
                 <w:sz w:val="17"/>
               </w:rPr>
-              <w:t>{{ 来源 }}</w:t>
+              <w:t>{{ source_name }}</w:t>
             </w:r>
           </w:p>
         </w:tc>
@@ -7163,7 +7163,7 @@
                 <w:b w:val="0"/>
                 <w:sz w:val="17"/>
               </w:rPr>
-              <w:t>{{ 证据 }}</w:t>
+              <w:t>{{ evidence_id }}</w:t>
             </w:r>
           </w:p>
         </w:tc>
@@ -7187,7 +7187,7 @@
                 <w:b w:val="0"/>
                 <w:sz w:val="17"/>
               </w:rPr>
-              <w:t>{{ 类别 }}</w:t>
+              <w:t>{{ source_category }}</w:t>
             </w:r>
           </w:p>
         </w:tc>
@@ -7206,7 +7206,7 @@
                 <w:b w:val="0"/>
                 <w:sz w:val="17"/>
               </w:rPr>
-              <w:t>{{ 数据项 }}</w:t>
+              <w:t>{{ activity_name }}</w:t>
             </w:r>
           </w:p>
         </w:tc>
@@ -7225,7 +7225,7 @@
                 <w:b w:val="0"/>
                 <w:sz w:val="17"/>
               </w:rPr>
-              <w:t>{{ 设施 }}</w:t>
+              <w:t>{{ facility_name }}</w:t>
             </w:r>
           </w:p>
         </w:tc>
@@ -7244,7 +7244,7 @@
                 <w:b w:val="0"/>
                 <w:sz w:val="17"/>
               </w:rPr>
-              <w:t>{{ 期间 }}</w:t>
+              <w:t>{{ activity_period }}</w:t>
             </w:r>
           </w:p>
         </w:tc>
@@ -7263,7 +7263,7 @@
                 <w:b w:val="0"/>
                 <w:sz w:val="17"/>
               </w:rPr>
-              <w:t>{{ 数值 }}</w:t>
+              <w:t>{{ activity_amount }}</w:t>
             </w:r>
           </w:p>
         </w:tc>
@@ -7282,7 +7282,7 @@
                 <w:b w:val="0"/>
                 <w:sz w:val="17"/>
               </w:rPr>
-              <w:t>{{ 单位 }}</w:t>
+              <w:t>{{ unit }}</w:t>
             </w:r>
           </w:p>
         </w:tc>
@@ -7301,7 +7301,7 @@
                 <w:b w:val="0"/>
                 <w:sz w:val="17"/>
               </w:rPr>
-              <w:t>{{ 来源 }}</w:t>
+              <w:t>{{ source_name }}</w:t>
             </w:r>
           </w:p>
         </w:tc>
@@ -7320,7 +7320,7 @@
                 <w:b w:val="0"/>
                 <w:sz w:val="17"/>
               </w:rPr>
-              <w:t>{{ 证据 }}</w:t>
+              <w:t>{{ evidence_id }}</w:t>
             </w:r>
           </w:p>
         </w:tc>
@@ -7593,7 +7593,7 @@
                 <w:b w:val="0"/>
                 <w:sz w:val="17"/>
               </w:rPr>
-              <w:t>{{ 数值 }}</w:t>
+              <w:t>{{ activity_amount }}</w:t>
             </w:r>
           </w:p>
         </w:tc>
@@ -7612,7 +7612,7 @@
                 <w:b w:val="0"/>
                 <w:sz w:val="17"/>
               </w:rPr>
-              <w:t>{{ 单位 }}</w:t>
+              <w:t>{{ unit }}</w:t>
             </w:r>
           </w:p>
         </w:tc>
@@ -7631,7 +7631,7 @@
                 <w:b w:val="0"/>
                 <w:sz w:val="17"/>
               </w:rPr>
-              <w:t>{{ 低热值 }}</w:t>
+              <w:t>{{ low_heat_value }}</w:t>
             </w:r>
           </w:p>
         </w:tc>
@@ -7650,7 +7650,7 @@
                 <w:b w:val="0"/>
                 <w:sz w:val="17"/>
               </w:rPr>
-              <w:t>{{ 含碳量 }}</w:t>
+              <w:t>{{ carbon_content }}</w:t>
             </w:r>
           </w:p>
         </w:tc>
@@ -7669,7 +7669,7 @@
                 <w:b w:val="0"/>
                 <w:sz w:val="17"/>
               </w:rPr>
-              <w:t>{{ 氧化率 }}</w:t>
+              <w:t>{{ oxidation_rate }}</w:t>
             </w:r>
           </w:p>
         </w:tc>
@@ -7688,7 +7688,7 @@
                 <w:b w:val="0"/>
                 <w:sz w:val="17"/>
               </w:rPr>
-              <w:t>{{ 来源 }}</w:t>
+              <w:t>{{ source_name }}</w:t>
             </w:r>
           </w:p>
         </w:tc>
@@ -7731,7 +7731,7 @@
                 <w:b w:val="0"/>
                 <w:sz w:val="17"/>
               </w:rPr>
-              <w:t>{{ 数值 }}</w:t>
+              <w:t>{{ activity_amount }}</w:t>
             </w:r>
           </w:p>
         </w:tc>
@@ -7750,7 +7750,7 @@
                 <w:b w:val="0"/>
                 <w:sz w:val="17"/>
               </w:rPr>
-              <w:t>{{ 单位 }}</w:t>
+              <w:t>{{ unit }}</w:t>
             </w:r>
           </w:p>
         </w:tc>
@@ -7769,7 +7769,7 @@
                 <w:b w:val="0"/>
                 <w:sz w:val="17"/>
               </w:rPr>
-              <w:t>{{ 低热值 }}</w:t>
+              <w:t>{{ low_heat_value }}</w:t>
             </w:r>
           </w:p>
         </w:tc>
@@ -7788,7 +7788,7 @@
                 <w:b w:val="0"/>
                 <w:sz w:val="17"/>
               </w:rPr>
-              <w:t>{{ 含碳量 }}</w:t>
+              <w:t>{{ carbon_content }}</w:t>
             </w:r>
           </w:p>
         </w:tc>
@@ -7807,7 +7807,7 @@
                 <w:b w:val="0"/>
                 <w:sz w:val="17"/>
               </w:rPr>
-              <w:t>{{ 氧化率 }}</w:t>
+              <w:t>{{ oxidation_rate }}</w:t>
             </w:r>
           </w:p>
         </w:tc>
@@ -7826,7 +7826,7 @@
                 <w:b w:val="0"/>
                 <w:sz w:val="17"/>
               </w:rPr>
-              <w:t>{{ 来源 }}</w:t>
+              <w:t>{{ source_name }}</w:t>
             </w:r>
           </w:p>
         </w:tc>
@@ -7869,7 +7869,7 @@
                 <w:b w:val="0"/>
                 <w:sz w:val="17"/>
               </w:rPr>
-              <w:t>{{ 数值 }}</w:t>
+              <w:t>{{ activity_amount }}</w:t>
             </w:r>
           </w:p>
         </w:tc>
@@ -7888,7 +7888,7 @@
                 <w:b w:val="0"/>
                 <w:sz w:val="17"/>
               </w:rPr>
-              <w:t>{{ 单位 }}</w:t>
+              <w:t>{{ unit }}</w:t>
             </w:r>
           </w:p>
         </w:tc>
@@ -7907,7 +7907,7 @@
                 <w:b w:val="0"/>
                 <w:sz w:val="17"/>
               </w:rPr>
-              <w:t>{{ 低热值 }}</w:t>
+              <w:t>{{ low_heat_value }}</w:t>
             </w:r>
           </w:p>
         </w:tc>
@@ -7926,7 +7926,7 @@
                 <w:b w:val="0"/>
                 <w:sz w:val="17"/>
               </w:rPr>
-              <w:t>{{ 含碳量 }}</w:t>
+              <w:t>{{ carbon_content }}</w:t>
             </w:r>
           </w:p>
         </w:tc>
@@ -7945,7 +7945,7 @@
                 <w:b w:val="0"/>
                 <w:sz w:val="17"/>
               </w:rPr>
-              <w:t>{{ 氧化率 }}</w:t>
+              <w:t>{{ oxidation_rate }}</w:t>
             </w:r>
           </w:p>
         </w:tc>
@@ -7964,7 +7964,7 @@
                 <w:b w:val="0"/>
                 <w:sz w:val="17"/>
               </w:rPr>
-              <w:t>{{ 来源 }}</w:t>
+              <w:t>{{ source_name }}</w:t>
             </w:r>
           </w:p>
         </w:tc>
@@ -8209,7 +8209,7 @@
                 <w:b w:val="0"/>
                 <w:sz w:val="17"/>
               </w:rPr>
-              <w:t>{{ 数据项 }}</w:t>
+              <w:t>{{ activity_name }}</w:t>
             </w:r>
           </w:p>
         </w:tc>
@@ -8228,7 +8228,7 @@
                 <w:b w:val="0"/>
                 <w:sz w:val="17"/>
               </w:rPr>
-              <w:t>{{ 数值 }} {{ 单位 }}</w:t>
+              <w:t>{{ activity_amount }} {{ unit }}</w:t>
             </w:r>
           </w:p>
         </w:tc>
@@ -8247,7 +8247,7 @@
                 <w:b w:val="0"/>
                 <w:sz w:val="17"/>
               </w:rPr>
-              <w:t>{{ 因子 }}</w:t>
+              <w:t>{{ emission_factor }}</w:t>
             </w:r>
           </w:p>
         </w:tc>
@@ -8266,7 +8266,7 @@
                 <w:b w:val="0"/>
                 <w:sz w:val="17"/>
               </w:rPr>
-              <w:t>{{ 结果 }}</w:t>
+              <w:t>{{ calculation_result }}</w:t>
             </w:r>
           </w:p>
         </w:tc>
@@ -8285,7 +8285,7 @@
                 <w:b w:val="0"/>
                 <w:sz w:val="17"/>
               </w:rPr>
-              <w:t>{{ 说明 }}</w:t>
+              <w:t>{{ note }}</w:t>
             </w:r>
           </w:p>
         </w:tc>
@@ -8328,7 +8328,7 @@
                 <w:b w:val="0"/>
                 <w:sz w:val="17"/>
               </w:rPr>
-              <w:t>{{ 数据项 }}</w:t>
+              <w:t>{{ activity_name }}</w:t>
             </w:r>
           </w:p>
         </w:tc>
@@ -8347,7 +8347,7 @@
                 <w:b w:val="0"/>
                 <w:sz w:val="17"/>
               </w:rPr>
-              <w:t>{{ 数值 }} {{ 单位 }}</w:t>
+              <w:t>{{ activity_amount }} {{ unit }}</w:t>
             </w:r>
           </w:p>
         </w:tc>
@@ -8366,7 +8366,7 @@
                 <w:b w:val="0"/>
                 <w:sz w:val="17"/>
               </w:rPr>
-              <w:t>{{ 因子 }}</w:t>
+              <w:t>{{ emission_factor }}</w:t>
             </w:r>
           </w:p>
         </w:tc>
@@ -8385,7 +8385,7 @@
                 <w:b w:val="0"/>
                 <w:sz w:val="17"/>
               </w:rPr>
-              <w:t>{{ 结果 }}</w:t>
+              <w:t>{{ calculation_result }}</w:t>
             </w:r>
           </w:p>
         </w:tc>
@@ -8404,7 +8404,7 @@
                 <w:b w:val="0"/>
                 <w:sz w:val="17"/>
               </w:rPr>
-              <w:t>{{ 说明 }}</w:t>
+              <w:t>{{ note }}</w:t>
             </w:r>
           </w:p>
         </w:tc>
@@ -8447,7 +8447,7 @@
                 <w:b w:val="0"/>
                 <w:sz w:val="17"/>
               </w:rPr>
-              <w:t>{{ 数据项 }}</w:t>
+              <w:t>{{ activity_name }}</w:t>
             </w:r>
           </w:p>
         </w:tc>
@@ -8466,7 +8466,7 @@
                 <w:b w:val="0"/>
                 <w:sz w:val="17"/>
               </w:rPr>
-              <w:t>{{ 数值 }} {{ 单位 }}</w:t>
+              <w:t>{{ activity_amount }} {{ unit }}</w:t>
             </w:r>
           </w:p>
         </w:tc>
@@ -8485,7 +8485,7 @@
                 <w:b w:val="0"/>
                 <w:sz w:val="17"/>
               </w:rPr>
-              <w:t>{{ 因子 }}</w:t>
+              <w:t>{{ emission_factor }}</w:t>
             </w:r>
           </w:p>
         </w:tc>
@@ -8504,7 +8504,7 @@
                 <w:b w:val="0"/>
                 <w:sz w:val="17"/>
               </w:rPr>
-              <w:t>{{ 结果 }}</w:t>
+              <w:t>{{ calculation_result }}</w:t>
             </w:r>
           </w:p>
         </w:tc>
@@ -8523,7 +8523,7 @@
                 <w:b w:val="0"/>
                 <w:sz w:val="17"/>
               </w:rPr>
-              <w:t>{{ 说明 }}</w:t>
+              <w:t>{{ note }}</w:t>
             </w:r>
           </w:p>
         </w:tc>
@@ -8824,7 +8824,7 @@
                 <w:b w:val="0"/>
                 <w:sz w:val="17"/>
               </w:rPr>
-              <w:t>{{ 购入 }}</w:t>
+              <w:t>{{ purchased_amount }}</w:t>
             </w:r>
           </w:p>
         </w:tc>
@@ -8843,7 +8843,7 @@
                 <w:b w:val="0"/>
                 <w:sz w:val="17"/>
               </w:rPr>
-              <w:t>{{ 外供 }}</w:t>
+              <w:t>{{ exported_amount }}</w:t>
             </w:r>
           </w:p>
         </w:tc>
@@ -8862,7 +8862,7 @@
                 <w:b w:val="0"/>
                 <w:sz w:val="17"/>
               </w:rPr>
-              <w:t>{{ 净购入 }}</w:t>
+              <w:t>{{ net_purchased_amount }}</w:t>
             </w:r>
           </w:p>
         </w:tc>
@@ -8900,7 +8900,7 @@
                 <w:b w:val="0"/>
                 <w:sz w:val="17"/>
               </w:rPr>
-              <w:t>{{ 因子 }}</w:t>
+              <w:t>{{ emission_factor }}</w:t>
             </w:r>
           </w:p>
         </w:tc>
@@ -8919,7 +8919,7 @@
                 <w:b w:val="0"/>
                 <w:sz w:val="17"/>
               </w:rPr>
-              <w:t>{{ 排放量 }}</w:t>
+              <w:t>{{ emission_amount }}</w:t>
             </w:r>
           </w:p>
         </w:tc>
@@ -8938,7 +8938,7 @@
                 <w:b w:val="0"/>
                 <w:sz w:val="17"/>
               </w:rPr>
-              <w:t>{{ 证据 }}</w:t>
+              <w:t>{{ evidence_id }}</w:t>
             </w:r>
           </w:p>
         </w:tc>
@@ -8981,7 +8981,7 @@
                 <w:b w:val="0"/>
                 <w:sz w:val="17"/>
               </w:rPr>
-              <w:t>{{ 购入 }}</w:t>
+              <w:t>{{ purchased_amount }}</w:t>
             </w:r>
           </w:p>
         </w:tc>
@@ -9000,7 +9000,7 @@
                 <w:b w:val="0"/>
                 <w:sz w:val="17"/>
               </w:rPr>
-              <w:t>{{ 外供 }}</w:t>
+              <w:t>{{ exported_amount }}</w:t>
             </w:r>
           </w:p>
         </w:tc>
@@ -9019,7 +9019,7 @@
                 <w:b w:val="0"/>
                 <w:sz w:val="17"/>
               </w:rPr>
-              <w:t>{{ 净购入 }}</w:t>
+              <w:t>{{ net_purchased_amount }}</w:t>
             </w:r>
           </w:p>
         </w:tc>
@@ -9057,7 +9057,7 @@
                 <w:b w:val="0"/>
                 <w:sz w:val="17"/>
               </w:rPr>
-              <w:t>{{ 因子 }}</w:t>
+              <w:t>{{ emission_factor }}</w:t>
             </w:r>
           </w:p>
         </w:tc>
@@ -9076,7 +9076,7 @@
                 <w:b w:val="0"/>
                 <w:sz w:val="17"/>
               </w:rPr>
-              <w:t>{{ 排放量 }}</w:t>
+              <w:t>{{ emission_amount }}</w:t>
             </w:r>
           </w:p>
         </w:tc>
@@ -9095,7 +9095,7 @@
                 <w:b w:val="0"/>
                 <w:sz w:val="17"/>
               </w:rPr>
-              <w:t>{{ 证据 }}</w:t>
+              <w:t>{{ evidence_id }}</w:t>
             </w:r>
           </w:p>
         </w:tc>
@@ -9138,7 +9138,7 @@
                 <w:b w:val="0"/>
                 <w:sz w:val="17"/>
               </w:rPr>
-              <w:t>{{ 购入 }}</w:t>
+              <w:t>{{ purchased_amount }}</w:t>
             </w:r>
           </w:p>
         </w:tc>
@@ -9157,7 +9157,7 @@
                 <w:b w:val="0"/>
                 <w:sz w:val="17"/>
               </w:rPr>
-              <w:t>{{ 外供 }}</w:t>
+              <w:t>{{ exported_amount }}</w:t>
             </w:r>
           </w:p>
         </w:tc>
@@ -9176,7 +9176,7 @@
                 <w:b w:val="0"/>
                 <w:sz w:val="17"/>
               </w:rPr>
-              <w:t>{{ 净购入 }}</w:t>
+              <w:t>{{ net_purchased_amount }}</w:t>
             </w:r>
           </w:p>
         </w:tc>
@@ -9214,7 +9214,7 @@
                 <w:b w:val="0"/>
                 <w:sz w:val="17"/>
               </w:rPr>
-              <w:t>{{ 因子 }}</w:t>
+              <w:t>{{ emission_factor }}</w:t>
             </w:r>
           </w:p>
         </w:tc>
@@ -9233,7 +9233,7 @@
                 <w:b w:val="0"/>
                 <w:sz w:val="17"/>
               </w:rPr>
-              <w:t>{{ 排放量 }}</w:t>
+              <w:t>{{ emission_amount }}</w:t>
             </w:r>
           </w:p>
         </w:tc>
@@ -9252,7 +9252,7 @@
                 <w:b w:val="0"/>
                 <w:sz w:val="17"/>
               </w:rPr>
-              <w:t>{{ 证据 }}</w:t>
+              <w:t>{{ evidence_id }}</w:t>
             </w:r>
           </w:p>
         </w:tc>
@@ -9295,7 +9295,7 @@
                 <w:b w:val="0"/>
                 <w:sz w:val="17"/>
               </w:rPr>
-              <w:t>{{ 购入 }}</w:t>
+              <w:t>{{ purchased_amount }}</w:t>
             </w:r>
           </w:p>
         </w:tc>
@@ -9314,7 +9314,7 @@
                 <w:b w:val="0"/>
                 <w:sz w:val="17"/>
               </w:rPr>
-              <w:t>{{ 外供 }}</w:t>
+              <w:t>{{ exported_amount }}</w:t>
             </w:r>
           </w:p>
         </w:tc>
@@ -9333,7 +9333,7 @@
                 <w:b w:val="0"/>
                 <w:sz w:val="17"/>
               </w:rPr>
-              <w:t>{{ 净购入 }}</w:t>
+              <w:t>{{ net_purchased_amount }}</w:t>
             </w:r>
           </w:p>
         </w:tc>
@@ -9371,7 +9371,7 @@
                 <w:b w:val="0"/>
                 <w:sz w:val="17"/>
               </w:rPr>
-              <w:t>{{ 因子 }}</w:t>
+              <w:t>{{ emission_factor }}</w:t>
             </w:r>
           </w:p>
         </w:tc>
@@ -9390,7 +9390,7 @@
                 <w:b w:val="0"/>
                 <w:sz w:val="17"/>
               </w:rPr>
-              <w:t>{{ 排放量 }}</w:t>
+              <w:t>{{ emission_amount }}</w:t>
             </w:r>
           </w:p>
         </w:tc>
@@ -9409,7 +9409,7 @@
                 <w:b w:val="0"/>
                 <w:sz w:val="17"/>
               </w:rPr>
-              <w:t>{{ 证据 }}</w:t>
+              <w:t>{{ evidence_id }}</w:t>
             </w:r>
           </w:p>
         </w:tc>
@@ -9682,7 +9682,7 @@
                 <w:b w:val="0"/>
                 <w:sz w:val="17"/>
               </w:rPr>
-              <w:t>{{ 参数 }}</w:t>
+              <w:t>{{ parameter_name }}</w:t>
             </w:r>
           </w:p>
         </w:tc>
@@ -9701,7 +9701,7 @@
                 <w:b w:val="0"/>
                 <w:sz w:val="17"/>
               </w:rPr>
-              <w:t>{{ 值 }}</w:t>
+              <w:t>{{ parameter_value }}</w:t>
             </w:r>
           </w:p>
         </w:tc>
@@ -9720,7 +9720,7 @@
                 <w:b w:val="0"/>
                 <w:sz w:val="17"/>
               </w:rPr>
-              <w:t>{{ 单位 }}</w:t>
+              <w:t>{{ unit }}</w:t>
             </w:r>
           </w:p>
         </w:tc>
@@ -9739,7 +9739,7 @@
                 <w:b w:val="0"/>
                 <w:sz w:val="17"/>
               </w:rPr>
-              <w:t>{{ 来源 }}</w:t>
+              <w:t>{{ source_name }}</w:t>
             </w:r>
           </w:p>
         </w:tc>
@@ -9758,7 +9758,7 @@
                 <w:b w:val="0"/>
                 <w:sz w:val="17"/>
               </w:rPr>
-              <w:t>{{ 有效期 }}</w:t>
+              <w:t>{{ valid_period }}</w:t>
             </w:r>
           </w:p>
         </w:tc>
@@ -9777,7 +9777,7 @@
                 <w:b w:val="0"/>
                 <w:sz w:val="17"/>
               </w:rPr>
-              <w:t>{{ 置信 }}</w:t>
+              <w:t>{{ confidence_level }}</w:t>
             </w:r>
           </w:p>
         </w:tc>
@@ -9820,7 +9820,7 @@
                 <w:b w:val="0"/>
                 <w:sz w:val="17"/>
               </w:rPr>
-              <w:t>{{ 参数 }}</w:t>
+              <w:t>{{ parameter_name }}</w:t>
             </w:r>
           </w:p>
         </w:tc>
@@ -9839,7 +9839,7 @@
                 <w:b w:val="0"/>
                 <w:sz w:val="17"/>
               </w:rPr>
-              <w:t>{{ 值 }}</w:t>
+              <w:t>{{ parameter_value }}</w:t>
             </w:r>
           </w:p>
         </w:tc>
@@ -9858,7 +9858,7 @@
                 <w:b w:val="0"/>
                 <w:sz w:val="17"/>
               </w:rPr>
-              <w:t>{{ 单位 }}</w:t>
+              <w:t>{{ unit }}</w:t>
             </w:r>
           </w:p>
         </w:tc>
@@ -9877,7 +9877,7 @@
                 <w:b w:val="0"/>
                 <w:sz w:val="17"/>
               </w:rPr>
-              <w:t>{{ 来源 }}</w:t>
+              <w:t>{{ source_name }}</w:t>
             </w:r>
           </w:p>
         </w:tc>
@@ -9896,7 +9896,7 @@
                 <w:b w:val="0"/>
                 <w:sz w:val="17"/>
               </w:rPr>
-              <w:t>{{ 有效期 }}</w:t>
+              <w:t>{{ valid_period }}</w:t>
             </w:r>
           </w:p>
         </w:tc>
@@ -9915,7 +9915,7 @@
                 <w:b w:val="0"/>
                 <w:sz w:val="17"/>
               </w:rPr>
-              <w:t>{{ 置信 }}</w:t>
+              <w:t>{{ confidence_level }}</w:t>
             </w:r>
           </w:p>
         </w:tc>
@@ -9958,7 +9958,7 @@
                 <w:b w:val="0"/>
                 <w:sz w:val="17"/>
               </w:rPr>
-              <w:t>{{ 参数 }}</w:t>
+              <w:t>{{ parameter_name }}</w:t>
             </w:r>
           </w:p>
         </w:tc>
@@ -9977,7 +9977,7 @@
                 <w:b w:val="0"/>
                 <w:sz w:val="17"/>
               </w:rPr>
-              <w:t>{{ 值 }}</w:t>
+              <w:t>{{ parameter_value }}</w:t>
             </w:r>
           </w:p>
         </w:tc>
@@ -9996,7 +9996,7 @@
                 <w:b w:val="0"/>
                 <w:sz w:val="17"/>
               </w:rPr>
-              <w:t>{{ 单位 }}</w:t>
+              <w:t>{{ unit }}</w:t>
             </w:r>
           </w:p>
         </w:tc>
@@ -10015,7 +10015,7 @@
                 <w:b w:val="0"/>
                 <w:sz w:val="17"/>
               </w:rPr>
-              <w:t>{{ 来源 }}</w:t>
+              <w:t>{{ source_name }}</w:t>
             </w:r>
           </w:p>
         </w:tc>
@@ -10034,7 +10034,7 @@
                 <w:b w:val="0"/>
                 <w:sz w:val="17"/>
               </w:rPr>
-              <w:t>{{ 有效期 }}</w:t>
+              <w:t>{{ valid_period }}</w:t>
             </w:r>
           </w:p>
         </w:tc>
@@ -10053,7 +10053,7 @@
                 <w:b w:val="0"/>
                 <w:sz w:val="17"/>
               </w:rPr>
-              <w:t>{{ 置信 }}</w:t>
+              <w:t>{{ confidence_level }}</w:t>
             </w:r>
           </w:p>
         </w:tc>
@@ -11271,7 +11271,7 @@
                 <w:b w:val="0"/>
                 <w:sz w:val="17"/>
               </w:rPr>
-              <w:t>{{ 证据 }}</w:t>
+              <w:t>{{ evidence_id }}</w:t>
             </w:r>
           </w:p>
         </w:tc>
@@ -11290,7 +11290,7 @@
                 <w:b w:val="0"/>
                 <w:sz w:val="17"/>
               </w:rPr>
-              <w:t>{{ 结论 }}</w:t>
+              <w:t>{{ review_result }}</w:t>
             </w:r>
           </w:p>
         </w:tc>
@@ -11309,7 +11309,7 @@
                 <w:b w:val="0"/>
                 <w:sz w:val="17"/>
               </w:rPr>
-              <w:t>{{ 问题 }}</w:t>
+              <w:t>{{ issue_description }}</w:t>
             </w:r>
           </w:p>
         </w:tc>
@@ -11371,7 +11371,7 @@
                 <w:b w:val="0"/>
                 <w:sz w:val="17"/>
               </w:rPr>
-              <w:t>{{ 证据 }}</w:t>
+              <w:t>{{ evidence_id }}</w:t>
             </w:r>
           </w:p>
         </w:tc>
@@ -11390,7 +11390,7 @@
                 <w:b w:val="0"/>
                 <w:sz w:val="17"/>
               </w:rPr>
-              <w:t>{{ 结论 }}</w:t>
+              <w:t>{{ review_result }}</w:t>
             </w:r>
           </w:p>
         </w:tc>
@@ -11409,7 +11409,7 @@
                 <w:b w:val="0"/>
                 <w:sz w:val="17"/>
               </w:rPr>
-              <w:t>{{ 问题 }}</w:t>
+              <w:t>{{ issue_description }}</w:t>
             </w:r>
           </w:p>
         </w:tc>
@@ -11471,7 +11471,7 @@
                 <w:b w:val="0"/>
                 <w:sz w:val="17"/>
               </w:rPr>
-              <w:t>{{ 证据 }}</w:t>
+              <w:t>{{ evidence_id }}</w:t>
             </w:r>
           </w:p>
         </w:tc>
@@ -11490,7 +11490,7 @@
                 <w:b w:val="0"/>
                 <w:sz w:val="17"/>
               </w:rPr>
-              <w:t>{{ 结论 }}</w:t>
+              <w:t>{{ review_result }}</w:t>
             </w:r>
           </w:p>
         </w:tc>
@@ -11509,7 +11509,7 @@
                 <w:b w:val="0"/>
                 <w:sz w:val="17"/>
               </w:rPr>
-              <w:t>{{ 问题 }}</w:t>
+              <w:t>{{ issue_description }}</w:t>
             </w:r>
           </w:p>
         </w:tc>
@@ -11571,7 +11571,7 @@
                 <w:b w:val="0"/>
                 <w:sz w:val="17"/>
               </w:rPr>
-              <w:t>{{ 证据 }}</w:t>
+              <w:t>{{ evidence_id }}</w:t>
             </w:r>
           </w:p>
         </w:tc>
@@ -11590,7 +11590,7 @@
                 <w:b w:val="0"/>
                 <w:sz w:val="17"/>
               </w:rPr>
-              <w:t>{{ 结论 }}</w:t>
+              <w:t>{{ review_result }}</w:t>
             </w:r>
           </w:p>
         </w:tc>
@@ -11609,7 +11609,7 @@
                 <w:b w:val="0"/>
                 <w:sz w:val="17"/>
               </w:rPr>
-              <w:t>{{ 问题 }}</w:t>
+              <w:t>{{ issue_description }}</w:t>
             </w:r>
           </w:p>
         </w:tc>
@@ -11671,7 +11671,7 @@
                 <w:b w:val="0"/>
                 <w:sz w:val="17"/>
               </w:rPr>
-              <w:t>{{ 证据 }}</w:t>
+              <w:t>{{ evidence_id }}</w:t>
             </w:r>
           </w:p>
         </w:tc>
@@ -11690,7 +11690,7 @@
                 <w:b w:val="0"/>
                 <w:sz w:val="17"/>
               </w:rPr>
-              <w:t>{{ 结论 }}</w:t>
+              <w:t>{{ review_result }}</w:t>
             </w:r>
           </w:p>
         </w:tc>
@@ -11709,7 +11709,7 @@
                 <w:b w:val="0"/>
                 <w:sz w:val="17"/>
               </w:rPr>
-              <w:t>{{ 问题 }}</w:t>
+              <w:t>{{ issue_description }}</w:t>
             </w:r>
           </w:p>
         </w:tc>
@@ -11771,7 +11771,7 @@
                 <w:b w:val="0"/>
                 <w:sz w:val="17"/>
               </w:rPr>
-              <w:t>{{ 证据 }}</w:t>
+              <w:t>{{ evidence_id }}</w:t>
             </w:r>
           </w:p>
         </w:tc>
@@ -11790,7 +11790,7 @@
                 <w:b w:val="0"/>
                 <w:sz w:val="17"/>
               </w:rPr>
-              <w:t>{{ 结论 }}</w:t>
+              <w:t>{{ review_result }}</w:t>
             </w:r>
           </w:p>
         </w:tc>
@@ -11809,7 +11809,7 @@
                 <w:b w:val="0"/>
                 <w:sz w:val="17"/>
               </w:rPr>
-              <w:t>{{ 问题 }}</w:t>
+              <w:t>{{ issue_description }}</w:t>
             </w:r>
           </w:p>
         </w:tc>
@@ -12045,7 +12045,7 @@
                 <w:b w:val="0"/>
                 <w:sz w:val="17"/>
               </w:rPr>
-              <w:t>{{ 记录 }}</w:t>
+              <w:t>{{ audit_record }}</w:t>
             </w:r>
           </w:p>
         </w:tc>
@@ -12064,7 +12064,7 @@
                 <w:b w:val="0"/>
                 <w:sz w:val="17"/>
               </w:rPr>
-              <w:t>{{ 证据 }}</w:t>
+              <w:t>{{ evidence_id }}</w:t>
             </w:r>
           </w:p>
         </w:tc>
@@ -12083,7 +12083,7 @@
                 <w:b w:val="0"/>
                 <w:sz w:val="17"/>
               </w:rPr>
-              <w:t>{{ 结论 }}</w:t>
+              <w:t>{{ review_result }}</w:t>
             </w:r>
           </w:p>
         </w:tc>
@@ -12145,7 +12145,7 @@
                 <w:b w:val="0"/>
                 <w:sz w:val="17"/>
               </w:rPr>
-              <w:t>{{ 记录 }}</w:t>
+              <w:t>{{ audit_record }}</w:t>
             </w:r>
           </w:p>
         </w:tc>
@@ -12164,7 +12164,7 @@
                 <w:b w:val="0"/>
                 <w:sz w:val="17"/>
               </w:rPr>
-              <w:t>{{ 证据 }}</w:t>
+              <w:t>{{ evidence_id }}</w:t>
             </w:r>
           </w:p>
         </w:tc>
@@ -12183,7 +12183,7 @@
                 <w:b w:val="0"/>
                 <w:sz w:val="17"/>
               </w:rPr>
-              <w:t>{{ 结论 }}</w:t>
+              <w:t>{{ review_result }}</w:t>
             </w:r>
           </w:p>
         </w:tc>
@@ -12245,7 +12245,7 @@
                 <w:b w:val="0"/>
                 <w:sz w:val="17"/>
               </w:rPr>
-              <w:t>{{ 记录 }}</w:t>
+              <w:t>{{ audit_record }}</w:t>
             </w:r>
           </w:p>
         </w:tc>
@@ -12264,7 +12264,7 @@
                 <w:b w:val="0"/>
                 <w:sz w:val="17"/>
               </w:rPr>
-              <w:t>{{ 证据 }}</w:t>
+              <w:t>{{ evidence_id }}</w:t>
             </w:r>
           </w:p>
         </w:tc>
@@ -12283,7 +12283,7 @@
                 <w:b w:val="0"/>
                 <w:sz w:val="17"/>
               </w:rPr>
-              <w:t>{{ 结论 }}</w:t>
+              <w:t>{{ review_result }}</w:t>
             </w:r>
           </w:p>
         </w:tc>
@@ -12345,7 +12345,7 @@
                 <w:b w:val="0"/>
                 <w:sz w:val="17"/>
               </w:rPr>
-              <w:t>{{ 记录 }}</w:t>
+              <w:t>{{ audit_record }}</w:t>
             </w:r>
           </w:p>
         </w:tc>
@@ -12364,7 +12364,7 @@
                 <w:b w:val="0"/>
                 <w:sz w:val="17"/>
               </w:rPr>
-              <w:t>{{ 证据 }}</w:t>
+              <w:t>{{ evidence_id }}</w:t>
             </w:r>
           </w:p>
         </w:tc>
@@ -12383,7 +12383,7 @@
                 <w:b w:val="0"/>
                 <w:sz w:val="17"/>
               </w:rPr>
-              <w:t>{{ 结论 }}</w:t>
+              <w:t>{{ review_result }}</w:t>
             </w:r>
           </w:p>
         </w:tc>
@@ -12445,7 +12445,7 @@
                 <w:b w:val="0"/>
                 <w:sz w:val="17"/>
               </w:rPr>
-              <w:t>{{ 记录 }}</w:t>
+              <w:t>{{ audit_record }}</w:t>
             </w:r>
           </w:p>
         </w:tc>
@@ -12464,7 +12464,7 @@
                 <w:b w:val="0"/>
                 <w:sz w:val="17"/>
               </w:rPr>
-              <w:t>{{ 证据 }}</w:t>
+              <w:t>{{ evidence_id }}</w:t>
             </w:r>
           </w:p>
         </w:tc>
@@ -12483,7 +12483,7 @@
                 <w:b w:val="0"/>
                 <w:sz w:val="17"/>
               </w:rPr>
-              <w:t>{{ 结论 }}</w:t>
+              <w:t>{{ review_result }}</w:t>
             </w:r>
           </w:p>
         </w:tc>
@@ -12709,7 +12709,7 @@
                 <w:b w:val="0"/>
                 <w:sz w:val="17"/>
               </w:rPr>
-              <w:t>{{ 问题 }}</w:t>
+              <w:t>{{ issue_description }}</w:t>
             </w:r>
           </w:p>
         </w:tc>
@@ -12728,7 +12728,7 @@
                 <w:b w:val="0"/>
                 <w:sz w:val="17"/>
               </w:rPr>
-              <w:t>{{ 描述 }}</w:t>
+              <w:t>{{ description }}</w:t>
             </w:r>
           </w:p>
         </w:tc>
@@ -12747,7 +12747,7 @@
                 <w:b w:val="0"/>
                 <w:sz w:val="17"/>
               </w:rPr>
-              <w:t>{{ 影响 }}</w:t>
+              <w:t>{{ emission_impact }}</w:t>
             </w:r>
           </w:p>
         </w:tc>
@@ -12766,7 +12766,7 @@
                 <w:b w:val="0"/>
                 <w:sz w:val="17"/>
               </w:rPr>
-              <w:t>{{ 措施 }}</w:t>
+              <w:t>{{ corrective_action }}</w:t>
             </w:r>
           </w:p>
         </w:tc>
@@ -12785,7 +12785,7 @@
                 <w:b w:val="0"/>
                 <w:sz w:val="17"/>
               </w:rPr>
-              <w:t>{{ 证据 }}</w:t>
+              <w:t>{{ evidence_id }}</w:t>
             </w:r>
           </w:p>
         </w:tc>
@@ -12804,7 +12804,7 @@
                 <w:b w:val="0"/>
                 <w:sz w:val="17"/>
               </w:rPr>
-              <w:t>{{ 状态 }}</w:t>
+              <w:t>{{ issue_status }}</w:t>
             </w:r>
           </w:p>
         </w:tc>
@@ -12828,7 +12828,7 @@
                 <w:b w:val="0"/>
                 <w:sz w:val="17"/>
               </w:rPr>
-              <w:t>{{ 问题 }}</w:t>
+              <w:t>{{ issue_description }}</w:t>
             </w:r>
           </w:p>
         </w:tc>
@@ -12847,7 +12847,7 @@
                 <w:b w:val="0"/>
                 <w:sz w:val="17"/>
               </w:rPr>
-              <w:t>{{ 描述 }}</w:t>
+              <w:t>{{ description }}</w:t>
             </w:r>
           </w:p>
         </w:tc>
@@ -12866,7 +12866,7 @@
                 <w:b w:val="0"/>
                 <w:sz w:val="17"/>
               </w:rPr>
-              <w:t>{{ 影响 }}</w:t>
+              <w:t>{{ emission_impact }}</w:t>
             </w:r>
           </w:p>
         </w:tc>
@@ -12885,7 +12885,7 @@
                 <w:b w:val="0"/>
                 <w:sz w:val="17"/>
               </w:rPr>
-              <w:t>{{ 措施 }}</w:t>
+              <w:t>{{ corrective_action }}</w:t>
             </w:r>
           </w:p>
         </w:tc>
@@ -12904,7 +12904,7 @@
                 <w:b w:val="0"/>
                 <w:sz w:val="17"/>
               </w:rPr>
-              <w:t>{{ 证据 }}</w:t>
+              <w:t>{{ evidence_id }}</w:t>
             </w:r>
           </w:p>
         </w:tc>
@@ -12923,7 +12923,7 @@
                 <w:b w:val="0"/>
                 <w:sz w:val="17"/>
               </w:rPr>
-              <w:t>{{ 状态 }}</w:t>
+              <w:t>{{ issue_status }}</w:t>
             </w:r>
           </w:p>
         </w:tc>

</xml_diff>

<commit_message>
docs: refine carbon inventory report template
</commit_message>
<xml_diff>
--- a/docs/评价方案/templates/工业企业温室气体排放盘查报告与核查材料包通用模板.docx
+++ b/docs/评价方案/templates/工业企业温室气体排放盘查报告与核查材料包通用模板.docx
@@ -14762,7 +14762,7 @@
         <w:rPr>
           <w:rFonts w:ascii="Calibri" w:hAnsi="Calibri" w:eastAsia="宋体"/>
         </w:rPr>
-        <w:t>本文件树是平台导出任务的目标形态。当前系统已生成 manifest、报告上下文、活动数据、因子参数、问题清单和审核轨迹；下一步应把 DOCX/PDF 渲染结果和附件原件加入同一导出任务。</w:t>
+        <w:t>本文件树是平台导出任务的目标形态。当前系统已生成 manifest、报告上下文、活动数据、因子参数、问题清单、审核轨迹、DOCX/PDF 报告，并已支持本地可访问附件原件入包；后续补对象存储、OCR、大文件治理和异步导出。</w:t>
       </w:r>
     </w:p>
     <w:tbl>
@@ -15067,7 +15067,7 @@
               <w:rPr>
                 <w:sz w:val="17"/>
               </w:rPr>
-              <w:t>待渲染</w:t>
+              <w:t>已实现首版</w:t>
             </w:r>
           </w:p>
         </w:tc>
@@ -15157,7 +15157,7 @@
               <w:rPr>
                 <w:sz w:val="17"/>
               </w:rPr>
-              <w:t>待渲染</w:t>
+              <w:t>已实现首版</w:t>
             </w:r>
           </w:p>
         </w:tc>
@@ -15517,7 +15517,7 @@
               <w:rPr>
                 <w:sz w:val="17"/>
               </w:rPr>
-              <w:t>待独立附件实体</w:t>
+              <w:t>已支持本地原件入包</w:t>
             </w:r>
           </w:p>
         </w:tc>
@@ -15713,7 +15713,7 @@
         <w:rPr>
           <w:rFonts w:ascii="Calibri" w:hAnsi="Calibri" w:eastAsia="宋体"/>
         </w:rPr>
-        <w:t>附表 N：后续实现拆分任务</w:t>
+        <w:t>附表 N：领域对象和应用服务拆分</w:t>
       </w:r>
     </w:p>
     <w:p>
@@ -15724,7 +15724,7 @@
         <w:rPr>
           <w:rFonts w:ascii="Calibri" w:hAnsi="Calibri" w:eastAsia="宋体"/>
         </w:rPr>
-        <w:t>为避免把模板渲染、附件管理和核查发现继续堆进 Controller，后续实现应按下表拆分到清晰的领域对象和应用服务。</w:t>
+        <w:t>为避免把模板渲染、附件管理和核查发现堆进 Controller，本模板对应能力应按下表归属到清晰的领域对象和应用服务；已落地对象继续按该边界演进。</w:t>
       </w:r>
     </w:p>
     <w:tbl>

</xml_diff>

<commit_message>
docs: refine organization carbon inventory template
</commit_message>
<xml_diff>
--- a/docs/评价方案/templates/工业企业温室气体排放盘查报告与核查材料包通用模板.docx
+++ b/docs/评价方案/templates/工业企业温室气体排放盘查报告与核查材料包通用模板.docx
@@ -16267,6 +16267,1228 @@
                 <w:sz w:val="17"/>
               </w:rPr>
               <w:t>正式导出不再绕过边界版本和清单锁定</w:t>
+            </w:r>
+          </w:p>
+        </w:tc>
+      </w:tr>
+    </w:tbl>
+    <w:p/>
+    <w:p>
+      <w:r>
+        <w:br w:type="page"/>
+      </w:r>
+    </w:p>
+    <w:p>
+      <w:pPr>
+        <w:pStyle w:val="Heading1"/>
+      </w:pPr>
+      <w:r>
+        <w:rPr>
+          <w:rFonts w:ascii="Calibri" w:hAnsi="Calibri" w:eastAsia="Microsoft YaHei"/>
+          <w:b/>
+          <w:sz w:val="32"/>
+        </w:rPr>
+        <w:t>补充附录：2023-2025 报告核查要求与完整盘查闭环</w:t>
+      </w:r>
+    </w:p>
+    <w:p>
+      <w:r>
+        <w:rPr>
+          <w:rFonts w:ascii="Calibri" w:hAnsi="Calibri" w:eastAsia="Microsoft YaHei"/>
+          <w:b w:val="0"/>
+          <w:sz w:val="21"/>
+        </w:rPr>
+        <w:t>本附录用于把公开监管要求和本地行业模板抽取结果转化为系统实现约束。平台生成的是企业自报盘查报告与核查支撑材料包；第三方核查结论仍应由具备相应职责的核查机构基于核查准则出具。</w:t>
+      </w:r>
+    </w:p>
+    <w:p>
+      <w:pPr>
+        <w:pStyle w:val="Heading2"/>
+      </w:pPr>
+      <w:r>
+        <w:rPr>
+          <w:rFonts w:ascii="Calibri" w:hAnsi="Calibri" w:eastAsia="Microsoft YaHei"/>
+          <w:b/>
+          <w:sz w:val="26"/>
+        </w:rPr>
+        <w:t>一、公开依据补充</w:t>
+      </w:r>
+    </w:p>
+    <w:tbl>
+      <w:tblPr>
+        <w:tblStyle w:val="TableGrid"/>
+        <w:tblW w:type="auto" w:w="0"/>
+        <w:tblLook w:firstColumn="1" w:firstRow="1" w:lastColumn="0" w:lastRow="0" w:noHBand="0" w:noVBand="1" w:val="04A0"/>
+      </w:tblPr>
+      <w:tblGrid>
+        <w:gridCol w:w="3120"/>
+        <w:gridCol w:w="3120"/>
+        <w:gridCol w:w="3120"/>
+      </w:tblGrid>
+      <w:tr>
+        <w:tc>
+          <w:tcPr>
+            <w:tcW w:type="dxa" w:w="3120"/>
+            <w:shd w:fill="F2F4F7"/>
+          </w:tcPr>
+          <w:p>
+            <w:r>
+              <w:rPr>
+                <w:rFonts w:ascii="Calibri" w:hAnsi="Calibri" w:eastAsia="Microsoft YaHei"/>
+                <w:b/>
+                <w:sz w:val="19"/>
+              </w:rPr>
+              <w:t>依据</w:t>
+            </w:r>
+          </w:p>
+        </w:tc>
+        <w:tc>
+          <w:tcPr>
+            <w:tcW w:type="dxa" w:w="3120"/>
+            <w:shd w:fill="F2F4F7"/>
+          </w:tcPr>
+          <w:p>
+            <w:r>
+              <w:rPr>
+                <w:rFonts w:ascii="Calibri" w:hAnsi="Calibri" w:eastAsia="Microsoft YaHei"/>
+                <w:b/>
+                <w:sz w:val="19"/>
+              </w:rPr>
+              <w:t>关键要求</w:t>
+            </w:r>
+          </w:p>
+        </w:tc>
+        <w:tc>
+          <w:tcPr>
+            <w:tcW w:type="dxa" w:w="3120"/>
+            <w:shd w:fill="F2F4F7"/>
+          </w:tcPr>
+          <w:p>
+            <w:r>
+              <w:rPr>
+                <w:rFonts w:ascii="Calibri" w:hAnsi="Calibri" w:eastAsia="Microsoft YaHei"/>
+                <w:b/>
+                <w:sz w:val="19"/>
+              </w:rPr>
+              <w:t>模板/系统含义</w:t>
+            </w:r>
+          </w:p>
+        </w:tc>
+      </w:tr>
+      <w:tr>
+        <w:tc>
+          <w:tcPr>
+            <w:tcW w:type="dxa" w:w="3120"/>
+          </w:tcPr>
+          <w:p>
+            <w:r>
+              <w:rPr>
+                <w:rFonts w:ascii="Calibri" w:hAnsi="Calibri" w:eastAsia="Microsoft YaHei"/>
+                <w:b w:val="0"/>
+                <w:sz w:val="19"/>
+              </w:rPr>
+              <w:t>生态环境部环办气候函〔2023〕332号</w:t>
+            </w:r>
+          </w:p>
+        </w:tc>
+        <w:tc>
+          <w:tcPr>
+            <w:tcW w:type="dxa" w:w="3120"/>
+          </w:tcPr>
+          <w:p>
+            <w:r>
+              <w:rPr>
+                <w:rFonts w:ascii="Calibri" w:hAnsi="Calibri" w:eastAsia="Microsoft YaHei"/>
+                <w:b w:val="0"/>
+                <w:sz w:val="19"/>
+              </w:rPr>
+              <w:t>重点行业企业需编制上一年度温室气体排放报告，并通过管理平台报送报告和支撑材料；核查工作按年度组织。</w:t>
+            </w:r>
+          </w:p>
+        </w:tc>
+        <w:tc>
+          <w:tcPr>
+            <w:tcW w:type="dxa" w:w="3120"/>
+          </w:tcPr>
+          <w:p>
+            <w:r>
+              <w:rPr>
+                <w:rFonts w:ascii="Calibri" w:hAnsi="Calibri" w:eastAsia="Microsoft YaHei"/>
+                <w:b w:val="0"/>
+                <w:sz w:val="19"/>
+              </w:rPr>
+              <w:t>导出包必须同时包含报告、支撑材料目录、证据入包状态、文件哈希和导出记录。</w:t>
+            </w:r>
+          </w:p>
+        </w:tc>
+      </w:tr>
+      <w:tr>
+        <w:tc>
+          <w:tcPr>
+            <w:tcW w:type="dxa" w:w="3120"/>
+          </w:tcPr>
+          <w:p>
+            <w:r>
+              <w:rPr>
+                <w:rFonts w:ascii="Calibri" w:hAnsi="Calibri" w:eastAsia="Microsoft YaHei"/>
+                <w:b w:val="0"/>
+                <w:sz w:val="19"/>
+              </w:rPr>
+              <w:t>企业温室气体排放报告核查指南（试行）</w:t>
+            </w:r>
+          </w:p>
+        </w:tc>
+        <w:tc>
+          <w:tcPr>
+            <w:tcW w:type="dxa" w:w="3120"/>
+          </w:tcPr>
+          <w:p>
+            <w:r>
+              <w:rPr>
+                <w:rFonts w:ascii="Calibri" w:hAnsi="Calibri" w:eastAsia="Microsoft YaHei"/>
+                <w:b w:val="0"/>
+                <w:sz w:val="19"/>
+              </w:rPr>
+              <w:t>核查程序包括核查安排、文件评审、现场核查、不符合项整改、核查结论和记录保存。</w:t>
+            </w:r>
+          </w:p>
+        </w:tc>
+        <w:tc>
+          <w:tcPr>
+            <w:tcW w:type="dxa" w:w="3120"/>
+          </w:tcPr>
+          <w:p>
+            <w:r>
+              <w:rPr>
+                <w:rFonts w:ascii="Calibri" w:hAnsi="Calibri" w:eastAsia="Microsoft YaHei"/>
+                <w:b w:val="0"/>
+                <w:sz w:val="19"/>
+              </w:rPr>
+              <w:t>系统应将文件评审表、现场核查清单、不符合项和整改记录作为材料包工作底稿，不自动宣称核证通过。</w:t>
+            </w:r>
+          </w:p>
+        </w:tc>
+      </w:tr>
+      <w:tr>
+        <w:tc>
+          <w:tcPr>
+            <w:tcW w:type="dxa" w:w="3120"/>
+          </w:tcPr>
+          <w:p>
+            <w:r>
+              <w:rPr>
+                <w:rFonts w:ascii="Calibri" w:hAnsi="Calibri" w:eastAsia="Microsoft YaHei"/>
+                <w:b w:val="0"/>
+                <w:sz w:val="19"/>
+              </w:rPr>
+              <w:t>工业其他行业企业温室气体排放核算方法与报告指南（试行）</w:t>
+            </w:r>
+          </w:p>
+        </w:tc>
+        <w:tc>
+          <w:tcPr>
+            <w:tcW w:type="dxa" w:w="3120"/>
+          </w:tcPr>
+          <w:p>
+            <w:r>
+              <w:rPr>
+                <w:rFonts w:ascii="Calibri" w:hAnsi="Calibri" w:eastAsia="Microsoft YaHei"/>
+                <w:b w:val="0"/>
+                <w:sz w:val="19"/>
+              </w:rPr>
+              <w:t>通用步骤为确定边界、识别排放源、选择公式、收集活动数据和因子、计算排放量、汇总报告。</w:t>
+            </w:r>
+          </w:p>
+        </w:tc>
+        <w:tc>
+          <w:tcPr>
+            <w:tcW w:type="dxa" w:w="3120"/>
+          </w:tcPr>
+          <w:p>
+            <w:r>
+              <w:rPr>
+                <w:rFonts w:ascii="Calibri" w:hAnsi="Calibri" w:eastAsia="Microsoft YaHei"/>
+                <w:b w:val="0"/>
+                <w:sz w:val="19"/>
+              </w:rPr>
+              <w:t>组织碳盘查流程应先锁定报告主体、报告期和边界版本，再生成清单和报告。</w:t>
+            </w:r>
+          </w:p>
+        </w:tc>
+      </w:tr>
+      <w:tr>
+        <w:tc>
+          <w:tcPr>
+            <w:tcW w:type="dxa" w:w="3120"/>
+          </w:tcPr>
+          <w:p>
+            <w:r>
+              <w:rPr>
+                <w:rFonts w:ascii="Calibri" w:hAnsi="Calibri" w:eastAsia="Microsoft YaHei"/>
+                <w:b w:val="0"/>
+                <w:sz w:val="19"/>
+              </w:rPr>
+              <w:t>本地 vcarbon 行业模板</w:t>
+            </w:r>
+          </w:p>
+        </w:tc>
+        <w:tc>
+          <w:tcPr>
+            <w:tcW w:type="dxa" w:w="3120"/>
+          </w:tcPr>
+          <w:p>
+            <w:r>
+              <w:rPr>
+                <w:rFonts w:ascii="Calibri" w:hAnsi="Calibri" w:eastAsia="Microsoft YaHei"/>
+                <w:b w:val="0"/>
+                <w:sz w:val="19"/>
+              </w:rPr>
+              <w:t>共性结构为封面声明、企业信息、排放汇总、活动水平、因子参数；行业差异集中在专属附表。</w:t>
+            </w:r>
+          </w:p>
+        </w:tc>
+        <w:tc>
+          <w:tcPr>
+            <w:tcW w:type="dxa" w:w="3120"/>
+          </w:tcPr>
+          <w:p>
+            <w:r>
+              <w:rPr>
+                <w:rFonts w:ascii="Calibri" w:hAnsi="Calibri" w:eastAsia="Microsoft YaHei"/>
+                <w:b w:val="0"/>
+                <w:sz w:val="19"/>
+              </w:rPr>
+              <w:t>默认模板只保留通用骨架，行业专属附表后续按模板版本扩展。</w:t>
+            </w:r>
+          </w:p>
+        </w:tc>
+      </w:tr>
+    </w:tbl>
+    <w:p/>
+    <w:p>
+      <w:pPr>
+        <w:pStyle w:val="Heading2"/>
+      </w:pPr>
+      <w:r>
+        <w:rPr>
+          <w:rFonts w:ascii="Calibri" w:hAnsi="Calibri" w:eastAsia="Microsoft YaHei"/>
+          <w:b/>
+          <w:sz w:val="26"/>
+        </w:rPr>
+        <w:t>二、完整盘查闭环验收清单</w:t>
+      </w:r>
+    </w:p>
+    <w:tbl>
+      <w:tblPr>
+        <w:tblStyle w:val="TableGrid"/>
+        <w:tblW w:type="auto" w:w="0"/>
+        <w:tblLook w:firstColumn="1" w:firstRow="1" w:lastColumn="0" w:lastRow="0" w:noHBand="0" w:noVBand="1" w:val="04A0"/>
+      </w:tblPr>
+      <w:tblGrid>
+        <w:gridCol w:w="2340"/>
+        <w:gridCol w:w="2340"/>
+        <w:gridCol w:w="2340"/>
+        <w:gridCol w:w="2340"/>
+      </w:tblGrid>
+      <w:tr>
+        <w:tc>
+          <w:tcPr>
+            <w:tcW w:type="dxa" w:w="2340"/>
+            <w:shd w:fill="F2F4F7"/>
+          </w:tcPr>
+          <w:p>
+            <w:r>
+              <w:rPr>
+                <w:rFonts w:ascii="Calibri" w:hAnsi="Calibri" w:eastAsia="Microsoft YaHei"/>
+                <w:b/>
+                <w:sz w:val="19"/>
+              </w:rPr>
+              <w:t>步骤</w:t>
+            </w:r>
+          </w:p>
+        </w:tc>
+        <w:tc>
+          <w:tcPr>
+            <w:tcW w:type="dxa" w:w="2340"/>
+            <w:shd w:fill="F2F4F7"/>
+          </w:tcPr>
+          <w:p>
+            <w:r>
+              <w:rPr>
+                <w:rFonts w:ascii="Calibri" w:hAnsi="Calibri" w:eastAsia="Microsoft YaHei"/>
+                <w:b/>
+                <w:sz w:val="19"/>
+              </w:rPr>
+              <w:t>业务动作</w:t>
+            </w:r>
+          </w:p>
+        </w:tc>
+        <w:tc>
+          <w:tcPr>
+            <w:tcW w:type="dxa" w:w="2340"/>
+            <w:shd w:fill="F2F4F7"/>
+          </w:tcPr>
+          <w:p>
+            <w:r>
+              <w:rPr>
+                <w:rFonts w:ascii="Calibri" w:hAnsi="Calibri" w:eastAsia="Microsoft YaHei"/>
+                <w:b/>
+                <w:sz w:val="19"/>
+              </w:rPr>
+              <w:t>系统产物</w:t>
+            </w:r>
+          </w:p>
+        </w:tc>
+        <w:tc>
+          <w:tcPr>
+            <w:tcW w:type="dxa" w:w="2340"/>
+            <w:shd w:fill="F2F4F7"/>
+          </w:tcPr>
+          <w:p>
+            <w:r>
+              <w:rPr>
+                <w:rFonts w:ascii="Calibri" w:hAnsi="Calibri" w:eastAsia="Microsoft YaHei"/>
+                <w:b/>
+                <w:sz w:val="19"/>
+              </w:rPr>
+              <w:t>阻塞条件</w:t>
+            </w:r>
+          </w:p>
+        </w:tc>
+      </w:tr>
+      <w:tr>
+        <w:tc>
+          <w:tcPr>
+            <w:tcW w:type="dxa" w:w="2340"/>
+          </w:tcPr>
+          <w:p>
+            <w:r>
+              <w:rPr>
+                <w:rFonts w:ascii="Calibri" w:hAnsi="Calibri" w:eastAsia="Microsoft YaHei"/>
+                <w:b w:val="0"/>
+                <w:sz w:val="19"/>
+              </w:rPr>
+              <w:t>1</w:t>
+            </w:r>
+          </w:p>
+        </w:tc>
+        <w:tc>
+          <w:tcPr>
+            <w:tcW w:type="dxa" w:w="2340"/>
+          </w:tcPr>
+          <w:p>
+            <w:r>
+              <w:rPr>
+                <w:rFonts w:ascii="Calibri" w:hAnsi="Calibri" w:eastAsia="Microsoft YaHei"/>
+                <w:b w:val="0"/>
+                <w:sz w:val="19"/>
+              </w:rPr>
+              <w:t>建立报告主体、报告期和组织边界。</w:t>
+            </w:r>
+          </w:p>
+        </w:tc>
+        <w:tc>
+          <w:tcPr>
+            <w:tcW w:type="dxa" w:w="2340"/>
+          </w:tcPr>
+          <w:p>
+            <w:r>
+              <w:rPr>
+                <w:rFonts w:ascii="Calibri" w:hAnsi="Calibri" w:eastAsia="Microsoft YaHei"/>
+                <w:b w:val="0"/>
+                <w:sz w:val="19"/>
+              </w:rPr>
+              <w:t>已发布边界版本。</w:t>
+            </w:r>
+          </w:p>
+        </w:tc>
+        <w:tc>
+          <w:tcPr>
+            <w:tcW w:type="dxa" w:w="2340"/>
+          </w:tcPr>
+          <w:p>
+            <w:r>
+              <w:rPr>
+                <w:rFonts w:ascii="Calibri" w:hAnsi="Calibri" w:eastAsia="Microsoft YaHei"/>
+                <w:b w:val="0"/>
+                <w:sz w:val="19"/>
+              </w:rPr>
+              <w:t>无报告主体、无报告期、边界未发布。</w:t>
+            </w:r>
+          </w:p>
+        </w:tc>
+      </w:tr>
+      <w:tr>
+        <w:tc>
+          <w:tcPr>
+            <w:tcW w:type="dxa" w:w="2340"/>
+          </w:tcPr>
+          <w:p>
+            <w:r>
+              <w:rPr>
+                <w:rFonts w:ascii="Calibri" w:hAnsi="Calibri" w:eastAsia="Microsoft YaHei"/>
+                <w:b w:val="0"/>
+                <w:sz w:val="19"/>
+              </w:rPr>
+              <w:t>2</w:t>
+            </w:r>
+          </w:p>
+        </w:tc>
+        <w:tc>
+          <w:tcPr>
+            <w:tcW w:type="dxa" w:w="2340"/>
+          </w:tcPr>
+          <w:p>
+            <w:r>
+              <w:rPr>
+                <w:rFonts w:ascii="Calibri" w:hAnsi="Calibri" w:eastAsia="Microsoft YaHei"/>
+                <w:b w:val="0"/>
+                <w:sz w:val="19"/>
+              </w:rPr>
+              <w:t>采集活动数据并绑定凭证。</w:t>
+            </w:r>
+          </w:p>
+        </w:tc>
+        <w:tc>
+          <w:tcPr>
+            <w:tcW w:type="dxa" w:w="2340"/>
+          </w:tcPr>
+          <w:p>
+            <w:r>
+              <w:rPr>
+                <w:rFonts w:ascii="Calibri" w:hAnsi="Calibri" w:eastAsia="Microsoft YaHei"/>
+                <w:b w:val="0"/>
+                <w:sz w:val="19"/>
+              </w:rPr>
+              <w:t>活动数据记录、证据清单。</w:t>
+            </w:r>
+          </w:p>
+        </w:tc>
+        <w:tc>
+          <w:tcPr>
+            <w:tcW w:type="dxa" w:w="2340"/>
+          </w:tcPr>
+          <w:p>
+            <w:r>
+              <w:rPr>
+                <w:rFonts w:ascii="Calibri" w:hAnsi="Calibri" w:eastAsia="Microsoft YaHei"/>
+                <w:b w:val="0"/>
+                <w:sz w:val="19"/>
+              </w:rPr>
+              <w:t>活动量缺失、单位不匹配、关键凭证缺失。</w:t>
+            </w:r>
+          </w:p>
+        </w:tc>
+      </w:tr>
+      <w:tr>
+        <w:tc>
+          <w:tcPr>
+            <w:tcW w:type="dxa" w:w="2340"/>
+          </w:tcPr>
+          <w:p>
+            <w:r>
+              <w:rPr>
+                <w:rFonts w:ascii="Calibri" w:hAnsi="Calibri" w:eastAsia="Microsoft YaHei"/>
+                <w:b w:val="0"/>
+                <w:sz w:val="19"/>
+              </w:rPr>
+              <w:t>3</w:t>
+            </w:r>
+          </w:p>
+        </w:tc>
+        <w:tc>
+          <w:tcPr>
+            <w:tcW w:type="dxa" w:w="2340"/>
+          </w:tcPr>
+          <w:p>
+            <w:r>
+              <w:rPr>
+                <w:rFonts w:ascii="Calibri" w:hAnsi="Calibri" w:eastAsia="Microsoft YaHei"/>
+                <w:b w:val="0"/>
+                <w:sz w:val="19"/>
+              </w:rPr>
+              <w:t>选择核算方法和排放因子。</w:t>
+            </w:r>
+          </w:p>
+        </w:tc>
+        <w:tc>
+          <w:tcPr>
+            <w:tcW w:type="dxa" w:w="2340"/>
+          </w:tcPr>
+          <w:p>
+            <w:r>
+              <w:rPr>
+                <w:rFonts w:ascii="Calibri" w:hAnsi="Calibri" w:eastAsia="Microsoft YaHei"/>
+                <w:b w:val="0"/>
+                <w:sz w:val="19"/>
+              </w:rPr>
+              <w:t>因子参数快照。</w:t>
+            </w:r>
+          </w:p>
+        </w:tc>
+        <w:tc>
+          <w:tcPr>
+            <w:tcW w:type="dxa" w:w="2340"/>
+          </w:tcPr>
+          <w:p>
+            <w:r>
+              <w:rPr>
+                <w:rFonts w:ascii="Calibri" w:hAnsi="Calibri" w:eastAsia="Microsoft YaHei"/>
+                <w:b w:val="0"/>
+                <w:sz w:val="19"/>
+              </w:rPr>
+              <w:t>缺因子、因子不适用、标准版本未知。</w:t>
+            </w:r>
+          </w:p>
+        </w:tc>
+      </w:tr>
+      <w:tr>
+        <w:tc>
+          <w:tcPr>
+            <w:tcW w:type="dxa" w:w="2340"/>
+          </w:tcPr>
+          <w:p>
+            <w:r>
+              <w:rPr>
+                <w:rFonts w:ascii="Calibri" w:hAnsi="Calibri" w:eastAsia="Microsoft YaHei"/>
+                <w:b w:val="0"/>
+                <w:sz w:val="19"/>
+              </w:rPr>
+              <w:t>4</w:t>
+            </w:r>
+          </w:p>
+        </w:tc>
+        <w:tc>
+          <w:tcPr>
+            <w:tcW w:type="dxa" w:w="2340"/>
+          </w:tcPr>
+          <w:p>
+            <w:r>
+              <w:rPr>
+                <w:rFonts w:ascii="Calibri" w:hAnsi="Calibri" w:eastAsia="Microsoft YaHei"/>
+                <w:b w:val="0"/>
+                <w:sz w:val="19"/>
+              </w:rPr>
+              <w:t>重建组织排放清单。</w:t>
+            </w:r>
+          </w:p>
+        </w:tc>
+        <w:tc>
+          <w:tcPr>
+            <w:tcW w:type="dxa" w:w="2340"/>
+          </w:tcPr>
+          <w:p>
+            <w:r>
+              <w:rPr>
+                <w:rFonts w:ascii="Calibri" w:hAnsi="Calibri" w:eastAsia="Microsoft YaHei"/>
+                <w:b w:val="0"/>
+                <w:sz w:val="19"/>
+              </w:rPr>
+              <w:t>清单批次和质量状态。</w:t>
+            </w:r>
+          </w:p>
+        </w:tc>
+        <w:tc>
+          <w:tcPr>
+            <w:tcW w:type="dxa" w:w="2340"/>
+          </w:tcPr>
+          <w:p>
+            <w:r>
+              <w:rPr>
+                <w:rFonts w:ascii="Calibri" w:hAnsi="Calibri" w:eastAsia="Microsoft YaHei"/>
+                <w:b w:val="0"/>
+                <w:sz w:val="19"/>
+              </w:rPr>
+              <w:t>没有已审核活动记录或计算失败。</w:t>
+            </w:r>
+          </w:p>
+        </w:tc>
+      </w:tr>
+      <w:tr>
+        <w:tc>
+          <w:tcPr>
+            <w:tcW w:type="dxa" w:w="2340"/>
+          </w:tcPr>
+          <w:p>
+            <w:r>
+              <w:rPr>
+                <w:rFonts w:ascii="Calibri" w:hAnsi="Calibri" w:eastAsia="Microsoft YaHei"/>
+                <w:b w:val="0"/>
+                <w:sz w:val="19"/>
+              </w:rPr>
+              <w:t>5</w:t>
+            </w:r>
+          </w:p>
+        </w:tc>
+        <w:tc>
+          <w:tcPr>
+            <w:tcW w:type="dxa" w:w="2340"/>
+          </w:tcPr>
+          <w:p>
+            <w:r>
+              <w:rPr>
+                <w:rFonts w:ascii="Calibri" w:hAnsi="Calibri" w:eastAsia="Microsoft YaHei"/>
+                <w:b w:val="0"/>
+                <w:sz w:val="19"/>
+              </w:rPr>
+              <w:t>内部复核并锁定清单。</w:t>
+            </w:r>
+          </w:p>
+        </w:tc>
+        <w:tc>
+          <w:tcPr>
+            <w:tcW w:type="dxa" w:w="2340"/>
+          </w:tcPr>
+          <w:p>
+            <w:r>
+              <w:rPr>
+                <w:rFonts w:ascii="Calibri" w:hAnsi="Calibri" w:eastAsia="Microsoft YaHei"/>
+                <w:b w:val="0"/>
+                <w:sz w:val="19"/>
+              </w:rPr>
+              <w:t>locked 清单批次。</w:t>
+            </w:r>
+          </w:p>
+        </w:tc>
+        <w:tc>
+          <w:tcPr>
+            <w:tcW w:type="dxa" w:w="2340"/>
+          </w:tcPr>
+          <w:p>
+            <w:r>
+              <w:rPr>
+                <w:rFonts w:ascii="Calibri" w:hAnsi="Calibri" w:eastAsia="Microsoft YaHei"/>
+                <w:b w:val="0"/>
+                <w:sz w:val="19"/>
+              </w:rPr>
+              <w:t>清单为空、质量问题未处理、锁定权限不足。</w:t>
+            </w:r>
+          </w:p>
+        </w:tc>
+      </w:tr>
+      <w:tr>
+        <w:tc>
+          <w:tcPr>
+            <w:tcW w:type="dxa" w:w="2340"/>
+          </w:tcPr>
+          <w:p>
+            <w:r>
+              <w:rPr>
+                <w:rFonts w:ascii="Calibri" w:hAnsi="Calibri" w:eastAsia="Microsoft YaHei"/>
+                <w:b w:val="0"/>
+                <w:sz w:val="19"/>
+              </w:rPr>
+              <w:t>6</w:t>
+            </w:r>
+          </w:p>
+        </w:tc>
+        <w:tc>
+          <w:tcPr>
+            <w:tcW w:type="dxa" w:w="2340"/>
+          </w:tcPr>
+          <w:p>
+            <w:r>
+              <w:rPr>
+                <w:rFonts w:ascii="Calibri" w:hAnsi="Calibri" w:eastAsia="Microsoft YaHei"/>
+                <w:b w:val="0"/>
+                <w:sz w:val="19"/>
+              </w:rPr>
+              <w:t>创建核查项目并刷新就绪状态。</w:t>
+            </w:r>
+          </w:p>
+        </w:tc>
+        <w:tc>
+          <w:tcPr>
+            <w:tcW w:type="dxa" w:w="2340"/>
+          </w:tcPr>
+          <w:p>
+            <w:r>
+              <w:rPr>
+                <w:rFonts w:ascii="Calibri" w:hAnsi="Calibri" w:eastAsia="Microsoft YaHei"/>
+                <w:b w:val="0"/>
+                <w:sz w:val="19"/>
+              </w:rPr>
+              <w:t>VerificationProject。</w:t>
+            </w:r>
+          </w:p>
+        </w:tc>
+        <w:tc>
+          <w:tcPr>
+            <w:tcW w:type="dxa" w:w="2340"/>
+          </w:tcPr>
+          <w:p>
+            <w:r>
+              <w:rPr>
+                <w:rFonts w:ascii="Calibri" w:hAnsi="Calibri" w:eastAsia="Microsoft YaHei"/>
+                <w:b w:val="0"/>
+                <w:sz w:val="19"/>
+              </w:rPr>
+              <w:t>项目未绑定锁定清单或模板。</w:t>
+            </w:r>
+          </w:p>
+        </w:tc>
+      </w:tr>
+      <w:tr>
+        <w:tc>
+          <w:tcPr>
+            <w:tcW w:type="dxa" w:w="2340"/>
+          </w:tcPr>
+          <w:p>
+            <w:r>
+              <w:rPr>
+                <w:rFonts w:ascii="Calibri" w:hAnsi="Calibri" w:eastAsia="Microsoft YaHei"/>
+                <w:b w:val="0"/>
+                <w:sz w:val="19"/>
+              </w:rPr>
+              <w:t>7</w:t>
+            </w:r>
+          </w:p>
+        </w:tc>
+        <w:tc>
+          <w:tcPr>
+            <w:tcW w:type="dxa" w:w="2340"/>
+          </w:tcPr>
+          <w:p>
+            <w:r>
+              <w:rPr>
+                <w:rFonts w:ascii="Calibri" w:hAnsi="Calibri" w:eastAsia="Microsoft YaHei"/>
+                <w:b w:val="0"/>
+                <w:sz w:val="19"/>
+              </w:rPr>
+              <w:t>导出 DOCX/PDF 和材料包 ZIP。</w:t>
+            </w:r>
+          </w:p>
+        </w:tc>
+        <w:tc>
+          <w:tcPr>
+            <w:tcW w:type="dxa" w:w="2340"/>
+          </w:tcPr>
+          <w:p>
+            <w:r>
+              <w:rPr>
+                <w:rFonts w:ascii="Calibri" w:hAnsi="Calibri" w:eastAsia="Microsoft YaHei"/>
+                <w:b w:val="0"/>
+                <w:sz w:val="19"/>
+              </w:rPr>
+              <w:t>ExportJob、ExportFile、manifest。</w:t>
+            </w:r>
+          </w:p>
+        </w:tc>
+        <w:tc>
+          <w:tcPr>
+            <w:tcW w:type="dxa" w:w="2340"/>
+          </w:tcPr>
+          <w:p>
+            <w:r>
+              <w:rPr>
+                <w:rFonts w:ascii="Calibri" w:hAnsi="Calibri" w:eastAsia="Microsoft YaHei"/>
+                <w:b w:val="0"/>
+                <w:sz w:val="19"/>
+              </w:rPr>
+              <w:t>模板不存在、未知变量、文件转换失败或附件无法读取。</w:t>
+            </w:r>
+          </w:p>
+        </w:tc>
+      </w:tr>
+      <w:tr>
+        <w:tc>
+          <w:tcPr>
+            <w:tcW w:type="dxa" w:w="2340"/>
+          </w:tcPr>
+          <w:p>
+            <w:r>
+              <w:rPr>
+                <w:rFonts w:ascii="Calibri" w:hAnsi="Calibri" w:eastAsia="Microsoft YaHei"/>
+                <w:b w:val="0"/>
+                <w:sz w:val="19"/>
+              </w:rPr>
+              <w:t>8</w:t>
+            </w:r>
+          </w:p>
+        </w:tc>
+        <w:tc>
+          <w:tcPr>
+            <w:tcW w:type="dxa" w:w="2340"/>
+          </w:tcPr>
+          <w:p>
+            <w:r>
+              <w:rPr>
+                <w:rFonts w:ascii="Calibri" w:hAnsi="Calibri" w:eastAsia="Microsoft YaHei"/>
+                <w:b w:val="0"/>
+                <w:sz w:val="19"/>
+              </w:rPr>
+              <w:t>跟踪核查发现和整改。</w:t>
+            </w:r>
+          </w:p>
+        </w:tc>
+        <w:tc>
+          <w:tcPr>
+            <w:tcW w:type="dxa" w:w="2340"/>
+          </w:tcPr>
+          <w:p>
+            <w:r>
+              <w:rPr>
+                <w:rFonts w:ascii="Calibri" w:hAnsi="Calibri" w:eastAsia="Microsoft YaHei"/>
+                <w:b w:val="0"/>
+                <w:sz w:val="19"/>
+              </w:rPr>
+              <w:t>Finding、整改证据、关闭记录。</w:t>
+            </w:r>
+          </w:p>
+        </w:tc>
+        <w:tc>
+          <w:tcPr>
+            <w:tcW w:type="dxa" w:w="2340"/>
+          </w:tcPr>
+          <w:p>
+            <w:r>
+              <w:rPr>
+                <w:rFonts w:ascii="Calibri" w:hAnsi="Calibri" w:eastAsia="Microsoft YaHei"/>
+                <w:b w:val="0"/>
+                <w:sz w:val="19"/>
+              </w:rPr>
+              <w:t>发现未整改或复核未通过。</w:t>
+            </w:r>
+          </w:p>
+        </w:tc>
+      </w:tr>
+    </w:tbl>
+    <w:p/>
+    <w:p>
+      <w:pPr>
+        <w:pStyle w:val="Heading2"/>
+      </w:pPr>
+      <w:r>
+        <w:rPr>
+          <w:rFonts w:ascii="Calibri" w:hAnsi="Calibri" w:eastAsia="Microsoft YaHei"/>
+          <w:b/>
+          <w:sz w:val="26"/>
+        </w:rPr>
+        <w:t>三、领域实现边界</w:t>
+      </w:r>
+    </w:p>
+    <w:tbl>
+      <w:tblPr>
+        <w:tblStyle w:val="TableGrid"/>
+        <w:tblW w:type="auto" w:w="0"/>
+        <w:tblLook w:firstColumn="1" w:firstRow="1" w:lastColumn="0" w:lastRow="0" w:noHBand="0" w:noVBand="1" w:val="04A0"/>
+      </w:tblPr>
+      <w:tblGrid>
+        <w:gridCol w:w="2340"/>
+        <w:gridCol w:w="2340"/>
+        <w:gridCol w:w="2340"/>
+        <w:gridCol w:w="2340"/>
+      </w:tblGrid>
+      <w:tr>
+        <w:tc>
+          <w:tcPr>
+            <w:tcW w:type="dxa" w:w="2340"/>
+            <w:shd w:fill="F2F4F7"/>
+          </w:tcPr>
+          <w:p>
+            <w:r>
+              <w:rPr>
+                <w:rFonts w:ascii="Calibri" w:hAnsi="Calibri" w:eastAsia="Microsoft YaHei"/>
+                <w:b/>
+                <w:sz w:val="19"/>
+              </w:rPr>
+              <w:t>领域</w:t>
+            </w:r>
+          </w:p>
+        </w:tc>
+        <w:tc>
+          <w:tcPr>
+            <w:tcW w:type="dxa" w:w="2340"/>
+            <w:shd w:fill="F2F4F7"/>
+          </w:tcPr>
+          <w:p>
+            <w:r>
+              <w:rPr>
+                <w:rFonts w:ascii="Calibri" w:hAnsi="Calibri" w:eastAsia="Microsoft YaHei"/>
+                <w:b/>
+                <w:sz w:val="19"/>
+              </w:rPr>
+              <w:t>拥有的数据</w:t>
+            </w:r>
+          </w:p>
+        </w:tc>
+        <w:tc>
+          <w:tcPr>
+            <w:tcW w:type="dxa" w:w="2340"/>
+            <w:shd w:fill="F2F4F7"/>
+          </w:tcPr>
+          <w:p>
+            <w:r>
+              <w:rPr>
+                <w:rFonts w:ascii="Calibri" w:hAnsi="Calibri" w:eastAsia="Microsoft YaHei"/>
+                <w:b/>
+                <w:sz w:val="19"/>
+              </w:rPr>
+              <w:t>只能读取的数据</w:t>
+            </w:r>
+          </w:p>
+        </w:tc>
+        <w:tc>
+          <w:tcPr>
+            <w:tcW w:type="dxa" w:w="2340"/>
+            <w:shd w:fill="F2F4F7"/>
+          </w:tcPr>
+          <w:p>
+            <w:r>
+              <w:rPr>
+                <w:rFonts w:ascii="Calibri" w:hAnsi="Calibri" w:eastAsia="Microsoft YaHei"/>
+                <w:b/>
+                <w:sz w:val="19"/>
+              </w:rPr>
+              <w:t>实现约束</w:t>
+            </w:r>
+          </w:p>
+        </w:tc>
+      </w:tr>
+      <w:tr>
+        <w:tc>
+          <w:tcPr>
+            <w:tcW w:type="dxa" w:w="2340"/>
+          </w:tcPr>
+          <w:p>
+            <w:r>
+              <w:rPr>
+                <w:rFonts w:ascii="Calibri" w:hAnsi="Calibri" w:eastAsia="Microsoft YaHei"/>
+                <w:b w:val="0"/>
+                <w:sz w:val="19"/>
+              </w:rPr>
+              <w:t>organization_boundary</w:t>
+            </w:r>
+          </w:p>
+        </w:tc>
+        <w:tc>
+          <w:tcPr>
+            <w:tcW w:type="dxa" w:w="2340"/>
+          </w:tcPr>
+          <w:p>
+            <w:r>
+              <w:rPr>
+                <w:rFonts w:ascii="Calibri" w:hAnsi="Calibri" w:eastAsia="Microsoft YaHei"/>
+                <w:b w:val="0"/>
+                <w:sz w:val="19"/>
+              </w:rPr>
+              <w:t>报告主体、报告期、边界版本、边界设施、排除项。</w:t>
+            </w:r>
+          </w:p>
+        </w:tc>
+        <w:tc>
+          <w:tcPr>
+            <w:tcW w:type="dxa" w:w="2340"/>
+          </w:tcPr>
+          <w:p>
+            <w:r>
+              <w:rPr>
+                <w:rFonts w:ascii="Calibri" w:hAnsi="Calibri" w:eastAsia="Microsoft YaHei"/>
+                <w:b w:val="0"/>
+                <w:sz w:val="19"/>
+              </w:rPr>
+              <w:t>企业主数据。</w:t>
+            </w:r>
+          </w:p>
+        </w:tc>
+        <w:tc>
+          <w:tcPr>
+            <w:tcW w:type="dxa" w:w="2340"/>
+          </w:tcPr>
+          <w:p>
+            <w:r>
+              <w:rPr>
+                <w:rFonts w:ascii="Calibri" w:hAnsi="Calibri" w:eastAsia="Microsoft YaHei"/>
+                <w:b w:val="0"/>
+                <w:sz w:val="19"/>
+              </w:rPr>
+              <w:t>正式报告必须引用已发布边界版本。</w:t>
+            </w:r>
+          </w:p>
+        </w:tc>
+      </w:tr>
+      <w:tr>
+        <w:tc>
+          <w:tcPr>
+            <w:tcW w:type="dxa" w:w="2340"/>
+          </w:tcPr>
+          <w:p>
+            <w:r>
+              <w:rPr>
+                <w:rFonts w:ascii="Calibri" w:hAnsi="Calibri" w:eastAsia="Microsoft YaHei"/>
+                <w:b w:val="0"/>
+                <w:sz w:val="19"/>
+              </w:rPr>
+              <w:t>carbon_accounting</w:t>
+            </w:r>
+          </w:p>
+        </w:tc>
+        <w:tc>
+          <w:tcPr>
+            <w:tcW w:type="dxa" w:w="2340"/>
+          </w:tcPr>
+          <w:p>
+            <w:r>
+              <w:rPr>
+                <w:rFonts w:ascii="Calibri" w:hAnsi="Calibri" w:eastAsia="Microsoft YaHei"/>
+                <w:b w:val="0"/>
+                <w:sz w:val="19"/>
+              </w:rPr>
+              <w:t>活动记录、核算批次、清单项、锁定状态、修订链。</w:t>
+            </w:r>
+          </w:p>
+        </w:tc>
+        <w:tc>
+          <w:tcPr>
+            <w:tcW w:type="dxa" w:w="2340"/>
+          </w:tcPr>
+          <w:p>
+            <w:r>
+              <w:rPr>
+                <w:rFonts w:ascii="Calibri" w:hAnsi="Calibri" w:eastAsia="Microsoft YaHei"/>
+                <w:b w:val="0"/>
+                <w:sz w:val="19"/>
+              </w:rPr>
+              <w:t>能源事实、因子、边界、供应链审核数据。</w:t>
+            </w:r>
+          </w:p>
+        </w:tc>
+        <w:tc>
+          <w:tcPr>
+            <w:tcW w:type="dxa" w:w="2340"/>
+          </w:tcPr>
+          <w:p>
+            <w:r>
+              <w:rPr>
+                <w:rFonts w:ascii="Calibri" w:hAnsi="Calibri" w:eastAsia="Microsoft YaHei"/>
+                <w:b w:val="0"/>
+                <w:sz w:val="19"/>
+              </w:rPr>
+              <w:t>清单锁定后作为核查、资产和报告的事实来源。</w:t>
+            </w:r>
+          </w:p>
+        </w:tc>
+      </w:tr>
+      <w:tr>
+        <w:tc>
+          <w:tcPr>
+            <w:tcW w:type="dxa" w:w="2340"/>
+          </w:tcPr>
+          <w:p>
+            <w:r>
+              <w:rPr>
+                <w:rFonts w:ascii="Calibri" w:hAnsi="Calibri" w:eastAsia="Microsoft YaHei"/>
+                <w:b w:val="0"/>
+                <w:sz w:val="19"/>
+              </w:rPr>
+              <w:t>carbon_verification</w:t>
+            </w:r>
+          </w:p>
+        </w:tc>
+        <w:tc>
+          <w:tcPr>
+            <w:tcW w:type="dxa" w:w="2340"/>
+          </w:tcPr>
+          <w:p>
+            <w:r>
+              <w:rPr>
+                <w:rFonts w:ascii="Calibri" w:hAnsi="Calibri" w:eastAsia="Microsoft YaHei"/>
+                <w:b w:val="0"/>
+                <w:sz w:val="19"/>
+              </w:rPr>
+              <w:t>核查项目、模板版本、附件台账、核查发现、导出任务和文件。</w:t>
+            </w:r>
+          </w:p>
+        </w:tc>
+        <w:tc>
+          <w:tcPr>
+            <w:tcW w:type="dxa" w:w="2340"/>
+          </w:tcPr>
+          <w:p>
+            <w:r>
+              <w:rPr>
+                <w:rFonts w:ascii="Calibri" w:hAnsi="Calibri" w:eastAsia="Microsoft YaHei"/>
+                <w:b w:val="0"/>
+                <w:sz w:val="19"/>
+              </w:rPr>
+              <w:t>组织边界、锁定清单、因子参数、审计日志。</w:t>
+            </w:r>
+          </w:p>
+        </w:tc>
+        <w:tc>
+          <w:tcPr>
+            <w:tcW w:type="dxa" w:w="2340"/>
+          </w:tcPr>
+          <w:p>
+            <w:r>
+              <w:rPr>
+                <w:rFonts w:ascii="Calibri" w:hAnsi="Calibri" w:eastAsia="Microsoft YaHei"/>
+                <w:b w:val="0"/>
+                <w:sz w:val="19"/>
+              </w:rPr>
+              <w:t>不得反向修改 Scope 活动事实；材料包记录缺口而不是伪造完整性。</w:t>
+            </w:r>
+          </w:p>
+        </w:tc>
+      </w:tr>
+      <w:tr>
+        <w:tc>
+          <w:tcPr>
+            <w:tcW w:type="dxa" w:w="2340"/>
+          </w:tcPr>
+          <w:p>
+            <w:r>
+              <w:rPr>
+                <w:rFonts w:ascii="Calibri" w:hAnsi="Calibri" w:eastAsia="Microsoft YaHei"/>
+                <w:b w:val="0"/>
+                <w:sz w:val="19"/>
+              </w:rPr>
+              <w:t>carbon_assets</w:t>
+            </w:r>
+          </w:p>
+        </w:tc>
+        <w:tc>
+          <w:tcPr>
+            <w:tcW w:type="dxa" w:w="2340"/>
+          </w:tcPr>
+          <w:p>
+            <w:r>
+              <w:rPr>
+                <w:rFonts w:ascii="Calibri" w:hAnsi="Calibri" w:eastAsia="Microsoft YaHei"/>
+                <w:b w:val="0"/>
+                <w:sz w:val="19"/>
+              </w:rPr>
+              <w:t>履约期、资产账户、交易、清缴、预测场景。</w:t>
+            </w:r>
+          </w:p>
+        </w:tc>
+        <w:tc>
+          <w:tcPr>
+            <w:tcW w:type="dxa" w:w="2340"/>
+          </w:tcPr>
+          <w:p>
+            <w:r>
+              <w:rPr>
+                <w:rFonts w:ascii="Calibri" w:hAnsi="Calibri" w:eastAsia="Microsoft YaHei"/>
+                <w:b w:val="0"/>
+                <w:sz w:val="19"/>
+              </w:rPr>
+              <w:t>已锁定组织排放清单。</w:t>
+            </w:r>
+          </w:p>
+        </w:tc>
+        <w:tc>
+          <w:tcPr>
+            <w:tcW w:type="dxa" w:w="2340"/>
+          </w:tcPr>
+          <w:p>
+            <w:r>
+              <w:rPr>
+                <w:rFonts w:ascii="Calibri" w:hAnsi="Calibri" w:eastAsia="Microsoft YaHei"/>
+                <w:b w:val="0"/>
+                <w:sz w:val="19"/>
+              </w:rPr>
+              <w:t>草稿或未锁定清单不得进入履约缺口。</w:t>
             </w:r>
           </w:p>
         </w:tc>

</xml_diff>